<commit_message>
fix(coaching): template neutre OpenXML repare, consignes lead Victor A et deduction nom sprint
</commit_message>
<xml_diff>
--- a/coaching/Rapport de suivi coaching template.docx
+++ b/coaching/Rapport de suivi coaching template.docx
@@ -1,3481 +1,6 @@
 
-<file path=word/document.xml><?xml version="1.0" encoding="utf-8"?>
-<w:document xmlns:a="http://schemas.openxmlformats.org/drawingml/2006/main" xmlns:ns1="http://schemas.openxmlformats.org/markup-compatibility/2006" xmlns:ns10="urn:schemas-microsoft-com:vml" xmlns:ns11="urn:schemas-microsoft-com:office:office" xmlns:ns12="urn:schemas-microsoft-com:office:word" xmlns:ns2="http://schemas.microsoft.com/office/word/2010/wordml" xmlns:ns3="http://schemas.openxmlformats.org/drawingml/2006/wordprocessingDrawing" xmlns:ns4="http://schemas.microsoft.com/office/word/2010/wordprocessingDrawing" xmlns:ns6="http://schemas.microsoft.com/office/word/2010/wordprocessingShape" xmlns:ns7="http://schemas.openxmlformats.org/drawingml/2006/picture" xmlns:ns9="http://schemas.microsoft.com/office/drawing/2010/main" xmlns:r="http://schemas.openxmlformats.org/officeDocument/2006/relationships" xmlns:w="http://schemas.openxmlformats.org/wordprocessingml/2006/main" ns1:Ignorable="w14 w15 w16se w16cid w16 w16cex w16sdtdh w16sdtfl w16du wp14">
-  <w:body>
-    <w:p ns2:paraId="2BC1A822" ns2:textId="59D56456">
-      <w:pPr>
-        <w:rPr>
-          <w:rFonts w:eastAsia="ＭＳ ゴシック" w:eastAsiaTheme="majorEastAsia"/>
-          <w:sz w:val="72"/>
-          <w:szCs w:val="72"/>
-        </w:rPr>
-      </w:pPr>
-      <w:r>
-        <w:rPr>
-          <w:noProof/>
-          <w:lang w:eastAsia="fr-FR"/>
-        </w:rPr>
-        <ns1:AlternateContent>
-          <ns1:Choice Requires="wps">
-            <w:drawing>
-              <ns3:anchor distT="0" distB="0" distL="114300" distR="114300" simplePos="0" relativeHeight="251658241" behindDoc="0" locked="0" layoutInCell="1" allowOverlap="1" ns4:anchorId="1C40C158" ns4:editId="27E1A219">
-                <ns3:simplePos x="0" y="0"/>
-                <ns3:positionH relativeFrom="margin">
-                  <ns3:posOffset>-546470</ns3:posOffset>
-                </ns3:positionH>
-                <ns3:positionV relativeFrom="margin">
-                  <ns3:posOffset>4952654</ns3:posOffset>
-                </ns3:positionV>
-                <ns3:extent cx="2133600" cy="1962150"/>
-                <ns3:effectExtent l="0" t="0" r="0" b="0"/>
-                <ns3:wrapNone/>
-                <ns3:docPr id="387" name="Zone de texte 387"/>
-                <ns3:cNvGraphicFramePr/>
-                <a:graphic>
-                  <a:graphicData uri="http://schemas.microsoft.com/office/word/2010/wordprocessingShape">
-                    <ns6:wsp>
-                      <ns6:cNvSpPr/>
-                      <ns6:spPr>
-                        <a:xfrm>
-                          <a:off x="0" y="0"/>
-                          <a:ext cx="2133600" cy="1962150"/>
-                        </a:xfrm>
-                        <a:prstGeom prst="rect">
-                          <a:avLst/>
-                        </a:prstGeom>
-                        <a:noFill/>
-                        <a:ln w="6350">
-                          <a:noFill/>
-                        </a:ln>
-                      </ns6:spPr>
-                      <ns6:style>
-                        <a:lnRef idx="0">
-                          <a:schemeClr val="accent1"/>
-                        </a:lnRef>
-                        <a:fillRef idx="0">
-                          <a:schemeClr val="accent1"/>
-                        </a:fillRef>
-                        <a:effectRef idx="0">
-                          <a:scrgbClr r="0" g="0" b="0"/>
-                        </a:effectRef>
-                        <a:fontRef idx="minor">
-                          <a:schemeClr val="dk1"/>
-                        </a:fontRef>
-                      </ns6:style>
-                      <ns6:txbx>
-                        <w:txbxContent>
-                          <w:p>
-                            <w:pPr>
-                              <w:spacing w:line="276" w:lineRule="auto"/>
-                              <w:rPr>
-                                <w:rFonts w:hAnsi="Calibri" w:eastAsia="Calibri" w:cs="Calibri"/>
-                                <w:color w:val="595959"/>
-                                <w:kern w:val="0"/>
-                                <w:sz w:val="28"/>
-                                <w:szCs w:val="28"/>
-                                <w:lang w:val="en-US"/>
-                                <ns2:ligatures ns2:val="none"/>
-                              </w:rPr>
-                            </w:pPr>
-                            <w:r>
-                              <w:rPr>
-                                <w:rFonts w:hAnsi="Calibri" w:eastAsia="Calibri" w:cs="Calibri"/>
-                                <w:color w:val="595959"/>
-                                <w:sz w:val="28"/>
-                                <w:szCs w:val="28"/>
-                                <w:lang w:val="en-US"/>
-                              </w:rPr>
-                              <w:t>Victor Agahi, Cl</w:t>
-                            </w:r>
-                            <w:r>
-                              <w:rPr>
-                                <w:rFonts w:hAnsi="Calibri" w:eastAsia="Calibri" w:cs="Calibri"/>
-                                <w:color w:val="595959"/>
-                                <w:sz w:val="28"/>
-                                <w:szCs w:val="28"/>
-                                <w:lang w:val="en-US"/>
-                              </w:rPr>
-                              <w:t>é</w:t>
-                            </w:r>
-                            <w:r>
-                              <w:rPr>
-                                <w:rFonts w:hAnsi="Calibri" w:eastAsia="Calibri" w:cs="Calibri"/>
-                                <w:color w:val="595959"/>
-                                <w:sz w:val="28"/>
-                                <w:szCs w:val="28"/>
-                                <w:lang w:val="en-US"/>
-                              </w:rPr>
-                              <w:t>ment Pasteau, Victor Giroud</w:t>
-                            </w:r>
-                          </w:p>
-                          <w:p>
-                            <w:pPr>
-                              <w:spacing w:line="276" w:lineRule="auto"/>
-                              <w:rPr>
-                                <w:rFonts w:hAnsi="Calibri" w:eastAsia="Calibri" w:cs="Calibri"/>
-                                <w:color w:val="A6A6A6"/>
-                                <w:lang w:val="en-US"/>
-                              </w:rPr>
-                            </w:pPr>
-                            <w:r>
-                              <w:rPr>
-                                <w:rFonts w:hAnsi="Calibri" w:eastAsia="Calibri" w:cs="Calibri"/>
-                                <w:color w:val="A6A6A6"/>
-                                <w:lang w:val="en-US"/>
-                              </w:rPr>
-                              <w:t>PLIC</w:t>
-                            </w:r>
-                          </w:p>
-                          <w:p>
-                            <w:pPr>
-                              <w:spacing w:line="276" w:lineRule="auto"/>
-                              <w:rPr>
-                                <w:rFonts w:hAnsi="Calibri" w:eastAsia="Calibri" w:cs="Calibri"/>
-                                <w:color w:val="A6A6A6"/>
-                                <w:lang w:val="en-US"/>
-                              </w:rPr>
-                            </w:pPr>
-                            <w:r>
-                              <w:rPr>
-                                <w:rFonts w:hAnsi="Calibri" w:eastAsia="Calibri" w:cs="Calibri"/>
-                                <w:color w:val="A6A6A6"/>
-                                <w:lang w:val="en-US"/>
-                              </w:rPr>
-                              <w:t>14 Pages</w:t>
-                            </w:r>
-                          </w:p>
-                          <w:p>
-                            <w:pPr>
-                              <w:spacing w:line="276" w:lineRule="auto"/>
-                              <w:rPr>
-                                <w:rFonts w:hAnsi="Calibri" w:eastAsia="Calibri" w:cs="Calibri"/>
-                                <w:color w:val="A6A6A6"/>
-                                <w:lang w:val="en-US"/>
-                              </w:rPr>
-                            </w:pPr>
-                            <w:r>
-                              <w:rPr>
-                                <w:rFonts w:hAnsi="Calibri" w:eastAsia="Calibri" w:cs="Calibri"/>
-                                <w:color w:val="A6A6A6"/>
-                                <w:lang w:val="en-US"/>
-                              </w:rPr>
-                              <w:t>&lt;DATE_TODO&gt;</w:t>
-                            </w:r>
-                          </w:p>
-                          <w:p>
-                            <w:pPr>
-                              <w:spacing w:line="276" w:lineRule="auto"/>
-                              <w:rPr>
-                                <w:rFonts w:hAnsi="Calibri" w:eastAsia="Calibri" w:cs="Calibri"/>
-                                <w:color w:val="A6A6A6"/>
-                                <w:lang w:val="en-US"/>
-                              </w:rPr>
-                            </w:pPr>
-                            <w:r>
-                              <w:rPr>
-                                <w:rFonts w:hAnsi="Calibri" w:eastAsia="Calibri" w:cs="Calibri"/>
-                                <w:color w:val="A6A6A6"/>
-                                <w:lang w:val="en-US"/>
-                              </w:rPr>
-                              <w:t>Version 1.0</w:t>
-                            </w:r>
-                          </w:p>
-                        </w:txbxContent>
-                      </ns6:txbx>
-                      <ns6:bodyPr spcFirstLastPara="0" wrap="square" lIns="91440" tIns="182880" rIns="91440" bIns="91440" anchor="t">
-                        <a:noAutofit/>
-                      </ns6:bodyPr>
-                    </ns6:wsp>
-                  </a:graphicData>
-                </a:graphic>
-                <ns4:sizeRelH relativeFrom="margin">
-                  <ns4:pctWidth>0</ns4:pctWidth>
-                </ns4:sizeRelH>
-                <ns4:sizeRelV relativeFrom="margin">
-                  <ns4:pctHeight>0</ns4:pctHeight>
-                </ns4:sizeRelV>
-              </ns3:anchor>
-            </w:drawing>
-          </ns1:Choice>
-          <ns1:Fallback/>
-        </ns1:AlternateContent>
-      </w:r>
-      <w:r>
-        <w:rPr>
-          <w:rFonts w:eastAsiaTheme="majorEastAsia"/>
-          <w:noProof/>
-          <w:sz w:val="72"/>
-          <w:szCs w:val="72"/>
-          <w:lang w:eastAsia="fr-FR"/>
-        </w:rPr>
-        <w:drawing>
-          <ns3:anchor distT="0" distB="0" distL="114300" distR="114300" simplePos="0" relativeHeight="251658243" behindDoc="0" locked="0" layoutInCell="1" allowOverlap="1" ns4:anchorId="6BAA5425" ns4:editId="006AFBF1">
-            <ns3:simplePos x="0" y="0"/>
-            <ns3:positionH relativeFrom="margin">
-              <ns3:posOffset>4653280</ns3:posOffset>
-            </ns3:positionH>
-            <ns3:positionV relativeFrom="margin">
-              <ns3:posOffset>7777480</ns3:posOffset>
-            </ns3:positionV>
-            <ns3:extent cx="1656080" cy="1121410"/>
-            <ns3:effectExtent l="0" t="0" r="1270" b="2540"/>
-            <ns3:wrapSquare wrapText="bothSides"/>
-            <ns3:docPr id="5" name="Image 5"/>
-            <ns3:cNvGraphicFramePr>
-              <a:graphicFrameLocks noChangeAspect="1"/>
-            </ns3:cNvGraphicFramePr>
-            <a:graphic>
-              <a:graphicData uri="http://schemas.openxmlformats.org/drawingml/2006/picture">
-                <ns7:pic>
-                  <ns7:nvPicPr>
-                    <ns7:cNvPr id="0" name="Picture 4" descr="C:\Users\Antoine\Dropbox\MTI\template\logoepita.png"/>
-                    <ns7:cNvPicPr>
-                      <a:picLocks noChangeAspect="1" noChangeArrowheads="1"/>
-                    </ns7:cNvPicPr>
-                  </ns7:nvPicPr>
-                  <ns7:blipFill>
-                    <a:blip r:embed="rId16" cstate="print">
-                      <a:extLst>
-                        <a:ext uri="{28A0092B-C50C-407E-A947-70E740481C1C}">
-                          <ns9:useLocalDpi val="0"/>
-                        </a:ext>
-                      </a:extLst>
-                    </a:blip>
-                    <a:stretch>
-                      <a:fillRect/>
-                    </a:stretch>
-                  </ns7:blipFill>
-                  <ns7:spPr bwMode="auto">
-                    <a:xfrm>
-                      <a:off x="0" y="0"/>
-                      <a:ext cx="1656080" cy="1121410"/>
-                    </a:xfrm>
-                    <a:prstGeom prst="rect">
-                      <a:avLst/>
-                    </a:prstGeom>
-                    <a:noFill/>
-                    <a:ln>
-                      <a:noFill/>
-                    </a:ln>
-                  </ns7:spPr>
-                </ns7:pic>
-              </a:graphicData>
-            </a:graphic>
-            <ns4:sizeRelH relativeFrom="margin">
-              <ns4:pctWidth>0</ns4:pctWidth>
-            </ns4:sizeRelH>
-            <ns4:sizeRelV relativeFrom="margin">
-              <ns4:pctHeight>0</ns4:pctHeight>
-            </ns4:sizeRelV>
-          </ns3:anchor>
-        </w:drawing>
-      </w:r>
-      <w:r>
-        <w:rPr>
-          <w:noProof/>
-          <w:lang w:eastAsia="fr-FR"/>
-        </w:rPr>
-        <w:drawing>
-          <ns3:anchor distT="0" distB="0" distL="114300" distR="114300" simplePos="0" relativeHeight="251658245" behindDoc="1" locked="0" layoutInCell="1" allowOverlap="1" ns4:anchorId="6273C76F" ns4:editId="4B028B8C">
-            <ns3:simplePos x="0" y="0"/>
-            <ns3:positionH relativeFrom="column">
-              <ns3:posOffset>2804768</ns3:posOffset>
-            </ns3:positionH>
-            <ns3:positionV relativeFrom="paragraph">
-              <ns3:posOffset>6694018</ns3:posOffset>
-            </ns3:positionV>
-            <ns3:extent cx="1610412" cy="1060704"/>
-            <ns3:effectExtent l="0" t="0" r="8890" b="6350"/>
-            <ns3:wrapNone/>
-            <ns3:docPr id="6" name="Image 0" descr="mti.jpg"/>
-            <ns3:cNvGraphicFramePr>
-              <a:graphicFrameLocks noChangeAspect="1"/>
-            </ns3:cNvGraphicFramePr>
-            <a:graphic>
-              <a:graphicData uri="http://schemas.openxmlformats.org/drawingml/2006/picture">
-                <ns7:pic>
-                  <ns7:nvPicPr>
-                    <ns7:cNvPr id="0" name="mti.jpg"/>
-                    <ns7:cNvPicPr/>
-                  </ns7:nvPicPr>
-                  <ns7:blipFill>
-                    <a:blip r:embed="rId17"/>
-                    <a:stretch>
-                      <a:fillRect/>
-                    </a:stretch>
-                  </ns7:blipFill>
-                  <ns7:spPr>
-                    <a:xfrm>
-                      <a:off x="0" y="0"/>
-                      <a:ext cx="1610412" cy="1060704"/>
-                    </a:xfrm>
-                    <a:prstGeom prst="rect">
-                      <a:avLst/>
-                    </a:prstGeom>
-                  </ns7:spPr>
-                </ns7:pic>
-              </a:graphicData>
-            </a:graphic>
-            <ns4:sizeRelH relativeFrom="margin">
-              <ns4:pctWidth>0</ns4:pctWidth>
-            </ns4:sizeRelH>
-            <ns4:sizeRelV relativeFrom="margin">
-              <ns4:pctHeight>0</ns4:pctHeight>
-            </ns4:sizeRelV>
-          </ns3:anchor>
-        </w:drawing>
-      </w:r>
-      <w:r>
-        <w:rPr>
-          <w:noProof/>
-          <w:lang w:eastAsia="fr-FR"/>
-        </w:rPr>
-        <ns1:AlternateContent>
-          <ns1:Choice Requires="wps">
-            <w:drawing>
-              <ns3:anchor distT="0" distB="0" distL="114300" distR="114300" simplePos="0" relativeHeight="251658242" behindDoc="0" locked="0" layoutInCell="1" allowOverlap="1" ns4:anchorId="4874BC9C" ns4:editId="4174919A">
-                <ns3:simplePos x="0" y="0"/>
-                <ns3:positionH relativeFrom="column">
-                  <ns3:posOffset>-545465</ns3:posOffset>
-                </ns3:positionH>
-                <ns3:positionV relativeFrom="paragraph">
-                  <ns3:posOffset>2917190</ns3:posOffset>
-                </ns3:positionV>
-                <ns3:extent cx="5403215" cy="450850"/>
-                <ns3:effectExtent l="0" t="0" r="0" b="6350"/>
-                <ns3:wrapNone/>
-                <ns3:docPr id="1" name="Zone de texte 1"/>
-                <ns3:cNvGraphicFramePr/>
-                <a:graphic>
-                  <a:graphicData uri="http://schemas.microsoft.com/office/word/2010/wordprocessingShape">
-                    <ns6:wsp>
-                      <ns6:cNvSpPr/>
-                      <ns6:spPr>
-                        <a:xfrm>
-                          <a:off x="0" y="0"/>
-                          <a:ext cx="5403215" cy="450850"/>
-                        </a:xfrm>
-                        <a:prstGeom prst="rect">
-                          <a:avLst/>
-                        </a:prstGeom>
-                        <a:noFill/>
-                        <a:ln w="6350">
-                          <a:noFill/>
-                        </a:ln>
-                      </ns6:spPr>
-                      <ns6:style>
-                        <a:lnRef idx="0">
-                          <a:schemeClr val="accent1"/>
-                        </a:lnRef>
-                        <a:fillRef idx="0">
-                          <a:schemeClr val="accent1"/>
-                        </a:fillRef>
-                        <a:effectRef idx="0">
-                          <a:scrgbClr r="0" g="0" b="0"/>
-                        </a:effectRef>
-                        <a:fontRef idx="minor">
-                          <a:schemeClr val="dk1"/>
-                        </a:fontRef>
-                      </ns6:style>
-                      <ns6:txbx>
-                        <w:txbxContent>
-                          <w:p>
-                            <w:pPr>
-                              <w:spacing w:line="276" w:lineRule="auto"/>
-                              <w:rPr>
-                                <w:rFonts w:hAnsi="Calibri" w:eastAsia="Calibri" w:cs="Calibri"/>
-                                <w:color w:val="000000"/>
-                                <w:kern w:val="0"/>
-                                <w:sz w:val="32"/>
-                                <w:szCs w:val="32"/>
-                                <w:lang w:val="en-US"/>
-                                <ns2:ligatures ns2:val="none"/>
-                              </w:rPr>
-                            </w:pPr>
-                            <w:r>
-                              <w:rPr>
-                                <w:rFonts w:hAnsi="Calibri" w:eastAsia="Calibri" w:cs="Calibri"/>
-                                <w:color w:val="000000"/>
-                                <w:sz w:val="32"/>
-                                <w:szCs w:val="32"/>
-                                <w:lang w:val="en-US"/>
-                              </w:rPr>
-                              <w:t>Coaching &lt;TODO&gt; - PLIC</w:t>
-                            </w:r>
-                          </w:p>
-                        </w:txbxContent>
-                      </ns6:txbx>
-                      <ns6:bodyPr spcFirstLastPara="0" wrap="square" lIns="91440" tIns="45720" rIns="91440" bIns="45720" anchor="t">
-                        <a:noAutofit/>
-                      </ns6:bodyPr>
-                    </ns6:wsp>
-                  </a:graphicData>
-                </a:graphic>
-                <ns4:sizeRelH relativeFrom="margin">
-                  <ns4:pctWidth>0</ns4:pctWidth>
-                </ns4:sizeRelH>
-                <ns4:sizeRelV relativeFrom="margin">
-                  <ns4:pctHeight>0</ns4:pctHeight>
-                </ns4:sizeRelV>
-              </ns3:anchor>
-            </w:drawing>
-          </ns1:Choice>
-          <ns1:Fallback/>
-        </ns1:AlternateContent>
-      </w:r>
-      <w:r>
-        <w:rPr>
-          <w:rFonts w:eastAsiaTheme="majorEastAsia"/>
-          <w:noProof/>
-          <w:sz w:val="72"/>
-          <w:szCs w:val="72"/>
-          <w:lang w:eastAsia="fr-FR"/>
-        </w:rPr>
-        <ns1:AlternateContent>
-          <ns1:Choice Requires="wps">
-            <w:drawing>
-              <ns3:anchor distT="0" distB="0" distL="114300" distR="114300" simplePos="0" relativeHeight="251658244" behindDoc="0" locked="0" layoutInCell="1" allowOverlap="1" ns4:anchorId="30028E1F" ns4:editId="6D13188C">
-                <ns3:simplePos x="0" y="0"/>
-                <ns3:positionH relativeFrom="column">
-                  <ns3:posOffset>-613410</ns3:posOffset>
-                </ns3:positionH>
-                <ns3:positionV relativeFrom="paragraph">
-                  <ns3:posOffset>1844477</ns3:posOffset>
-                </ns3:positionV>
-                <ns3:extent cx="6424295" cy="1403985"/>
-                <ns3:effectExtent l="0" t="0" r="0" b="2540"/>
-                <ns3:wrapNone/>
-                <ns3:docPr id="307" name="Zone de texte 2"/>
-                <ns3:cNvGraphicFramePr>
-                  <a:graphicFrameLocks/>
-                </ns3:cNvGraphicFramePr>
-                <a:graphic>
-                  <a:graphicData uri="http://schemas.microsoft.com/office/word/2010/wordprocessingShape">
-                    <ns6:wsp>
-                      <ns6:cNvSpPr txBox="1">
-                        <a:spLocks noChangeArrowheads="1"/>
-                      </ns6:cNvSpPr>
-                      <ns6:spPr bwMode="auto">
-                        <a:xfrm>
-                          <a:off x="0" y="0"/>
-                          <a:ext cx="6424295" cy="1403985"/>
-                        </a:xfrm>
-                        <a:prstGeom prst="rect">
-                          <a:avLst/>
-                        </a:prstGeom>
-                        <a:solidFill>
-                          <a:srgbClr val="FFFFFF"/>
-                        </a:solidFill>
-                        <a:ln w="9525">
-                          <a:noFill/>
-                          <a:miter lim="800000"/>
-                          <a:headEnd/>
-                          <a:tailEnd/>
-                        </a:ln>
-                      </ns6:spPr>
-                      <ns6:txbx>
-                        <w:txbxContent>
-                          <w:sdt>
-                            <w:sdtPr>
-                              <w:rPr>
-                                <w:sz w:val="96"/>
-                              </w:rPr>
-                              <w:alias w:val="Titre "/>
-                              <w:tag w:val=""/>
-                              <w:id w:val="304435510"/>
-                              <w:dataBinding w:prefixMappings="xmlns:ns0='http://purl.org/dc/elements/1.1/' xmlns:ns1='http://schemas.openxmlformats.org/package/2006/metadata/core-properties' " w:xpath="/ns1:coreProperties[1]/ns0:title[1]" w:storeItemID="{6C3C8BC8-F283-45AE-878A-BAB7291924A1}"/>
-                              <w:text/>
-                            </w:sdtPr>
-                            <w:sdtContent>
-                              <w:p ns2:paraId="57EB5670" ns2:textId="60F54886">
-                                <w:pPr>
-                                  <w:rPr>
-                                    <w:sz w:val="96"/>
-                                  </w:rPr>
-                                </w:pPr>
-                                <w:r>
-                                  <w:rPr>
-                                    <w:sz w:val="96"/>
-                                  </w:rPr>
-                                  <w:t>Rapport de suivi</w:t>
-                                </w:r>
-                              </w:p>
-                            </w:sdtContent>
-                          </w:sdt>
-                        </w:txbxContent>
-                      </ns6:txbx>
-                      <ns6:bodyPr rot="0" vert="horz" wrap="square" lIns="91440" tIns="45720" rIns="91440" bIns="45720" anchor="t" anchorCtr="0">
-                        <a:spAutoFit/>
-                      </ns6:bodyPr>
-                    </ns6:wsp>
-                  </a:graphicData>
-                </a:graphic>
-                <ns4:sizeRelH relativeFrom="margin">
-                  <ns4:pctWidth>0</ns4:pctWidth>
-                </ns4:sizeRelH>
-                <ns4:sizeRelV relativeFrom="margin">
-                  <ns4:pctHeight>20000</ns4:pctHeight>
-                </ns4:sizeRelV>
-              </ns3:anchor>
-            </w:drawing>
-          </ns1:Choice>
-          <ns1:Fallback>
-            <w:pict>
-              <ns10:shape id="Zone de texte 2" style="position:absolute;margin-left:-48.3pt;margin-top:145.25pt;width:505.85pt;height:110.55pt;z-index:251658245;visibility:visible;mso-wrap-style:square;mso-width-percent:0;mso-height-percent:200;mso-wrap-distance-left:9pt;mso-wrap-distance-top:0;mso-wrap-distance-right:9pt;mso-wrap-distance-bottom:0;mso-position-horizontal:absolute;mso-position-horizontal-relative:text;mso-position-vertical:absolute;mso-position-vertical-relative:text;mso-width-percent:0;mso-height-percent:200;mso-width-relative:margin;mso-height-relative:margin;v-text-anchor:top" ns11:spid="_x0000_s1028" stroked="f" type="#_x0000_t202" ns11:gfxdata="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" ns2:anchorId="30028E1F">
-                <ns10:textbox style="mso-fit-shape-to-text:t">
-                  <w:txbxContent>
-                    <w:sdt>
-                      <w:sdtPr>
-                        <w:rPr>
-                          <w:sz w:val="96"/>
-                        </w:rPr>
-                        <w:alias w:val="Titre "/>
-                        <w:tag w:val=""/>
-                        <w:id w:val="304435510"/>
-                        <w:dataBinding w:prefixMappings="xmlns:ns0='http://purl.org/dc/elements/1.1/' xmlns:ns1='http://schemas.openxmlformats.org/package/2006/metadata/core-properties' " w:xpath="/ns1:coreProperties[1]/ns0:title[1]" w:storeItemID="{6C3C8BC8-F283-45AE-878A-BAB7291924A1}"/>
-                        <w:text/>
-                      </w:sdtPr>
-                      <w:sdtContent>
-                        <w:p ns2:paraId="57EB5670" ns2:textId="60F54886">
-                          <w:pPr>
-                            <w:rPr>
-                              <w:sz w:val="96"/>
-                            </w:rPr>
-                          </w:pPr>
-                          <w:r>
-                            <w:rPr>
-                              <w:sz w:val="96"/>
-                            </w:rPr>
-                            <w:t>Rapport de suivi</w:t>
-                          </w:r>
-                        </w:p>
-                      </w:sdtContent>
-                    </w:sdt>
-                  </w:txbxContent>
-                </ns10:textbox>
-              </ns10:shape>
-            </w:pict>
-          </ns1:Fallback>
-        </ns1:AlternateContent>
-      </w:r>
-      <w:r>
-        <w:rPr>
-          <w:noProof/>
-          <w:lang w:eastAsia="fr-FR"/>
-        </w:rPr>
-        <ns1:AlternateContent>
-          <ns1:Choice Requires="wps">
-            <w:drawing>
-              <ns3:anchor distT="0" distB="0" distL="114300" distR="114300" simplePos="0" relativeHeight="251658240" behindDoc="1" locked="0" layoutInCell="1" allowOverlap="1" ns4:anchorId="10A1922C" ns4:editId="21715743">
-                <ns3:simplePos x="0" y="0"/>
-                <ns3:positionH relativeFrom="margin">
-                  <ns3:align>center</ns3:align>
-                </ns3:positionH>
-                <ns1:AlternateContent>
-                  <ns1:Choice Requires="wp14">
-                    <ns3:positionV relativeFrom="margin">
-                      <ns4:pctPosVOffset>59000</ns4:pctPosVOffset>
-                    </ns3:positionV>
-                  </ns1:Choice>
-                  <ns1:Fallback>
-                    <ns3:positionV relativeFrom="page">
-                      <ns3:posOffset>6178550</ns3:posOffset>
-                    </ns3:positionV>
-                  </ns1:Fallback>
-                </ns1:AlternateContent>
-                <ns3:extent cx="7718887" cy="3703320"/>
-                <ns3:effectExtent l="0" t="0" r="0" b="0"/>
-                <ns3:wrapNone/>
-                <ns3:docPr id="388" name="Rectangle 388"/>
-                <ns3:cNvGraphicFramePr/>
-                <a:graphic>
-                  <a:graphicData uri="http://schemas.microsoft.com/office/word/2010/wordprocessingShape">
-                    <ns6:wsp>
-                      <ns6:cNvSpPr/>
-                      <ns6:spPr>
-                        <a:xfrm>
-                          <a:off x="0" y="0"/>
-                          <a:ext cx="7718887" cy="3703320"/>
-                        </a:xfrm>
-                        <a:prstGeom prst="rect">
-                          <a:avLst/>
-                        </a:prstGeom>
-                        <a:noFill/>
-                        <a:ln>
-                          <a:noFill/>
-                        </a:ln>
-                      </ns6:spPr>
-                      <ns6:style>
-                        <a:lnRef idx="2">
-                          <a:schemeClr val="accent1">
-                            <a:shade val="50000"/>
-                          </a:schemeClr>
-                        </a:lnRef>
-                        <a:fillRef idx="1003">
-                          <a:schemeClr val="lt1"/>
-                        </a:fillRef>
-                        <a:effectRef idx="0">
-                          <a:schemeClr val="accent1"/>
-                        </a:effectRef>
-                        <a:fontRef idx="minor">
-                          <a:schemeClr val="lt1"/>
-                        </a:fontRef>
-                      </ns6:style>
-                      <ns6:txbx>
-                        <w:txbxContent>
-                          <w:p ns2:paraId="4B4C82AF" ns2:textId="77777777">
-                            <w:pPr>
-                              <w:jc w:val="center"/>
-                            </w:pPr>
-                          </w:p>
-                        </w:txbxContent>
-                      </ns6:txbx>
-                      <ns6:bodyPr rot="0" spcFirstLastPara="0" vertOverflow="overflow" horzOverflow="overflow" vert="horz" wrap="square" lIns="91440" tIns="45720" rIns="91440" bIns="45720" numCol="1" spcCol="0" rtlCol="0" fromWordArt="0" anchor="ctr" anchorCtr="0" forceAA="0" compatLnSpc="1">
-                        <a:prstTxWarp prst="textNoShape">
-                          <a:avLst/>
-                        </a:prstTxWarp>
-                        <a:noAutofit/>
-                      </ns6:bodyPr>
-                    </ns6:wsp>
-                  </a:graphicData>
-                </a:graphic>
-                <ns4:sizeRelH relativeFrom="margin">
-                  <ns4:pctWidth>0</ns4:pctWidth>
-                </ns4:sizeRelH>
-                <ns4:sizeRelV relativeFrom="margin">
-                  <ns4:pctHeight>45000</ns4:pctHeight>
-                </ns4:sizeRelV>
-              </ns3:anchor>
-            </w:drawing>
-          </ns1:Choice>
-          <ns1:Fallback>
-            <w:pict>
-              <ns10:rect id="Rectangle 388" style="position:absolute;margin-left:0;margin-top:0;width:607.8pt;height:291.6pt;z-index:-251658240;visibility:visible;mso-wrap-style:square;mso-width-percent:0;mso-height-percent:450;mso-top-percent:590;mso-wrap-distance-left:9pt;mso-wrap-distance-top:0;mso-wrap-distance-right:9pt;mso-wrap-distance-bottom:0;mso-position-horizontal:center;mso-position-horizontal-relative:margin;mso-position-vertical-relative:margin;mso-width-percent:0;mso-height-percent:450;mso-top-percent:590;mso-width-relative:margin;mso-height-relative:margin;v-text-anchor:middle" ns11:spid="_x0000_s1029" filled="f" stroked="f" strokeweight="2pt" ns2:anchorId="10A1922C" ns11:gfxdata="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">
-                <ns10:textbox>
-                  <w:txbxContent>
-                    <w:p ns2:paraId="4B4C82AF" ns2:textId="77777777">
-                      <w:pPr>
-                        <w:jc w:val="center"/>
-                      </w:pPr>
-                    </w:p>
-                  </w:txbxContent>
-                </ns10:textbox>
-                <ns12:wrap anchorx="margin" anchory="margin"/>
-              </ns10:rect>
-            </w:pict>
-          </ns1:Fallback>
-        </ns1:AlternateContent>
-      </w:r>
-    </w:p>
-    <w:p ns2:paraId="2461F8B5" ns2:textId="20428966">
-      <w:pPr>
-        <w:pStyle w:val="Normal"/>
-        <w:sectPr>
-          <w:headerReference w:type="default" r:id="rId12"/>
-          <w:footerReference w:type="default" r:id="rId13"/>
-          <w:headerReference w:type="first" r:id="rId14"/>
-          <w:footerReference w:type="first" r:id="rId15"/>
-          <w:pgSz w:w="11906" w:h="16838" w:orient="portrait"/>
-          <w:pgMar w:top="1134" w:right="1134" w:bottom="1134" w:left="1134" w:header="709" w:footer="709" w:gutter="0"/>
-          <w:pgNumType w:start="0"/>
-          <w:cols w:space="708"/>
-          <w:titlePg/>
-          <w:docGrid w:linePitch="360"/>
-        </w:sectPr>
-      </w:pPr>
-    </w:p>
-    <w:p ns2:paraId="3F5BF519" ns2:textId="77777777">
-      <w:pPr>
-        <w:rPr>
-          <w:b/>
-          <w:bCs/>
-          <w:sz w:val="28"/>
-          <w:szCs w:val="28"/>
-        </w:rPr>
-      </w:pPr>
-      <w:r>
-        <w:rPr>
-          <w:b/>
-          <w:bCs/>
-          <w:sz w:val="28"/>
-          <w:szCs w:val="28"/>
-        </w:rPr>
-        <w:t>Propriétés du document</w:t>
-      </w:r>
-    </w:p>
-    <w:tbl>
-      <w:tblPr>
-        <w:tblStyle w:val="MediumList2"/>
-        <w:tblW w:w="9912" w:type="dxa"/>
-        <w:tblLook w:val="04A0" w:firstRow="1" w:lastRow="0" w:firstColumn="1" w:lastColumn="0" w:noHBand="0" w:noVBand="1"/>
-      </w:tblPr>
-      <w:tblGrid>
-        <w:gridCol w:w="2126"/>
-        <w:gridCol w:w="7786"/>
-      </w:tblGrid>
-      <w:tr ns2:paraId="108D18C6" ns2:textId="77777777">
-        <w:trPr>
-          <w:cnfStyle w:val="100000000000" w:firstRow="1" w:lastRow="0" w:firstColumn="0" w:lastColumn="0" w:oddVBand="0" w:evenVBand="0" w:oddHBand="0" w:evenHBand="0" w:firstRowFirstColumn="0" w:firstRowLastColumn="0" w:lastRowFirstColumn="0" w:lastRowLastColumn="0"/>
-        </w:trPr>
-        <w:tc>
-          <w:tcPr>
-            <w:cnfStyle w:val="001000000100" w:firstRow="0" w:lastRow="0" w:firstColumn="1" w:lastColumn="0" w:oddVBand="0" w:evenVBand="0" w:oddHBand="0" w:evenHBand="0" w:firstRowFirstColumn="1" w:firstRowLastColumn="0" w:lastRowFirstColumn="0" w:lastRowLastColumn="0"/>
-            <w:tcW w:w="2126" w:type="dxa"/>
-            <w:tcBorders>
-              <w:right w:val="single" w:color="000000" w:themeColor="text1" w:sz="8" w:space="0"/>
-            </w:tcBorders>
-            <w:tcMar/>
-          </w:tcPr>
-          <w:p ns2:paraId="45D68444" ns2:textId="77777777">
-            <w:pPr>
-              <w:rPr>
-                <w:rFonts w:ascii="Calibri" w:hAnsi="Calibri"/>
-                <w:b/>
-                <w:bCs/>
-              </w:rPr>
-            </w:pPr>
-            <w:r>
-              <w:rPr>
-                <w:rFonts w:ascii="Calibri" w:hAnsi="Calibri"/>
-                <w:b/>
-                <w:bCs/>
-              </w:rPr>
-              <w:t>Auteur</w:t>
-            </w:r>
-          </w:p>
-        </w:tc>
-        <w:tc>
-          <w:tcPr>
-            <w:cnfStyle w:val="000000000000" w:firstRow="0" w:lastRow="0" w:firstColumn="0" w:lastColumn="0" w:oddVBand="0" w:evenVBand="0" w:oddHBand="0" w:evenHBand="0" w:firstRowFirstColumn="0" w:firstRowLastColumn="0" w:lastRowFirstColumn="0" w:lastRowLastColumn="0"/>
-            <w:tcW w:w="7786" w:type="dxa"/>
-            <w:tcBorders>
-              <w:left w:val="single" w:color="000000" w:themeColor="text1" w:sz="8" w:space="0"/>
-            </w:tcBorders>
-            <w:tcMar/>
-          </w:tcPr>
-          <w:p ns2:paraId="519D09C8" ns2:textId="17B2AD1B">
-            <w:pPr>
-              <w:cnfStyle w:val="100000000000" w:firstRow="1" w:lastRow="0" w:firstColumn="0" w:lastColumn="0" w:oddVBand="0" w:evenVBand="0" w:oddHBand="0" w:evenHBand="0" w:firstRowFirstColumn="0" w:firstRowLastColumn="0" w:lastRowFirstColumn="0" w:lastRowLastColumn="0"/>
-              <w:rPr>
-                <w:rFonts w:ascii="Calibri" w:hAnsi="Calibri"/>
-                <w:b/>
-                <w:bCs/>
-                <w:color w:val="auto"/>
-              </w:rPr>
-            </w:pPr>
-            <w:sdt>
-              <w:sdtPr>
-                <w:rPr>
-                  <w:rFonts w:ascii="Calibri" w:hAnsi="Calibri"/>
-                </w:rPr>
-                <w:alias w:val="Auteur"/>
-                <w:id w:val="18285934"/>
-                <w:dataBinding w:prefixMappings="xmlns:ns0='http://schemas.openxmlformats.org/package/2006/metadata/core-properties' xmlns:ns1='http://purl.org/dc/elements/1.1/'" w:xpath="/ns0:coreProperties[1]/ns1:creator[1]" w:storeItemID="{6C3C8BC8-F283-45AE-878A-BAB7291924A1}"/>
-                <w:text/>
-              </w:sdtPr>
-              <w:sdtContent>
-                <w:r>
-                  <w:rPr>
-                    <w:rFonts w:ascii="Calibri" w:hAnsi="Calibri"/>
-                  </w:rPr>
-                  <w:t>Victor Agahi, Clément Pasteau, Victor Giroud, Damien Lugagne</w:t>
-                </w:r>
-              </w:sdtContent>
-            </w:sdt>
-          </w:p>
-        </w:tc>
-      </w:tr>
-      <w:tr ns2:paraId="6D083C86" ns2:textId="77777777">
-        <w:trPr>
-          <w:cnfStyle w:val="000000100000" w:firstRow="0" w:lastRow="0" w:firstColumn="0" w:lastColumn="0" w:oddVBand="0" w:evenVBand="0" w:oddHBand="1" w:evenHBand="0" w:firstRowFirstColumn="0" w:firstRowLastColumn="0" w:lastRowFirstColumn="0" w:lastRowLastColumn="0"/>
-        </w:trPr>
-        <w:tc>
-          <w:tcPr>
-            <w:cnfStyle w:val="001000000000" w:firstRow="0" w:lastRow="0" w:firstColumn="1" w:lastColumn="0" w:oddVBand="0" w:evenVBand="0" w:oddHBand="0" w:evenHBand="0" w:firstRowFirstColumn="0" w:firstRowLastColumn="0" w:lastRowFirstColumn="0" w:lastRowLastColumn="0"/>
-            <w:tcW w:w="2126" w:type="dxa"/>
-            <w:tcMar/>
-          </w:tcPr>
-          <w:p ns2:paraId="0FFC129D" ns2:textId="77777777">
-            <w:pPr>
-              <w:rPr>
-                <w:rFonts w:ascii="Calibri" w:hAnsi="Calibri"/>
-                <w:b/>
-                <w:bCs/>
-              </w:rPr>
-            </w:pPr>
-            <w:r>
-              <w:rPr>
-                <w:rFonts w:ascii="Calibri" w:hAnsi="Calibri"/>
-                <w:b/>
-                <w:bCs/>
-              </w:rPr>
-              <w:t>Version</w:t>
-            </w:r>
-          </w:p>
-        </w:tc>
-        <w:tc>
-          <w:tcPr>
-            <w:cnfStyle w:val="000000000000" w:firstRow="0" w:lastRow="0" w:firstColumn="0" w:lastColumn="0" w:oddVBand="0" w:evenVBand="0" w:oddHBand="0" w:evenHBand="0" w:firstRowFirstColumn="0" w:firstRowLastColumn="0" w:lastRowFirstColumn="0" w:lastRowLastColumn="0"/>
-            <w:tcW w:w="7786" w:type="dxa"/>
-            <w:tcMar/>
-          </w:tcPr>
-          <w:p ns2:paraId="5462CABB" ns2:textId="77777777">
-            <w:pPr>
-              <w:tabs>
-                <w:tab w:val="left" w:pos="3254"/>
-              </w:tabs>
-              <w:cnfStyle w:val="000000100000" w:firstRow="0" w:lastRow="0" w:firstColumn="0" w:lastColumn="0" w:oddVBand="0" w:evenVBand="0" w:oddHBand="1" w:evenHBand="0" w:firstRowFirstColumn="0" w:firstRowLastColumn="0" w:lastRowFirstColumn="0" w:lastRowLastColumn="0"/>
-              <w:rPr>
-                <w:rFonts w:ascii="Calibri" w:hAnsi="Calibri"/>
-                <w:color w:val="auto"/>
-              </w:rPr>
-            </w:pPr>
-            <w:r>
-              <w:t>1.0</w:t>
-            </w:r>
-          </w:p>
-        </w:tc>
-      </w:tr>
-      <w:tr ns2:paraId="020D465A" ns2:textId="77777777">
-        <w:trPr>
-          <w:cnfStyle w:val="000000010000" w:firstRow="0" w:lastRow="0" w:firstColumn="0" w:lastColumn="0" w:oddVBand="0" w:evenVBand="0" w:oddHBand="0" w:evenHBand="1" w:firstRowFirstColumn="0" w:firstRowLastColumn="0" w:lastRowFirstColumn="0" w:lastRowLastColumn="0"/>
-        </w:trPr>
-        <w:tc>
-          <w:tcPr>
-            <w:cnfStyle w:val="001000000000" w:firstRow="0" w:lastRow="0" w:firstColumn="1" w:lastColumn="0" w:oddVBand="0" w:evenVBand="0" w:oddHBand="0" w:evenHBand="0" w:firstRowFirstColumn="0" w:firstRowLastColumn="0" w:lastRowFirstColumn="0" w:lastRowLastColumn="0"/>
-            <w:tcW w:w="2126" w:type="dxa"/>
-            <w:tcMar/>
-          </w:tcPr>
-          <w:p ns2:paraId="7006E3A7" ns2:textId="7EFE10DB">
-            <w:pPr>
-              <w:rPr>
-                <w:rFonts w:ascii="Calibri" w:hAnsi="Calibri"/>
-                <w:b/>
-                <w:bCs/>
-              </w:rPr>
-            </w:pPr>
-            <w:r>
-              <w:rPr>
-                <w:rFonts w:ascii="Calibri" w:hAnsi="Calibri"/>
-                <w:b/>
-                <w:bCs/>
-              </w:rPr>
-              <w:t xml:space="preserve"> </w:t>
-            </w:r>
-            <w:r>
-              <w:rPr>
-                <w:rFonts w:ascii="Calibri" w:hAnsi="Calibri"/>
-                <w:b/>
-                <w:bCs/>
-              </w:rPr>
-              <w:t>Nombre de pages</w:t>
-            </w:r>
-          </w:p>
-        </w:tc>
-        <w:tc>
-          <w:tcPr>
-            <w:cnfStyle w:val="000000000000" w:firstRow="0" w:lastRow="0" w:firstColumn="0" w:lastColumn="0" w:oddVBand="0" w:evenVBand="0" w:oddHBand="0" w:evenHBand="0" w:firstRowFirstColumn="0" w:firstRowLastColumn="0" w:lastRowFirstColumn="0" w:lastRowLastColumn="0"/>
-            <w:tcW w:w="7786" w:type="dxa"/>
-            <w:tcMar/>
-          </w:tcPr>
-          <w:p ns2:paraId="53586AFD" ns2:textId="6612804A">
-            <w:pPr>
-              <w:cnfStyle w:val="000000010000" w:firstRow="0" w:lastRow="0" w:firstColumn="0" w:lastColumn="0" w:oddVBand="0" w:evenVBand="0" w:oddHBand="0" w:evenHBand="1" w:firstRowFirstColumn="0" w:firstRowLastColumn="0" w:lastRowFirstColumn="0" w:lastRowLastColumn="0"/>
-              <w:rPr>
-                <w:rFonts w:ascii="Calibri" w:hAnsi="Calibri"/>
-              </w:rPr>
-            </w:pPr>
-          </w:p>
-        </w:tc>
-      </w:tr>
-      <w:tr ns2:paraId="569030F9" ns2:textId="77777777">
-        <w:trPr>
-          <w:cnfStyle w:val="000000100000" w:firstRow="0" w:lastRow="0" w:firstColumn="0" w:lastColumn="0" w:oddVBand="0" w:evenVBand="0" w:oddHBand="1" w:evenHBand="0" w:firstRowFirstColumn="0" w:firstRowLastColumn="0" w:lastRowFirstColumn="0" w:lastRowLastColumn="0"/>
-          <w:trHeight w:val="405"/>
-        </w:trPr>
-        <w:tc>
-          <w:tcPr>
-            <w:cnfStyle w:val="001000000000" w:firstRow="0" w:lastRow="0" w:firstColumn="1" w:lastColumn="0" w:oddVBand="0" w:evenVBand="0" w:oddHBand="0" w:evenHBand="0" w:firstRowFirstColumn="0" w:firstRowLastColumn="0" w:lastRowFirstColumn="0" w:lastRowLastColumn="0"/>
-            <w:tcW w:w="2126" w:type="dxa"/>
-            <w:tcMar/>
-          </w:tcPr>
-          <w:p ns2:paraId="5250A763" ns2:textId="77777777">
-            <w:pPr>
-              <w:rPr>
-                <w:rFonts w:ascii="Calibri" w:hAnsi="Calibri"/>
-                <w:b/>
-                <w:bCs/>
-              </w:rPr>
-            </w:pPr>
-            <w:r>
-              <w:rPr>
-                <w:rFonts w:ascii="Calibri" w:hAnsi="Calibri"/>
-                <w:b/>
-                <w:bCs/>
-              </w:rPr>
-              <w:t>Références</w:t>
-            </w:r>
-          </w:p>
-        </w:tc>
-        <w:tc>
-          <w:tcPr>
-            <w:cnfStyle w:val="000000000000" w:firstRow="0" w:lastRow="0" w:firstColumn="0" w:lastColumn="0" w:oddVBand="0" w:evenVBand="0" w:oddHBand="0" w:evenHBand="0" w:firstRowFirstColumn="0" w:firstRowLastColumn="0" w:lastRowFirstColumn="0" w:lastRowLastColumn="0"/>
-            <w:tcW w:w="7786" w:type="dxa"/>
-            <w:tcMar/>
-          </w:tcPr>
-          <w:sdt>
-            <w:sdtPr>
-              <w:alias w:val="Mots clés "/>
-              <w:id w:val="-73124330"/>
-              <w:dataBinding w:prefixMappings="xmlns:ns0='http://purl.org/dc/elements/1.1/' xmlns:ns1='http://schemas.openxmlformats.org/package/2006/metadata/core-properties' " w:xpath="/ns1:coreProperties[1]/ns1:keywords[1]" w:storeItemID="{6C3C8BC8-F283-45AE-878A-BAB7291924A1}"/>
-              <w:text/>
-            </w:sdtPr>
-            <w:sdtContent>
-              <w:p ns2:paraId="7B325FC0" ns2:textId="668AE4C6">
-                <w:pPr>
-                  <w:cnfStyle w:val="000000100000" w:firstRow="0" w:lastRow="0" w:firstColumn="0" w:lastColumn="0" w:oddVBand="0" w:evenVBand="0" w:oddHBand="1" w:evenHBand="0" w:firstRowFirstColumn="0" w:firstRowLastColumn="0" w:lastRowFirstColumn="0" w:lastRowLastColumn="0"/>
-                  <w:rPr>
-                    <w:rFonts w:eastAsiaTheme="minorEastAsia"/>
-                    <w:color w:val="auto"/>
-                  </w:rPr>
-                </w:pPr>
-                <w:r>
-                  <w:t>PLIC</w:t>
-                </w:r>
-              </w:p>
-            </w:sdtContent>
-          </w:sdt>
-        </w:tc>
-      </w:tr>
-      <w:tr ns2:paraId="1FFB7186" ns2:textId="77777777">
-        <w:trPr>
-          <w:cnfStyle w:val="000000010000" w:firstRow="0" w:lastRow="0" w:firstColumn="0" w:lastColumn="0" w:oddVBand="0" w:evenVBand="0" w:oddHBand="0" w:evenHBand="1" w:firstRowFirstColumn="0" w:firstRowLastColumn="0" w:lastRowFirstColumn="0" w:lastRowLastColumn="0"/>
-        </w:trPr>
-        <w:tc>
-          <w:tcPr>
-            <w:cnfStyle w:val="001000000000" w:firstRow="0" w:lastRow="0" w:firstColumn="1" w:lastColumn="0" w:oddVBand="0" w:evenVBand="0" w:oddHBand="0" w:evenHBand="0" w:firstRowFirstColumn="0" w:firstRowLastColumn="0" w:lastRowFirstColumn="0" w:lastRowLastColumn="0"/>
-            <w:tcW w:w="2126" w:type="dxa"/>
-            <w:tcMar/>
-          </w:tcPr>
-          <w:p ns2:paraId="74B3B3C5" ns2:textId="77777777">
-            <w:pPr>
-              <w:rPr>
-                <w:rFonts w:ascii="Calibri" w:hAnsi="Calibri"/>
-                <w:b/>
-                <w:bCs/>
-              </w:rPr>
-            </w:pPr>
-            <w:r>
-              <w:rPr>
-                <w:rFonts w:ascii="Calibri" w:hAnsi="Calibri"/>
-                <w:b/>
-                <w:bCs/>
-              </w:rPr>
-              <w:t>Nom fichier</w:t>
-            </w:r>
-          </w:p>
-        </w:tc>
-        <w:tc>
-          <w:tcPr>
-            <w:cnfStyle w:val="000000000000" w:firstRow="0" w:lastRow="0" w:firstColumn="0" w:lastColumn="0" w:oddVBand="0" w:evenVBand="0" w:oddHBand="0" w:evenHBand="0" w:firstRowFirstColumn="0" w:firstRowLastColumn="0" w:lastRowFirstColumn="0" w:lastRowLastColumn="0"/>
-            <w:tcW w:w="7786" w:type="dxa"/>
-            <w:tcMar/>
-          </w:tcPr>
-          <w:p ns2:paraId="2387679D" ns2:textId="2FD6ABC4">
-            <w:pPr>
-              <w:cnfStyle w:val="000000010000" w:firstRow="0" w:lastRow="0" w:firstColumn="0" w:lastColumn="0" w:oddVBand="0" w:evenVBand="0" w:oddHBand="0" w:evenHBand="1" w:firstRowFirstColumn="0" w:firstRowLastColumn="0" w:lastRowFirstColumn="0" w:lastRowLastColumn="0"/>
-            </w:pPr>
-            <w:r>
-              <w:rPr/>
-              <w:t>Rapport de suivi coaching &lt;TODO&gt;</w:t>
-            </w:r>
-          </w:p>
-          <w:p ns2:paraId="2D047B50" ns2:textId="58994DC6">
-            <w:pPr>
-              <w:cnfStyle w:val="000000010000" w:firstRow="0" w:lastRow="0" w:firstColumn="0" w:lastColumn="0" w:oddVBand="0" w:evenVBand="0" w:oddHBand="0" w:evenHBand="1" w:firstRowFirstColumn="0" w:firstRowLastColumn="0" w:lastRowFirstColumn="0" w:lastRowLastColumn="0"/>
-              <w:rPr>
-                <w:lang w:val="en-US"/>
-              </w:rPr>
-            </w:pPr>
-          </w:p>
-        </w:tc>
-      </w:tr>
-    </w:tbl>
-    <w:p ns2:paraId="0C3EE3C5" ns2:textId="77777777">
-      <w:pPr>
-        <w:rPr>
-          <w:lang w:val="en-US"/>
-        </w:rPr>
-      </w:pPr>
-    </w:p>
-    <w:p ns2:paraId="63B4B7FC" ns2:textId="77777777">
-      <w:pPr>
-        <w:rPr>
-          <w:b/>
-          <w:bCs/>
-          <w:sz w:val="28"/>
-          <w:szCs w:val="28"/>
-        </w:rPr>
-      </w:pPr>
-      <w:r>
-        <w:rPr>
-          <w:b/>
-          <w:bCs/>
-          <w:sz w:val="28"/>
-          <w:szCs w:val="28"/>
-        </w:rPr>
-        <w:t>Historique du document</w:t>
-      </w:r>
-    </w:p>
-    <w:tbl>
-      <w:tblPr>
-        <w:tblStyle w:val="MediumList2"/>
-        <w:tblW w:w="9918" w:type="dxa"/>
-        <w:tblLayout w:type="fixed"/>
-        <w:tblLook w:val="04A0" w:firstRow="1" w:lastRow="0" w:firstColumn="1" w:lastColumn="0" w:noHBand="0" w:noVBand="1"/>
-      </w:tblPr>
-      <w:tblGrid>
-        <w:gridCol w:w="2268"/>
-        <w:gridCol w:w="1080"/>
-        <w:gridCol w:w="1350"/>
-        <w:gridCol w:w="5220"/>
-      </w:tblGrid>
-      <w:tr ns2:paraId="49BCB758" ns2:textId="77777777">
-        <w:trPr>
-          <w:cnfStyle w:val="100000000000" w:firstRow="1" w:lastRow="0" w:firstColumn="0" w:lastColumn="0" w:oddVBand="0" w:evenVBand="0" w:oddHBand="0" w:evenHBand="0" w:firstRowFirstColumn="0" w:firstRowLastColumn="0" w:lastRowFirstColumn="0" w:lastRowLastColumn="0"/>
-        </w:trPr>
-        <w:tc>
-          <w:tcPr>
-            <w:cnfStyle w:val="001000000100" w:firstRow="0" w:lastRow="0" w:firstColumn="1" w:lastColumn="0" w:oddVBand="0" w:evenVBand="0" w:oddHBand="0" w:evenHBand="0" w:firstRowFirstColumn="1" w:firstRowLastColumn="0" w:lastRowFirstColumn="0" w:lastRowLastColumn="0"/>
-            <w:tcW w:w="2268" w:type="dxa"/>
-          </w:tcPr>
-          <w:p ns2:paraId="270319F6" ns2:textId="77777777">
-            <w:pPr>
-              <w:jc w:val="center"/>
-              <w:rPr>
-                <w:rFonts w:asciiTheme="minorHAnsi" w:hAnsiTheme="minorHAnsi"/>
-                <w:b/>
-                <w:bCs/>
-              </w:rPr>
-            </w:pPr>
-            <w:r>
-              <w:rPr>
-                <w:rFonts w:asciiTheme="minorHAnsi" w:hAnsiTheme="minorHAnsi"/>
-                <w:b/>
-                <w:bCs/>
-              </w:rPr>
-              <w:t>Date de révision</w:t>
-            </w:r>
-          </w:p>
-        </w:tc>
-        <w:tc>
-          <w:tcPr>
-            <w:tcW w:w="1080" w:type="dxa"/>
-          </w:tcPr>
-          <w:p ns2:paraId="3D07BCEC" ns2:textId="77777777">
-            <w:pPr>
-              <w:cnfStyle w:val="100000000000" w:firstRow="1" w:lastRow="0" w:firstColumn="0" w:lastColumn="0" w:oddVBand="0" w:evenVBand="0" w:oddHBand="0" w:evenHBand="0" w:firstRowFirstColumn="0" w:firstRowLastColumn="0" w:lastRowFirstColumn="0" w:lastRowLastColumn="0"/>
-              <w:rPr>
-                <w:rFonts w:asciiTheme="minorHAnsi" w:hAnsiTheme="minorHAnsi"/>
-                <w:b/>
-                <w:bCs/>
-              </w:rPr>
-            </w:pPr>
-            <w:r>
-              <w:rPr>
-                <w:rFonts w:asciiTheme="minorHAnsi" w:hAnsiTheme="minorHAnsi"/>
-                <w:b/>
-                <w:bCs/>
-              </w:rPr>
-              <w:t>Version</w:t>
-            </w:r>
-          </w:p>
-        </w:tc>
-        <w:tc>
-          <w:tcPr>
-            <w:tcW w:w="1350" w:type="dxa"/>
-          </w:tcPr>
-          <w:p ns2:paraId="6CE7794E" ns2:textId="77777777">
-            <w:pPr>
-              <w:jc w:val="center"/>
-              <w:cnfStyle w:val="100000000000" w:firstRow="1" w:lastRow="0" w:firstColumn="0" w:lastColumn="0" w:oddVBand="0" w:evenVBand="0" w:oddHBand="0" w:evenHBand="0" w:firstRowFirstColumn="0" w:firstRowLastColumn="0" w:lastRowFirstColumn="0" w:lastRowLastColumn="0"/>
-              <w:rPr>
-                <w:rFonts w:asciiTheme="minorHAnsi" w:hAnsiTheme="minorHAnsi"/>
-                <w:b/>
-                <w:bCs/>
-              </w:rPr>
-            </w:pPr>
-            <w:r>
-              <w:rPr>
-                <w:rFonts w:asciiTheme="minorHAnsi" w:hAnsiTheme="minorHAnsi"/>
-                <w:b/>
-                <w:bCs/>
-              </w:rPr>
-              <w:t>Auteur</w:t>
-            </w:r>
-          </w:p>
-        </w:tc>
-        <w:tc>
-          <w:tcPr>
-            <w:tcW w:w="5220" w:type="dxa"/>
-          </w:tcPr>
-          <w:p ns2:paraId="0725A1CC" ns2:textId="77777777">
-            <w:pPr>
-              <w:jc w:val="center"/>
-              <w:cnfStyle w:val="100000000000" w:firstRow="1" w:lastRow="0" w:firstColumn="0" w:lastColumn="0" w:oddVBand="0" w:evenVBand="0" w:oddHBand="0" w:evenHBand="0" w:firstRowFirstColumn="0" w:firstRowLastColumn="0" w:lastRowFirstColumn="0" w:lastRowLastColumn="0"/>
-              <w:rPr>
-                <w:rFonts w:asciiTheme="minorHAnsi" w:hAnsiTheme="minorHAnsi"/>
-                <w:b/>
-                <w:bCs/>
-              </w:rPr>
-            </w:pPr>
-            <w:r>
-              <w:rPr>
-                <w:rFonts w:asciiTheme="minorHAnsi" w:hAnsiTheme="minorHAnsi"/>
-                <w:b/>
-                <w:bCs/>
-              </w:rPr>
-              <w:t>Changements</w:t>
-            </w:r>
-          </w:p>
-        </w:tc>
-      </w:tr>
-      <w:tr ns2:paraId="2C0B0DE8" ns2:textId="77777777">
-        <w:trPr>
-          <w:cnfStyle w:val="000000100000" w:firstRow="0" w:lastRow="0" w:firstColumn="0" w:lastColumn="0" w:oddVBand="0" w:evenVBand="0" w:oddHBand="1" w:evenHBand="0" w:firstRowFirstColumn="0" w:firstRowLastColumn="0" w:lastRowFirstColumn="0" w:lastRowLastColumn="0"/>
-        </w:trPr>
-        <w:tc>
-          <w:tcPr>
-            <w:cnfStyle w:val="001000000000" w:firstRow="0" w:lastRow="0" w:firstColumn="1" w:lastColumn="0" w:oddVBand="0" w:evenVBand="0" w:oddHBand="0" w:evenHBand="0" w:firstRowFirstColumn="0" w:firstRowLastColumn="0" w:lastRowFirstColumn="0" w:lastRowLastColumn="0"/>
-            <w:tcW w:w="2268" w:type="dxa"/>
-          </w:tcPr>
-          <w:p ns2:paraId="67D29990" ns2:textId="77777777">
-            <w:pPr>
-              <w:rPr>
-                <w:rFonts w:asciiTheme="minorHAnsi" w:hAnsiTheme="minorHAnsi"/>
-                <w:b/>
-                <w:bCs/>
-                <w:color w:val="auto"/>
-              </w:rPr>
-            </w:pPr>
-          </w:p>
-        </w:tc>
-        <w:tc>
-          <w:tcPr>
-            <w:tcW w:w="1080" w:type="dxa"/>
-          </w:tcPr>
-          <w:p ns2:paraId="155A070D" ns2:textId="77777777">
-            <w:pPr>
-              <w:cnfStyle w:val="000000100000" w:firstRow="0" w:lastRow="0" w:firstColumn="0" w:lastColumn="0" w:oddVBand="0" w:evenVBand="0" w:oddHBand="1" w:evenHBand="0" w:firstRowFirstColumn="0" w:firstRowLastColumn="0" w:lastRowFirstColumn="0" w:lastRowLastColumn="0"/>
-              <w:rPr>
-                <w:rFonts w:asciiTheme="minorHAnsi" w:hAnsiTheme="minorHAnsi"/>
-                <w:color w:val="auto"/>
-              </w:rPr>
-            </w:pPr>
-            <w:r>
-              <w:rPr>
-                <w:rFonts w:asciiTheme="minorHAnsi" w:hAnsiTheme="minorHAnsi"/>
-                <w:color w:val="auto"/>
-              </w:rPr>
-              <w:t>1.0</w:t>
-            </w:r>
-          </w:p>
-        </w:tc>
-        <w:tc>
-          <w:tcPr>
-            <w:tcW w:w="1350" w:type="dxa"/>
-          </w:tcPr>
-          <w:p ns2:paraId="39CD3A1E" ns2:textId="77777777">
-            <w:pPr>
-              <w:cnfStyle w:val="000000100000" w:firstRow="0" w:lastRow="0" w:firstColumn="0" w:lastColumn="0" w:oddVBand="0" w:evenVBand="0" w:oddHBand="1" w:evenHBand="0" w:firstRowFirstColumn="0" w:firstRowLastColumn="0" w:lastRowFirstColumn="0" w:lastRowLastColumn="0"/>
-              <w:rPr>
-                <w:rFonts w:asciiTheme="minorHAnsi" w:hAnsiTheme="minorHAnsi"/>
-                <w:color w:val="auto"/>
-              </w:rPr>
-            </w:pPr>
-            <w:r>
-              <w:rPr>
-                <w:rFonts w:asciiTheme="minorHAnsi" w:hAnsiTheme="minorHAnsi"/>
-                <w:color w:val="auto"/>
-              </w:rPr>
-              <w:t>Victor Agahi</w:t>
-            </w:r>
-          </w:p>
-        </w:tc>
-        <w:tc>
-          <w:tcPr>
-            <w:tcW w:w="5220" w:type="dxa"/>
-          </w:tcPr>
-          <w:p ns2:paraId="113B53D0" ns2:textId="77777777">
-            <w:pPr>
-              <w:cnfStyle w:val="000000100000" w:firstRow="0" w:lastRow="0" w:firstColumn="0" w:lastColumn="0" w:oddVBand="0" w:evenVBand="0" w:oddHBand="1" w:evenHBand="0" w:firstRowFirstColumn="0" w:firstRowLastColumn="0" w:lastRowFirstColumn="0" w:lastRowLastColumn="0"/>
-              <w:rPr>
-                <w:rFonts w:asciiTheme="minorHAnsi" w:hAnsiTheme="minorHAnsi"/>
-                <w:color w:val="auto"/>
-              </w:rPr>
-            </w:pPr>
-          </w:p>
-        </w:tc>
-      </w:tr>
-    </w:tbl>
-    <w:p ns2:paraId="3F2151BA" ns2:textId="77777777">
-      <w:pPr>
-        <w:rPr>
-          <w:sz w:val="24"/>
-          <w:szCs w:val="24"/>
-        </w:rPr>
-      </w:pPr>
-    </w:p>
-    <w:sdt>
-      <w:sdtPr>
-        <w:id w:val="888354106"/>
-        <w:docPartObj>
-          <w:docPartGallery w:val="Table of Contents"/>
-          <w:docPartUnique/>
-        </w:docPartObj>
-        <w:rPr>
-          <w:b w:val="1"/>
-          <w:bCs w:val="1"/>
-          <w:caps w:val="1"/>
-          <w:sz w:val="20"/>
-          <w:szCs w:val="20"/>
-        </w:rPr>
-      </w:sdtPr>
-      <w:sdtContent>
-        <w:p ns2:paraId="7C491B3E" ns2:textId="2EDB3BC4">
-          <w:pPr>
-            <w:pStyle w:val="mtiTableMatires"/>
-            <w:rPr>
-              <w:u w:val="single"/>
-            </w:rPr>
-          </w:pPr>
-          <w:r>
-            <w:rPr>
-              <w:u w:val="single"/>
-            </w:rPr>
-            <w:t>Table des matières</w:t>
-          </w:r>
-        </w:p>
-        <w:p ns2:paraId="35AF0FBC" ns2:textId="7B1542E3">
-          <w:pPr>
-            <w:pStyle w:val="TOC1"/>
-            <w:tabs>
-              <w:tab w:val="right" w:leader="dot" w:pos="9060"/>
-            </w:tabs>
-          </w:pPr>
-          <w:r>
-            <w:fldChar w:fldCharType="begin"/>
-          </w:r>
-          <w:r>
-            <w:instrText xml:space="preserve">TOC \o "1-3" \z \u \h</w:instrText>
-          </w:r>
-          <w:r>
-            <w:fldChar w:fldCharType="separate"/>
-          </w:r>
-          <w:r>
-            <w:fldChar w:fldCharType="begin"/>
-          </w:r>
-          <w:r>
-            <w:instrText xml:space="preserve">HYPERLINK  \l  "_Toc492890139" </w:instrText>
-          </w:r>
-          <w:r>
-            <w:fldChar w:fldCharType="separate"/>
-          </w:r>
-          <w:r>
-            <w:rPr/>
-            <w:t>Introduction</w:t>
-          </w:r>
-          <w:r>
-            <w:tab/>
-          </w:r>
-          <w:r>
-            <w:fldChar w:fldCharType="begin"/>
-          </w:r>
-          <w:r>
-            <w:instrText xml:space="preserve">PAGEREF _Toc492890139 \h</w:instrText>
-          </w:r>
-          <w:r>
-            <w:fldChar w:fldCharType="separate"/>
-          </w:r>
-          <w:r>
-            <w:rPr/>
-            <w:t>3</w:t>
-          </w:r>
-          <w:r>
-            <w:fldChar w:fldCharType="end"/>
-          </w:r>
-          <w:r>
-            <w:fldChar w:fldCharType="end"/>
-          </w:r>
-        </w:p>
-        <w:p ns2:paraId="17FB7385" ns2:textId="73EBE021">
-          <w:pPr>
-            <w:pStyle w:val="TOC2"/>
-            <w:tabs>
-              <w:tab w:val="right" w:leader="dot" w:pos="9060"/>
-            </w:tabs>
-          </w:pPr>
-          <w:r>
-            <w:fldChar w:fldCharType="begin"/>
-          </w:r>
-          <w:r>
-            <w:instrText xml:space="preserve">HYPERLINK  \l  "_Toc642419396" </w:instrText>
-          </w:r>
-          <w:r>
-            <w:fldChar w:fldCharType="separate"/>
-          </w:r>
-          <w:r>
-            <w:rPr/>
-            <w:t>Présentation du projet</w:t>
-          </w:r>
-          <w:r>
-            <w:tab/>
-          </w:r>
-          <w:r>
-            <w:fldChar w:fldCharType="begin"/>
-          </w:r>
-          <w:r>
-            <w:instrText xml:space="preserve">PAGEREF _Toc642419396 \h</w:instrText>
-          </w:r>
-          <w:r>
-            <w:fldChar w:fldCharType="separate"/>
-          </w:r>
-          <w:r>
-            <w:rPr/>
-            <w:t>3</w:t>
-          </w:r>
-          <w:r>
-            <w:fldChar w:fldCharType="end"/>
-          </w:r>
-          <w:r>
-            <w:fldChar w:fldCharType="end"/>
-          </w:r>
-        </w:p>
-        <w:p ns2:paraId="248B6F17" ns2:textId="25B16219">
-          <w:pPr>
-            <w:pStyle w:val="TOC2"/>
-            <w:tabs>
-              <w:tab w:val="right" w:leader="dot" w:pos="9060"/>
-            </w:tabs>
-          </w:pPr>
-          <w:r>
-            <w:fldChar w:fldCharType="begin"/>
-          </w:r>
-          <w:r>
-            <w:instrText xml:space="preserve">HYPERLINK  \l  "_Toc1370566732" </w:instrText>
-          </w:r>
-          <w:r>
-            <w:fldChar w:fldCharType="separate"/>
-          </w:r>
-          <w:r>
-            <w:rPr/>
-            <w:t>SPRINT &lt;TODO_BILAN&gt;</w:t>
-          </w:r>
-          <w:r>
-            <w:tab/>
-          </w:r>
-          <w:r>
-            <w:fldChar w:fldCharType="begin"/>
-          </w:r>
-          <w:r>
-            <w:instrText xml:space="preserve">PAGEREF _Toc1370566732 \h</w:instrText>
-          </w:r>
-          <w:r>
-            <w:fldChar w:fldCharType="separate"/>
-          </w:r>
-          <w:r>
-            <w:rPr/>
-            <w:t>3</w:t>
-          </w:r>
-          <w:r>
-            <w:fldChar w:fldCharType="end"/>
-          </w:r>
-          <w:r>
-            <w:fldChar w:fldCharType="end"/>
-          </w:r>
-        </w:p>
-        <w:p ns2:paraId="14317A8F" ns2:textId="54CFE3FF">
-          <w:pPr>
-            <w:pStyle w:val="TOC2"/>
-            <w:tabs>
-              <w:tab w:val="right" w:leader="dot" w:pos="9060"/>
-            </w:tabs>
-          </w:pPr>
-          <w:r>
-            <w:fldChar w:fldCharType="begin"/>
-          </w:r>
-          <w:r>
-            <w:instrText xml:space="preserve">HYPERLINK  \l  "_Toc1720588397" </w:instrText>
-          </w:r>
-          <w:r>
-            <w:fldChar w:fldCharType="separate"/>
-          </w:r>
-          <w:r>
-            <w:rPr/>
-            <w:t>VICTOR AGAHI – &lt;TODO&gt;</w:t>
-          </w:r>
-          <w:r>
-            <w:tab/>
-          </w:r>
-          <w:r>
-            <w:fldChar w:fldCharType="begin"/>
-          </w:r>
-          <w:r>
-            <w:instrText xml:space="preserve">PAGEREF _Toc1720588397 \h</w:instrText>
-          </w:r>
-          <w:r>
-            <w:fldChar w:fldCharType="separate"/>
-          </w:r>
-          <w:r>
-            <w:rPr/>
-            <w:t>3</w:t>
-          </w:r>
-          <w:r>
-            <w:fldChar w:fldCharType="end"/>
-          </w:r>
-          <w:r>
-            <w:fldChar w:fldCharType="end"/>
-          </w:r>
-        </w:p>
-        <w:p ns2:paraId="49377213" ns2:textId="11458AB4">
-          <w:pPr>
-            <w:pStyle w:val="TOC2"/>
-            <w:tabs>
-              <w:tab w:val="right" w:leader="dot" w:pos="9060"/>
-            </w:tabs>
-          </w:pPr>
-          <w:r>
-            <w:fldChar w:fldCharType="begin"/>
-          </w:r>
-          <w:r>
-            <w:instrText xml:space="preserve">HYPERLINK  \l  "_Toc513136163" </w:instrText>
-          </w:r>
-          <w:r>
-            <w:fldChar w:fldCharType="separate"/>
-          </w:r>
-          <w:r>
-            <w:rPr/>
-            <w:t>VICTOR GIROUD – &lt;TODO&gt;</w:t>
-          </w:r>
-          <w:r>
-            <w:tab/>
-          </w:r>
-          <w:r>
-            <w:fldChar w:fldCharType="begin"/>
-          </w:r>
-          <w:r>
-            <w:instrText xml:space="preserve">PAGEREF _Toc513136163 \h</w:instrText>
-          </w:r>
-          <w:r>
-            <w:fldChar w:fldCharType="separate"/>
-          </w:r>
-          <w:r>
-            <w:rPr/>
-            <w:t/>
-          </w:r>
-          <w:r>
-            <w:fldChar w:fldCharType="end"/>
-          </w:r>
-          <w:r>
-            <w:fldChar w:fldCharType="end"/>
-          </w:r>
-        </w:p>
-        <w:p ns2:paraId="6F203098" ns2:textId="484CAE70">
-          <w:pPr>
-            <w:pStyle w:val="TOC2"/>
-            <w:tabs>
-              <w:tab w:val="right" w:leader="dot" w:pos="9060"/>
-            </w:tabs>
-          </w:pPr>
-          <w:r>
-            <w:fldChar w:fldCharType="begin"/>
-          </w:r>
-          <w:r>
-            <w:instrText xml:space="preserve">HYPERLINK  \l  "_Toc1801556305" </w:instrText>
-          </w:r>
-          <w:r>
-            <w:fldChar w:fldCharType="separate"/>
-          </w:r>
-          <w:r>
-            <w:rPr/>
-            <w:t>CLÉMENT PASTEAU – &lt;TODO&gt;</w:t>
-          </w:r>
-          <w:r>
-            <w:tab/>
-          </w:r>
-          <w:r>
-            <w:fldChar w:fldCharType="begin"/>
-          </w:r>
-          <w:r>
-            <w:instrText xml:space="preserve">PAGEREF _Toc1801556305 \h</w:instrText>
-          </w:r>
-          <w:r>
-            <w:fldChar w:fldCharType="separate"/>
-          </w:r>
-          <w:r>
-            <w:rPr/>
-            <w:t/>
-          </w:r>
-          <w:r>
-            <w:fldChar w:fldCharType="end"/>
-          </w:r>
-          <w:r>
-            <w:fldChar w:fldCharType="end"/>
-          </w:r>
-        </w:p>
-        <w:p ns2:paraId="40F5346D" ns2:textId="32ED07BF">
-          <w:pPr>
-            <w:pStyle w:val="TOC2"/>
-            <w:tabs>
-              <w:tab w:val="right" w:leader="dot" w:pos="9060"/>
-            </w:tabs>
-          </w:pPr>
-          <w:r>
-            <w:fldChar w:fldCharType="begin"/>
-          </w:r>
-          <w:r>
-            <w:instrText xml:space="preserve">HYPERLINK  \l  "_Toc1916894323" </w:instrText>
-          </w:r>
-          <w:r>
-            <w:fldChar w:fldCharType="separate"/>
-          </w:r>
-          <w:r>
-            <w:rPr/>
-            <w:t>SPRINT &lt;TODO_PROJ&gt;</w:t>
-          </w:r>
-          <w:r>
-            <w:tab/>
-          </w:r>
-          <w:r>
-            <w:fldChar w:fldCharType="begin"/>
-          </w:r>
-          <w:r>
-            <w:instrText xml:space="preserve">PAGEREF _Toc1916894323 \h</w:instrText>
-          </w:r>
-          <w:r>
-            <w:fldChar w:fldCharType="separate"/>
-          </w:r>
-          <w:r>
-            <w:rPr/>
-            <w:t>3</w:t>
-          </w:r>
-          <w:r>
-            <w:fldChar w:fldCharType="end"/>
-          </w:r>
-          <w:r>
-            <w:fldChar w:fldCharType="end"/>
-          </w:r>
-        </w:p>
-        <w:p ns2:paraId="19E90128" ns2:textId="2F314A18">
-          <w:pPr>
-            <w:pStyle w:val="TOC1"/>
-            <w:tabs>
-              <w:tab w:val="right" w:leader="dot" w:pos="9060"/>
-            </w:tabs>
-          </w:pPr>
-          <w:r>
-            <w:fldChar w:fldCharType="begin"/>
-          </w:r>
-          <w:r>
-            <w:instrText xml:space="preserve">HYPERLINK  \l  "_Toc1731799357" </w:instrText>
-          </w:r>
-          <w:r>
-            <w:fldChar w:fldCharType="separate"/>
-          </w:r>
-          <w:r>
-            <w:rPr/>
-            <w:t>Découpage des actions</w:t>
-          </w:r>
-          <w:r>
-            <w:tab/>
-          </w:r>
-          <w:r>
-            <w:fldChar w:fldCharType="begin"/>
-          </w:r>
-          <w:r>
-            <w:instrText xml:space="preserve">PAGEREF _Toc1731799357 \h</w:instrText>
-          </w:r>
-          <w:r>
-            <w:fldChar w:fldCharType="separate"/>
-          </w:r>
-          <w:r>
-            <w:rPr/>
-            <w:t>3</w:t>
-          </w:r>
-          <w:r>
-            <w:fldChar w:fldCharType="end"/>
-          </w:r>
-          <w:r>
-            <w:fldChar w:fldCharType="end"/>
-          </w:r>
-        </w:p>
-        <w:p ns2:paraId="56A1927D" ns2:textId="04B3371C">
-          <w:pPr>
-            <w:pStyle w:val="TOC3"/>
-            <w:tabs>
-              <w:tab w:val="right" w:leader="dot" w:pos="9060"/>
-            </w:tabs>
-          </w:pPr>
-          <w:r>
-            <w:fldChar w:fldCharType="begin"/>
-          </w:r>
-          <w:r>
-            <w:instrText xml:space="preserve">HYPERLINK  \l  "_Toc714619430" </w:instrText>
-          </w:r>
-          <w:r>
-            <w:fldChar w:fldCharType="separate"/>
-          </w:r>
-          <w:r>
-            <w:rPr/>
-            <w:t>Répartition des Tâches</w:t>
-          </w:r>
-          <w:r>
-            <w:tab/>
-          </w:r>
-          <w:r>
-            <w:fldChar w:fldCharType="begin"/>
-          </w:r>
-          <w:r>
-            <w:instrText xml:space="preserve">PAGEREF _Toc714619430 \h</w:instrText>
-          </w:r>
-          <w:r>
-            <w:fldChar w:fldCharType="separate"/>
-          </w:r>
-          <w:r>
-            <w:rPr/>
-            <w:t>3</w:t>
-          </w:r>
-          <w:r>
-            <w:fldChar w:fldCharType="end"/>
-          </w:r>
-          <w:r>
-            <w:fldChar w:fldCharType="end"/>
-          </w:r>
-        </w:p>
-        <w:p ns2:paraId="0F7DAB51" ns2:textId="2C01C471">
-          <w:pPr>
-            <w:pStyle w:val="TOC2"/>
-            <w:tabs>
-              <w:tab w:val="right" w:leader="dot" w:pos="9060"/>
-            </w:tabs>
-          </w:pPr>
-          <w:r>
-            <w:fldChar w:fldCharType="begin"/>
-          </w:r>
-          <w:r>
-            <w:instrText xml:space="preserve">HYPERLINK  \l  "_Toc161572873" </w:instrText>
-          </w:r>
-          <w:r>
-            <w:fldChar w:fldCharType="separate"/>
-          </w:r>
-          <w:r>
-            <w:rPr/>
-            <w:t>Diagrammes de Gantt</w:t>
-          </w:r>
-          <w:r>
-            <w:tab/>
-          </w:r>
-          <w:r>
-            <w:fldChar w:fldCharType="begin"/>
-          </w:r>
-          <w:r>
-            <w:instrText xml:space="preserve">PAGEREF _Toc161572873 \h</w:instrText>
-          </w:r>
-          <w:r>
-            <w:fldChar w:fldCharType="separate"/>
-          </w:r>
-          <w:r>
-            <w:rPr/>
-            <w:t>4</w:t>
-          </w:r>
-          <w:r>
-            <w:fldChar w:fldCharType="end"/>
-          </w:r>
-          <w:r>
-            <w:fldChar w:fldCharType="end"/>
-          </w:r>
-        </w:p>
-        <w:p ns2:paraId="6321F719" ns2:textId="080482AF">
-          <w:pPr>
-            <w:pStyle w:val="TOC3"/>
-            <w:tabs>
-              <w:tab w:val="right" w:leader="dot" w:pos="9060"/>
-            </w:tabs>
-          </w:pPr>
-          <w:r>
-            <w:fldChar w:fldCharType="begin"/>
-          </w:r>
-          <w:r>
-            <w:instrText xml:space="preserve">HYPERLINK  \l  "_Toc327060629" </w:instrText>
-          </w:r>
-          <w:r>
-            <w:fldChar w:fldCharType="separate"/>
-          </w:r>
-          <w:r>
-            <w:rPr/>
-            <w:t>Victor Giroud : &lt;TODO&gt;</w:t>
-          </w:r>
-          <w:r>
-            <w:tab/>
-          </w:r>
-          <w:r>
-            <w:fldChar w:fldCharType="begin"/>
-          </w:r>
-          <w:r>
-            <w:instrText xml:space="preserve">PAGEREF _Toc327060629 \h</w:instrText>
-          </w:r>
-          <w:r>
-            <w:fldChar w:fldCharType="separate"/>
-          </w:r>
-          <w:r>
-            <w:rPr/>
-            <w:t/>
-          </w:r>
-          <w:r>
-            <w:fldChar w:fldCharType="end"/>
-          </w:r>
-          <w:r>
-            <w:fldChar w:fldCharType="end"/>
-          </w:r>
-        </w:p>
-        <w:p ns2:paraId="29116E86" ns2:textId="3DC6E61B">
-          <w:pPr>
-            <w:pStyle w:val="TOC3"/>
-            <w:tabs>
-              <w:tab w:val="right" w:leader="dot" w:pos="9060"/>
-            </w:tabs>
-          </w:pPr>
-          <w:r>
-            <w:fldChar w:fldCharType="begin"/>
-          </w:r>
-          <w:r>
-            <w:instrText xml:space="preserve">HYPERLINK  \l  "_Toc1225943338" </w:instrText>
-          </w:r>
-          <w:r>
-            <w:fldChar w:fldCharType="separate"/>
-          </w:r>
-          <w:r>
-            <w:rPr/>
-            <w:t>Victor Agahi : &lt;TODO&gt;</w:t>
-          </w:r>
-          <w:r>
-            <w:tab/>
-          </w:r>
-          <w:r>
-            <w:fldChar w:fldCharType="begin"/>
-          </w:r>
-          <w:r>
-            <w:instrText xml:space="preserve">PAGEREF _Toc1225943338 \h</w:instrText>
-          </w:r>
-          <w:r>
-            <w:fldChar w:fldCharType="separate"/>
-          </w:r>
-          <w:r>
-            <w:rPr/>
-            <w:t>4</w:t>
-          </w:r>
-          <w:r>
-            <w:fldChar w:fldCharType="end"/>
-          </w:r>
-          <w:r>
-            <w:fldChar w:fldCharType="end"/>
-          </w:r>
-        </w:p>
-        <w:p ns2:paraId="1DC87B19" ns2:textId="200D84F2">
-          <w:pPr>
-            <w:pStyle w:val="TOC3"/>
-            <w:tabs>
-              <w:tab w:val="right" w:leader="dot" w:pos="9060"/>
-            </w:tabs>
-          </w:pPr>
-          <w:r>
-            <w:fldChar w:fldCharType="begin"/>
-          </w:r>
-          <w:r>
-            <w:instrText xml:space="preserve">HYPERLINK  \l  "_Toc970960254" </w:instrText>
-          </w:r>
-          <w:r>
-            <w:fldChar w:fldCharType="separate"/>
-          </w:r>
-          <w:r>
-            <w:rPr/>
-            <w:t>Clément PASTEAU : &lt;TODO&gt;</w:t>
-          </w:r>
-          <w:r>
-            <w:tab/>
-          </w:r>
-          <w:r>
-            <w:fldChar w:fldCharType="begin"/>
-          </w:r>
-          <w:r>
-            <w:instrText xml:space="preserve">PAGEREF _Toc970960254 \h</w:instrText>
-          </w:r>
-          <w:r>
-            <w:fldChar w:fldCharType="separate"/>
-          </w:r>
-          <w:r>
-            <w:rPr/>
-            <w:t>4</w:t>
-          </w:r>
-          <w:r>
-            <w:fldChar w:fldCharType="end"/>
-          </w:r>
-          <w:r>
-            <w:fldChar w:fldCharType="end"/>
-          </w:r>
-        </w:p>
-        <w:p ns2:paraId="7ED6C17B" ns2:textId="0EC51CE3">
-          <w:pPr>
-            <w:pStyle w:val="TOC1"/>
-            <w:tabs>
-              <w:tab w:val="right" w:leader="dot" w:pos="9060"/>
-            </w:tabs>
-          </w:pPr>
-          <w:r>
-            <w:fldChar w:fldCharType="begin"/>
-          </w:r>
-          <w:r>
-            <w:instrText xml:space="preserve">HYPERLINK  \l  "_Toc1517376593" </w:instrText>
-          </w:r>
-          <w:r>
-            <w:fldChar w:fldCharType="separate"/>
-          </w:r>
-          <w:r>
-            <w:rPr/>
-            <w:t>Conclusion</w:t>
-          </w:r>
-          <w:r>
-            <w:tab/>
-          </w:r>
-          <w:r>
-            <w:fldChar w:fldCharType="begin"/>
-          </w:r>
-          <w:r>
-            <w:instrText xml:space="preserve">PAGEREF _Toc1517376593 \h</w:instrText>
-          </w:r>
-          <w:r>
-            <w:fldChar w:fldCharType="separate"/>
-          </w:r>
-          <w:r>
-            <w:rPr/>
-            <w:t>4</w:t>
-          </w:r>
-          <w:r>
-            <w:fldChar w:fldCharType="end"/>
-          </w:r>
-          <w:r>
-            <w:fldChar w:fldCharType="end"/>
-          </w:r>
-        </w:p>
-        <w:p ns2:paraId="049D750E" ns2:textId="64C86E5C">
-          <w:pPr>
-            <w:pStyle w:val="TOC1"/>
-            <w:tabs>
-              <w:tab w:val="right" w:leader="dot" w:pos="9060"/>
-            </w:tabs>
-            <w:rPr>
-              <w:rStyle w:val="Hyperlink"/>
-            </w:rPr>
-          </w:pPr>
-          <w:r>
-            <w:fldChar w:fldCharType="end"/>
-          </w:r>
-        </w:p>
-      </w:sdtContent>
-      <w:sdtEndPr>
-        <w:rPr>
-          <w:b w:val="1"/>
-          <w:bCs w:val="1"/>
-          <w:caps w:val="1"/>
-          <w:sz w:val="20"/>
-          <w:szCs w:val="20"/>
-        </w:rPr>
-      </w:sdtEndPr>
-    </w:sdt>
-    <w:p ns2:paraId="0B855886" ns2:textId="77777777"/>
-    <w:p ns2:paraId="15A1B871" ns2:textId="77777777">
-      <w:pPr>
-        <w:pStyle w:val="Heading1"/>
-        <w:spacing w:before="120"/>
-      </w:pPr>
-      <w:bookmarkStart w:name="_Toc492890139" w:id="1884994374"/>
-      <w:r>
-        <w:rPr/>
-        <w:t>Introduction</w:t>
-      </w:r>
-      <w:bookmarkEnd w:id="1884994374"/>
-    </w:p>
-    <w:p ns2:paraId="782D7D85" ns2:textId="21152B88">
-      <w:pPr>
-        <w:pStyle w:val="Heading2"/>
-      </w:pPr>
-      <w:bookmarkStart w:name="_Toc642419396" w:id="388523969"/>
-      <w:r>
-        <w:rPr/>
-        <w:t>Présentation du projet</w:t>
-      </w:r>
-      <w:bookmarkEnd w:id="388523969"/>
-    </w:p>
-    <w:p ns2:paraId="6186B591" ns2:textId="546F992A">
-      <w:pPr>
-        <w:pStyle w:val="mtitexte"/>
-        <w:jc w:val="both"/>
-        <w:rPr>
-          <w:sz w:val="20"/>
-          <w:lang w:val="fr-FR"/>
-        </w:rPr>
-      </w:pPr>
-      <w:r>
-        <w:rPr>
-          <w:sz w:val="20"/>
-          <w:lang w:val="fr-FR"/>
-        </w:rPr>
-        <w:t>Nous développons une application mobile qui permet de créer et rejoindre facilement des événements écologiques ou solidaires, comme des collectes de déchets ou alimentaires. Les utilisateurs peuvent découvrir les événements via un fil d’actualité, swiper pour s’inscrire, créer leurs propres initiatives, et partager leurs actions sur leur profil. Une carte interactive permet aussi de repérer les événements importants autour de soi. Enfin, un système de badges récompense l’engagement des participants et valorise leurs actions positives.</w:t>
-      </w:r>
-    </w:p>
-    <w:p ns2:paraId="317C53E3" ns2:textId="28D1CF17">
-      <w:pPr>
-        <w:pStyle w:val="Heading2"/>
-        <w:spacing w:before="240" w:after="240"/>
-      </w:pPr>
-      <w:r>
-        <w:rPr/>
-        <w:t>SPRINT &lt;TODO_BILAN&gt;</w:t>
-      </w:r>
-    </w:p>
-    <w:p ns2:paraId="62EA5D1E" ns2:textId="17D8A2D3">
-      <w:pPr>
-        <w:pStyle w:val="Normal"/>
-        <w:spacing w:before="240" w:beforeAutospacing="off" w:after="240" w:afterAutospacing="off"/>
-      </w:pPr>
-      <w:r>
-        <w:rPr>
-          <w:rFonts w:ascii="Calibri" w:hAnsi="Calibri" w:eastAsia="Calibri" w:cs="Calibri"/>
-          <w:b w:val="1"/>
-          <w:bCs w:val="1"/>
-          <w:noProof w:val="0"/>
-          <w:sz w:val="20"/>
-          <w:szCs w:val="20"/>
-          <w:lang w:val="fr-FR"/>
-        </w:rPr>
-        <w:t>[TODO] Synthèse globale de l'avancement et des objectifs atteints lors du Sprint &lt;TODO_BILAN&gt; (périmètre backend, frontend, infrastructure et coordination).</w:t>
-      </w:r>
-    </w:p>
-    <w:p ns2:paraId="5CFDEA38" ns2:textId="47F467EF">
-      <w:pPr>
-        <w:spacing w:before="240" w:beforeAutospacing="off" w:after="240" w:afterAutospacing="off"/>
-      </w:pPr>
-      <w:r>
-        <w:rPr>
-          <w:rFonts w:ascii="Calibri" w:hAnsi="Calibri" w:eastAsia="Calibri" w:cs="Calibri"/>
-          <w:b w:val="1"/>
-          <w:bCs w:val="1"/>
-          <w:noProof w:val="0"/>
-          <w:sz w:val="20"/>
-          <w:szCs w:val="20"/>
-          <w:lang w:val="fr-FR"/>
-        </w:rPr>
-        <w:t/>
-      </w:r>
-    </w:p>
-    <w:p ns2:paraId="0BE60BFA" ns2:textId="39A20485">
-      <w:pPr>
-        <w:pStyle w:val="Normal"/>
-      </w:pPr>
-    </w:p>
-    <w:p ns2:paraId="432C17EE" ns2:textId="0E47755D">
-      <w:pPr>
-        <w:pStyle w:val="Heading2"/>
-        <w:spacing w:before="240" w:beforeAutospacing="off" w:after="240" w:afterAutospacing="off" w:line="276" w:lineRule="auto"/>
-        <w:jc w:val="left"/>
-        <w:rPr>
-          <w:rFonts w:ascii="Calibri" w:hAnsi="Calibri" w:eastAsia="Calibri" w:cs="Calibri"/>
-          <w:noProof w:val="0"/>
-          <w:sz w:val="20"/>
-          <w:szCs w:val="20"/>
-          <w:lang w:val="fr-FR"/>
-        </w:rPr>
-      </w:pPr>
-      <w:r>
-        <w:rPr>
-          <w:rFonts w:ascii="Calibri" w:hAnsi="Calibri" w:eastAsia="Calibri" w:cs="Calibri"/>
-          <w:noProof w:val="0"/>
-          <w:sz w:val="20"/>
-          <w:szCs w:val="20"/>
-          <w:lang w:val="fr-FR"/>
-        </w:rPr>
-        <w:t>VICTOR AGAHI – &lt;TODO&gt;</w:t>
-      </w:r>
-    </w:p>
-    <w:p ns2:paraId="0B668E96" ns2:textId="5E9D4487">
-      <w:pPr>
-        <w:bidi w:val="0"/>
-        <w:spacing w:before="240" w:beforeAutospacing="off" w:after="240" w:afterAutospacing="off"/>
-        <w:jc w:val="left"/>
-      </w:pPr>
-      <w:r>
-        <w:rPr>
-          <w:rFonts w:ascii="Calibri" w:hAnsi="Calibri" w:eastAsia="Calibri" w:cs="Calibri"/>
-          <w:b w:val="1"/>
-          <w:bCs w:val="1"/>
-          <w:noProof w:val="0"/>
-          <w:sz w:val="20"/>
-          <w:szCs w:val="20"/>
-          <w:lang w:val="fr-FR"/>
-        </w:rPr>
-        <w:t>[TODO] Synthèse détaillée des réalisations techniques de Victor Agahi pour le Sprint &lt;TODO_BILAN&gt; (architecture, microservices, DevOps, Kubernetes, observabilité, etc.).</w:t>
-      </w:r>
-    </w:p>
-    <w:p ns2:paraId="4C52C2C0" ns2:textId="3F61E397">
-      <w:pPr>
-        <w:pStyle w:val="ListParagraph"/>
-        <w:numPr>
-          <w:ilvl w:val="0"/>
-          <w:numId w:val="45"/>
-        </w:numPr>
-        <w:bidi w:val="0"/>
-        <w:spacing w:before="240" w:beforeAutospacing="off" w:after="240" w:afterAutospacing="off"/>
-        <w:jc w:val="left"/>
-        <w:rPr>
-          <w:rFonts w:ascii="Calibri" w:hAnsi="Calibri" w:eastAsia="Calibri" w:cs="Calibri"/>
-          <w:noProof w:val="0"/>
-          <w:sz w:val="20"/>
-          <w:szCs w:val="20"/>
-          <w:lang w:val="fr-FR"/>
-        </w:rPr>
-      </w:pPr>
-      <w:r>
-        <w:rPr>
-          <w:rFonts w:ascii="Calibri" w:hAnsi="Calibri" w:eastAsia="Calibri" w:cs="Calibri"/>
-          <w:noProof w:val="0"/>
-          <w:sz w:val="20"/>
-          <w:szCs w:val="20"/>
-          <w:lang w:val="fr-FR"/>
-        </w:rPr>
-        <w:t>[TODO] Réalisation clé 1 (ex: déploiement d'infrastructure, intégration réseau)</w:t>
-      </w:r>
-    </w:p>
-    <w:p ns2:paraId="7B7BE88E" ns2:textId="0F7AC84C">
-      <w:pPr>
-        <w:pStyle w:val="ListParagraph"/>
-        <w:bidi w:val="0"/>
-        <w:spacing w:before="240" w:beforeAutospacing="off" w:after="240" w:afterAutospacing="off"/>
-        <w:ind w:left="720"/>
-        <w:jc w:val="left"/>
-      </w:pPr>
-      <w:r>
-        <w:drawing>
-          <ns3:inline ns4:editId="5F9A837A" ns4:anchorId="3FA3EFAF">
-            <ns3:extent cx="1999343" cy="1765886"/>
-            <ns3:effectExtent l="0" t="0" r="0" b="0"/>
-            <ns3:docPr id="2086511976" name="drawing"/>
-            <ns3:cNvGraphicFramePr>
-              <a:graphicFrameLocks noChangeAspect="1"/>
-            </ns3:cNvGraphicFramePr>
-            <a:graphic>
-              <a:graphicData uri="http://schemas.openxmlformats.org/drawingml/2006/picture">
-                <ns7:pic>
-                  <ns7:nvPicPr>
-                    <ns7:cNvPr id="2086511976" name="Picture 2086511976"/>
-                    <ns7:cNvPicPr/>
-                  </ns7:nvPicPr>
-                  <ns7:blipFill>
-                    <a:blip r:embed="rId1464873947">
-                      <a:extLst>
-                        <a:ext uri="{28A0092B-C50C-407E-A947-70E740481C1C}">
-                          <ns9:useLocalDpi/>
-                        </a:ext>
-                      </a:extLst>
-                    </a:blip>
-                    <a:stretch>
-                      <a:fillRect/>
-                    </a:stretch>
-                  </ns7:blipFill>
-                  <ns7:spPr>
-                    <a:xfrm rot="0">
-                      <a:off x="0" y="0"/>
-                      <a:ext cx="1999343" cy="1765886"/>
-                    </a:xfrm>
-                    <a:prstGeom prst="rect">
-                      <a:avLst/>
-                    </a:prstGeom>
-                  </ns7:spPr>
-                </ns7:pic>
-              </a:graphicData>
-            </a:graphic>
-          </ns3:inline>
-        </w:drawing>
-      </w:r>
-    </w:p>
-    <w:p ns2:paraId="0C2E1ED4" ns2:textId="4D126B8C">
-      <w:pPr>
-        <w:pStyle w:val="ListParagraph"/>
-        <w:numPr>
-          <w:ilvl w:val="0"/>
-          <w:numId w:val="45"/>
-        </w:numPr>
-        <w:bidi w:val="0"/>
-        <w:spacing w:before="240" w:beforeAutospacing="off" w:after="240" w:afterAutospacing="off"/>
-        <w:jc w:val="left"/>
-        <w:rPr>
-          <w:rFonts w:ascii="Calibri" w:hAnsi="Calibri" w:eastAsia="Calibri" w:cs="Calibri"/>
-          <w:noProof w:val="0"/>
-          <w:sz w:val="20"/>
-          <w:szCs w:val="20"/>
-          <w:lang w:val="fr-FR"/>
-        </w:rPr>
-      </w:pPr>
-      <w:r>
-        <w:rPr>
-          <w:rFonts w:ascii="Calibri" w:hAnsi="Calibri" w:eastAsia="Calibri" w:cs="Calibri"/>
-          <w:noProof w:val="0"/>
-          <w:sz w:val="20"/>
-          <w:szCs w:val="20"/>
-          <w:lang w:val="fr-FR"/>
-        </w:rPr>
-        <w:t>[TODO] Réalisation clé 2 (ex: configuration de services, métriques)</w:t>
-      </w:r>
-    </w:p>
-    <w:p ns2:paraId="21FA0405" ns2:textId="4816DC68">
-      <w:pPr>
-        <w:pStyle w:val="ListParagraph"/>
-        <w:numPr>
-          <w:ilvl w:val="0"/>
-          <w:numId w:val="45"/>
-        </w:numPr>
-        <w:bidi w:val="0"/>
-        <w:spacing w:before="240" w:beforeAutospacing="off" w:after="240" w:afterAutospacing="off"/>
-        <w:jc w:val="left"/>
-        <w:rPr>
-          <w:rFonts w:ascii="Calibri" w:hAnsi="Calibri" w:eastAsia="Calibri" w:cs="Calibri"/>
-          <w:noProof w:val="0"/>
-          <w:sz w:val="20"/>
-          <w:szCs w:val="20"/>
-          <w:lang w:val="fr-FR"/>
-        </w:rPr>
-      </w:pPr>
-      <w:r>
-        <w:rPr>
-          <w:rFonts w:ascii="Calibri" w:hAnsi="Calibri" w:eastAsia="Calibri" w:cs="Calibri"/>
-          <w:b w:val="1"/>
-          <w:bCs w:val="1"/>
-          <w:noProof w:val="0"/>
-          <w:sz w:val="20"/>
-          <w:szCs w:val="20"/>
-          <w:lang w:val="fr-FR"/>
-        </w:rPr>
-        <w:t>[TODO] Objectif atteint pour le Sprint &lt;TODO_BILAN&gt;</w:t>
-      </w:r>
-    </w:p>
-    <w:p ns2:paraId="44B030D0" ns2:textId="226AB1FA">
-      <w:pPr>
-        <w:pStyle w:val="Normal"/>
-        <w:bidi w:val="0"/>
-        <w:spacing w:before="240" w:beforeAutospacing="off" w:after="240" w:afterAutospacing="off"/>
-        <w:ind w:left="0"/>
-        <w:jc w:val="left"/>
-      </w:pPr>
-      <w:r>
-        <w:drawing>
-          <ns3:inline ns4:editId="3146D787" ns4:anchorId="6F98E2A7">
-            <ns3:extent cx="5762625" cy="3238500"/>
-            <ns3:effectExtent l="0" t="0" r="0" b="0"/>
-            <ns3:docPr id="177438074" name="drawing"/>
-            <ns3:cNvGraphicFramePr>
-              <a:graphicFrameLocks noChangeAspect="1"/>
-            </ns3:cNvGraphicFramePr>
-            <a:graphic>
-              <a:graphicData uri="http://schemas.openxmlformats.org/drawingml/2006/picture">
-                <ns7:pic>
-                  <ns7:nvPicPr>
-                    <ns7:cNvPr id="177438074" name="Picture 177438074"/>
-                    <ns7:cNvPicPr/>
-                  </ns7:nvPicPr>
-                  <ns7:blipFill>
-                    <a:blip r:embed="rId1163908134">
-                      <a:extLst>
-                        <a:ext uri="{28A0092B-C50C-407E-A947-70E740481C1C}">
-                          <ns9:useLocalDpi/>
-                        </a:ext>
-                      </a:extLst>
-                    </a:blip>
-                    <a:stretch>
-                      <a:fillRect/>
-                    </a:stretch>
-                  </ns7:blipFill>
-                  <ns7:spPr>
-                    <a:xfrm>
-                      <a:off x="0" y="0"/>
-                      <a:ext cx="5762625" cy="3238500"/>
-                    </a:xfrm>
-                    <a:prstGeom prst="rect">
-                      <a:avLst/>
-                    </a:prstGeom>
-                  </ns7:spPr>
-                </ns7:pic>
-              </a:graphicData>
-            </a:graphic>
-          </ns3:inline>
-        </w:drawing>
-      </w:r>
-    </w:p>
-    <w:p ns2:paraId="13B6FBAE" ns2:textId="5FA577D9">
-      <w:pPr>
-        <w:pStyle w:val="Normal"/>
-        <w:bidi w:val="0"/>
-        <w:spacing w:before="240" w:beforeAutospacing="off" w:after="240" w:afterAutospacing="off"/>
-        <w:jc w:val="left"/>
-        <w:rPr>
-          <w:rFonts w:ascii="Calibri" w:hAnsi="Calibri" w:eastAsia="Calibri" w:cs="Calibri"/>
-          <w:noProof w:val="0"/>
-          <w:sz w:val="20"/>
-          <w:szCs w:val="20"/>
-          <w:lang w:val="fr-FR"/>
-        </w:rPr>
-      </w:pPr>
-    </w:p>
-    <w:p ns2:paraId="7D5985E2" ns2:textId="1513B7B9">
-      <w:pPr>
-        <w:bidi w:val="0"/>
-        <w:spacing w:before="240" w:beforeAutospacing="off" w:after="240" w:afterAutospacing="off"/>
-        <w:jc w:val="left"/>
-      </w:pPr>
-      <w:r>
-        <w:rPr>
-          <w:rFonts w:ascii="Calibri" w:hAnsi="Calibri" w:eastAsia="Calibri" w:cs="Calibri"/>
-          <w:b w:val="1"/>
-          <w:bCs w:val="1"/>
-          <w:noProof w:val="0"/>
-          <w:sz w:val="20"/>
-          <w:szCs w:val="20"/>
-          <w:lang w:val="fr-FR"/>
-        </w:rPr>
-        <w:t/>
-      </w:r>
-    </w:p>
-    <w:p ns2:paraId="5D45FDEA" ns2:textId="04C7F9DC">
-      <w:pPr>
-        <w:pStyle w:val="ListParagraph"/>
-        <w:numPr>
-          <w:ilvl w:val="0"/>
-          <w:numId w:val="46"/>
-        </w:numPr>
-        <w:bidi w:val="0"/>
-        <w:spacing w:before="240" w:beforeAutospacing="off" w:after="240" w:afterAutospacing="off"/>
-        <w:jc w:val="left"/>
-        <w:rPr>
-          <w:rFonts w:ascii="Calibri" w:hAnsi="Calibri" w:eastAsia="Calibri" w:cs="Calibri"/>
-          <w:noProof w:val="0"/>
-          <w:sz w:val="20"/>
-          <w:szCs w:val="20"/>
-          <w:lang w:val="fr-FR"/>
-        </w:rPr>
-      </w:pPr>
-      <w:r>
-        <w:rPr>
-          <w:rFonts w:ascii="Calibri" w:hAnsi="Calibri" w:eastAsia="Calibri" w:cs="Calibri"/>
-          <w:noProof w:val="0"/>
-          <w:sz w:val="20"/>
-          <w:szCs w:val="20"/>
-          <w:lang w:val="fr-FR"/>
-        </w:rPr>
-        <w:t/>
-      </w:r>
-    </w:p>
-    <w:p ns2:paraId="418D44D9" ns2:textId="0ED83893">
-      <w:pPr>
-        <w:pStyle w:val="ListParagraph"/>
-        <w:numPr>
-          <w:ilvl w:val="0"/>
-          <w:numId w:val="46"/>
-        </w:numPr>
-        <w:bidi w:val="0"/>
-        <w:spacing w:before="240" w:beforeAutospacing="off" w:after="240" w:afterAutospacing="off"/>
-        <w:jc w:val="left"/>
-        <w:rPr>
-          <w:rFonts w:ascii="Calibri" w:hAnsi="Calibri" w:eastAsia="Calibri" w:cs="Calibri"/>
-          <w:noProof w:val="0"/>
-          <w:sz w:val="20"/>
-          <w:szCs w:val="20"/>
-          <w:lang w:val="fr-FR"/>
-        </w:rPr>
-      </w:pPr>
-      <w:r>
-        <w:rPr>
-          <w:rFonts w:ascii="Calibri" w:hAnsi="Calibri" w:eastAsia="Calibri" w:cs="Calibri"/>
-          <w:noProof w:val="0"/>
-          <w:sz w:val="20"/>
-          <w:szCs w:val="20"/>
-          <w:lang w:val="fr-FR"/>
-        </w:rPr>
-        <w:t/>
-      </w:r>
-    </w:p>
-    <w:p ns2:paraId="2666C3B5" ns2:textId="546BB715">
-      <w:pPr>
-        <w:pStyle w:val="ListParagraph"/>
-        <w:numPr>
-          <w:ilvl w:val="0"/>
-          <w:numId w:val="46"/>
-        </w:numPr>
-        <w:bidi w:val="0"/>
-        <w:spacing w:before="240" w:beforeAutospacing="off" w:after="240" w:afterAutospacing="off"/>
-        <w:jc w:val="left"/>
-        <w:rPr>
-          <w:rFonts w:ascii="Calibri" w:hAnsi="Calibri" w:eastAsia="Calibri" w:cs="Calibri"/>
-          <w:noProof w:val="0"/>
-          <w:sz w:val="20"/>
-          <w:szCs w:val="20"/>
-          <w:lang w:val="fr-FR"/>
-        </w:rPr>
-      </w:pPr>
-      <w:r>
-        <w:rPr>
-          <w:rFonts w:ascii="Calibri" w:hAnsi="Calibri" w:eastAsia="Calibri" w:cs="Calibri"/>
-          <w:noProof w:val="0"/>
-          <w:sz w:val="20"/>
-          <w:szCs w:val="20"/>
-          <w:lang w:val="fr-FR"/>
-        </w:rPr>
-        <w:t/>
-      </w:r>
-    </w:p>
-    <w:p ns2:paraId="71CCB2FC" ns2:textId="156FE454">
-      <w:pPr>
-        <w:pStyle w:val="ListParagraph"/>
-        <w:numPr>
-          <w:ilvl w:val="0"/>
-          <w:numId w:val="46"/>
-        </w:numPr>
-        <w:bidi w:val="0"/>
-        <w:spacing w:before="240" w:beforeAutospacing="off" w:after="240" w:afterAutospacing="off"/>
-        <w:jc w:val="left"/>
-        <w:rPr>
-          <w:rFonts w:ascii="Calibri" w:hAnsi="Calibri" w:eastAsia="Calibri" w:cs="Calibri"/>
-          <w:noProof w:val="0"/>
-          <w:sz w:val="20"/>
-          <w:szCs w:val="20"/>
-          <w:lang w:val="fr-FR"/>
-        </w:rPr>
-      </w:pPr>
-      <w:r>
-        <w:rPr>
-          <w:rFonts w:ascii="Calibri" w:hAnsi="Calibri" w:eastAsia="Calibri" w:cs="Calibri"/>
-          <w:noProof w:val="0"/>
-          <w:sz w:val="20"/>
-          <w:szCs w:val="20"/>
-          <w:lang w:val="fr-FR"/>
-        </w:rPr>
-        <w:t/>
-      </w:r>
-    </w:p>
-    <w:p ns2:paraId="22448DDB" ns2:textId="0BD2F8B3">
-      <w:pPr>
-        <w:pStyle w:val="Normal"/>
-        <w:bidi w:val="0"/>
-        <w:spacing w:before="240" w:beforeAutospacing="off" w:after="240" w:afterAutospacing="off"/>
-        <w:ind w:left="0"/>
-        <w:jc w:val="left"/>
-      </w:pPr>
-      <w:r>
-        <w:drawing>
-          <ns3:inline ns4:editId="376FBB0E" ns4:anchorId="721854A2">
-            <ns3:extent cx="3081588" cy="3433445"/>
-            <ns3:effectExtent l="0" t="0" r="0" b="0"/>
-            <ns3:docPr id="814352251" name="drawing"/>
-            <ns3:cNvGraphicFramePr>
-              <a:graphicFrameLocks noChangeAspect="1"/>
-            </ns3:cNvGraphicFramePr>
-            <a:graphic>
-              <a:graphicData uri="http://schemas.openxmlformats.org/drawingml/2006/picture">
-                <ns7:pic>
-                  <ns7:nvPicPr>
-                    <ns7:cNvPr id="814352251" name="Picture 814352251"/>
-                    <ns7:cNvPicPr/>
-                  </ns7:nvPicPr>
-                  <ns7:blipFill>
-                    <a:blip r:embed="rId445383741">
-                      <a:extLst>
-                        <a:ext uri="{28A0092B-C50C-407E-A947-70E740481C1C}">
-                          <ns9:useLocalDpi/>
-                        </a:ext>
-                      </a:extLst>
-                    </a:blip>
-                    <a:stretch>
-                      <a:fillRect/>
-                    </a:stretch>
-                  </ns7:blipFill>
-                  <ns7:spPr>
-                    <a:xfrm rot="0">
-                      <a:off x="0" y="0"/>
-                      <a:ext cx="3081588" cy="3433445"/>
-                    </a:xfrm>
-                    <a:prstGeom prst="rect">
-                      <a:avLst/>
-                    </a:prstGeom>
-                  </ns7:spPr>
-                </ns7:pic>
-              </a:graphicData>
-            </a:graphic>
-          </ns3:inline>
-        </w:drawing>
-      </w:r>
-    </w:p>
-    <w:p ns2:paraId="7C07B1F1" ns2:textId="135F342D">
-      <w:pPr>
-        <w:pStyle w:val="Normal"/>
-        <w:suppressLineNumbers w:val="0"/>
-        <w:bidi w:val="0"/>
-        <w:spacing w:before="240" w:beforeAutospacing="off" w:after="240" w:afterAutospacing="off" w:line="276" w:lineRule="auto"/>
-        <w:ind w:left="0" w:right="0"/>
-        <w:jc w:val="left"/>
-        <w:rPr>
-          <w:sz w:val="20"/>
-          <w:szCs w:val="20"/>
-        </w:rPr>
-      </w:pPr>
-    </w:p>
-    <w:p ns2:paraId="212E5DBA" ns2:textId="4B1224EC">
-      <w:r>
-        <w:br w:type="page"/>
-      </w:r>
-    </w:p>
-    <w:p ns2:paraId="7C945F16" ns2:textId="2673EC62">
-      <w:pPr>
-        <w:pStyle w:val="Heading2"/>
-        <w:spacing w:before="240" w:beforeAutospacing="off" w:after="240" w:afterAutospacing="off" w:line="276" w:lineRule="auto"/>
-        <w:jc w:val="left"/>
-        <w:rPr>
-          <w:rFonts w:ascii="Calibri" w:hAnsi="Calibri" w:eastAsia="Calibri" w:cs="Calibri"/>
-          <w:noProof w:val="0"/>
-          <w:sz w:val="20"/>
-          <w:szCs w:val="20"/>
-          <w:lang w:val="fr-FR"/>
-        </w:rPr>
-      </w:pPr>
-      <w:r>
-        <w:rPr>
-          <w:rFonts w:ascii="Calibri" w:hAnsi="Calibri" w:eastAsia="Calibri" w:cs="Calibri"/>
-          <w:noProof w:val="0"/>
-          <w:sz w:val="20"/>
-          <w:szCs w:val="20"/>
-          <w:lang w:val="fr-FR"/>
-        </w:rPr>
-        <w:t>VICTOR GIROUD – &lt;TODO&gt;</w:t>
-      </w:r>
-    </w:p>
-    <w:p ns2:paraId="6D69CE6D" ns2:textId="2964B2B3">
-      <w:pPr>
-        <w:pStyle w:val="Normal"/>
-        <w:suppressLineNumbers w:val="0"/>
-        <w:bidi w:val="0"/>
-        <w:spacing w:before="240" w:beforeAutospacing="off" w:after="240" w:afterAutospacing="off" w:line="276" w:lineRule="auto"/>
-        <w:ind w:left="0" w:right="0"/>
-        <w:jc w:val="left"/>
-      </w:pPr>
-      <w:r>
-        <w:rPr>
-          <w:rFonts w:ascii="Calibri" w:hAnsi="Calibri" w:eastAsia="Calibri" w:cs="Calibri"/>
-          <w:noProof w:val="0"/>
-          <w:sz w:val="20"/>
-          <w:szCs w:val="20"/>
-          <w:lang w:val="fr-FR"/>
-        </w:rPr>
-        <w:t>[TODO] Synthèse détaillée des réalisations techniques de Victor Giroud pour le Sprint &lt;TODO_BILAN&gt; (features mobiles, React Native, UI/UX, navigation, gamification, etc.).</w:t>
-      </w:r>
-    </w:p>
-    <w:p ns2:paraId="38A772EA" ns2:textId="55CE4D8B">
-      <w:pPr>
-        <w:pStyle w:val="Normal"/>
-        <w:bidi w:val="0"/>
-        <w:spacing w:before="240" w:beforeAutospacing="off" w:after="240" w:afterAutospacing="off" w:line="276" w:lineRule="auto"/>
-        <w:ind w:left="0" w:right="0"/>
-        <w:jc w:val="left"/>
-      </w:pPr>
-    </w:p>
-    <w:p ns2:paraId="37532E2B" ns2:textId="24A134E1">
-      <w:r>
-        <w:br w:type="page"/>
-      </w:r>
-    </w:p>
-    <w:p ns2:paraId="296A9724" ns2:textId="22329AED">
-      <w:pPr>
-        <w:pStyle w:val="Heading2"/>
-        <w:suppressLineNumbers w:val="0"/>
-        <w:bidi w:val="0"/>
-        <w:spacing w:before="240" w:beforeAutospacing="off" w:after="240" w:afterAutospacing="off" w:line="276" w:lineRule="auto"/>
-        <w:ind/>
-        <w:jc w:val="left"/>
-        <w:rPr>
-          <w:rFonts w:ascii="Calibri" w:hAnsi="Calibri" w:eastAsia="Calibri" w:cs="Calibri"/>
-          <w:noProof w:val="0"/>
-          <w:sz w:val="20"/>
-          <w:szCs w:val="20"/>
-          <w:lang w:val="fr-FR"/>
-        </w:rPr>
-      </w:pPr>
-      <w:r>
-        <w:rPr>
-          <w:rFonts w:ascii="Calibri" w:hAnsi="Calibri" w:eastAsia="Calibri" w:cs="Calibri"/>
-          <w:noProof w:val="0"/>
-          <w:sz w:val="20"/>
-          <w:szCs w:val="20"/>
-          <w:lang w:val="fr-FR"/>
-        </w:rPr>
-        <w:t>CLÉMENT PASTEAU – &lt;TODO&gt;</w:t>
-      </w:r>
-    </w:p>
-    <w:p ns2:paraId="0D23734D" ns2:textId="5F4046DC">
-      <w:pPr>
-        <w:pStyle w:val="Normal"/>
-        <w:suppressLineNumbers w:val="0"/>
-        <w:bidi w:val="0"/>
-        <w:spacing w:before="240" w:beforeAutospacing="off" w:after="240" w:afterAutospacing="off" w:line="276" w:lineRule="auto"/>
-        <w:ind w:left="0" w:right="0"/>
-        <w:jc w:val="left"/>
-      </w:pPr>
-      <w:r>
-        <w:rPr>
-          <w:rFonts w:ascii="Calibri" w:hAnsi="Calibri" w:eastAsia="Calibri" w:cs="Calibri"/>
-          <w:noProof w:val="0"/>
-          <w:sz w:val="20"/>
-          <w:szCs w:val="20"/>
-          <w:lang w:val="fr-FR"/>
-        </w:rPr>
-        <w:t>[TODO] Synthèse détaillée des réalisations techniques de Clément Pasteau pour le Sprint &lt;TODO_BILAN&gt; (backend, gRPC, domain packages, stockage S3/MinIO, tests d'intégration, etc.).</w:t>
-      </w:r>
-    </w:p>
-    <w:p ns2:paraId="682C0FD8" ns2:textId="5BB1A8A9">
-      <w:pPr>
-        <w:pStyle w:val="Normal"/>
-        <w:suppressLineNumbers w:val="0"/>
-        <w:bidi w:val="0"/>
-        <w:spacing w:before="240" w:beforeAutospacing="off" w:after="240" w:afterAutospacing="off" w:line="276" w:lineRule="auto"/>
-        <w:ind w:left="0" w:right="0"/>
-        <w:jc w:val="left"/>
-      </w:pPr>
-      <w:r>
-        <w:drawing>
-          <ns3:inline ns4:editId="77AEFA18" ns4:anchorId="37160AA9">
-            <ns3:extent cx="5762625" cy="2962275"/>
-            <ns3:effectExtent l="0" t="0" r="0" b="0"/>
-            <ns3:docPr id="1832003859" name="drawing"/>
-            <ns3:cNvGraphicFramePr>
-              <a:graphicFrameLocks noChangeAspect="1"/>
-            </ns3:cNvGraphicFramePr>
-            <a:graphic>
-              <a:graphicData uri="http://schemas.openxmlformats.org/drawingml/2006/picture">
-                <ns7:pic>
-                  <ns7:nvPicPr>
-                    <ns7:cNvPr id="1832003859" name="Picture 1832003859"/>
-                    <ns7:cNvPicPr/>
-                  </ns7:nvPicPr>
-                  <ns7:blipFill>
-                    <a:blip r:embed="rId1094924346">
-                      <a:extLst>
-                        <a:ext uri="{28A0092B-C50C-407E-A947-70E740481C1C}">
-                          <ns9:useLocalDpi/>
-                        </a:ext>
-                      </a:extLst>
-                    </a:blip>
-                    <a:stretch>
-                      <a:fillRect/>
-                    </a:stretch>
-                  </ns7:blipFill>
-                  <ns7:spPr>
-                    <a:xfrm>
-                      <a:off x="0" y="0"/>
-                      <a:ext cx="5762625" cy="2962275"/>
-                    </a:xfrm>
-                    <a:prstGeom prst="rect">
-                      <a:avLst/>
-                    </a:prstGeom>
-                  </ns7:spPr>
-                </ns7:pic>
-              </a:graphicData>
-            </a:graphic>
-          </ns3:inline>
-        </w:drawing>
-      </w:r>
-    </w:p>
-    <w:p ns2:paraId="634C1ABF" ns2:textId="215D7FCE">
-      <w:pPr>
-        <w:pStyle w:val="Normal"/>
-        <w:suppressLineNumbers w:val="0"/>
-        <w:bidi w:val="0"/>
-        <w:spacing w:before="240" w:beforeAutospacing="off" w:after="240" w:afterAutospacing="off" w:line="276" w:lineRule="auto"/>
-        <w:ind w:left="0" w:right="0"/>
-        <w:jc w:val="left"/>
-        <w:rPr>
-          <w:rFonts w:ascii="Calibri" w:hAnsi="Calibri" w:eastAsia="Calibri" w:cs="Calibri"/>
-          <w:noProof w:val="0"/>
-          <w:sz w:val="20"/>
-          <w:szCs w:val="20"/>
-          <w:lang w:val="fr-FR"/>
-        </w:rPr>
-      </w:pPr>
-    </w:p>
-    <w:p ns2:paraId="2AD96268" ns2:textId="725851E0">
-      <w:pPr>
-        <w:pStyle w:val="Normal"/>
-        <w:suppressLineNumbers w:val="0"/>
-        <w:bidi w:val="0"/>
-        <w:spacing w:before="240" w:beforeAutospacing="off" w:after="240" w:afterAutospacing="off" w:line="276" w:lineRule="auto"/>
-        <w:ind w:left="0" w:right="0"/>
-        <w:jc w:val="left"/>
-        <w:rPr>
-          <w:rFonts w:ascii="Calibri" w:hAnsi="Calibri" w:eastAsia="Calibri" w:cs="Calibri"/>
-          <w:noProof w:val="0"/>
-          <w:sz w:val="20"/>
-          <w:szCs w:val="20"/>
-          <w:lang w:val="fr-FR"/>
-        </w:rPr>
-      </w:pPr>
-    </w:p>
-    <w:p ns2:paraId="72D5D6BA" ns2:textId="2C6C9BD0">
-      <w:pPr>
-        <w:pStyle w:val="Normal"/>
-        <w:suppressLineNumbers w:val="0"/>
-        <w:bidi w:val="0"/>
-        <w:spacing w:before="240" w:beforeAutospacing="off" w:after="240" w:afterAutospacing="off" w:line="276" w:lineRule="auto"/>
-        <w:ind w:left="0" w:right="0"/>
-        <w:jc w:val="left"/>
-        <w:rPr>
-          <w:rFonts w:ascii="Calibri" w:hAnsi="Calibri" w:eastAsia="Calibri" w:cs="Calibri"/>
-          <w:noProof w:val="0"/>
-          <w:sz w:val="20"/>
-          <w:szCs w:val="20"/>
-          <w:lang w:val="fr-FR"/>
-        </w:rPr>
-      </w:pPr>
-    </w:p>
-    <w:p ns2:paraId="38CACD31" ns2:textId="4DC27A91">
-      <w:pPr>
-        <w:pStyle w:val="Normal"/>
-        <w:suppressLineNumbers w:val="0"/>
-        <w:bidi w:val="0"/>
-        <w:spacing w:before="240" w:beforeAutospacing="off" w:after="240" w:afterAutospacing="off" w:line="276" w:lineRule="auto"/>
-        <w:ind w:left="0" w:right="0"/>
-        <w:jc w:val="left"/>
-        <w:rPr>
-          <w:rFonts w:ascii="Calibri" w:hAnsi="Calibri" w:eastAsia="Calibri" w:cs="Calibri"/>
-          <w:noProof w:val="0"/>
-          <w:sz w:val="20"/>
-          <w:szCs w:val="20"/>
-          <w:lang w:val="fr-FR"/>
-        </w:rPr>
-      </w:pPr>
-    </w:p>
-    <w:p ns2:paraId="517170BC" ns2:textId="7951049A">
-      <w:pPr>
-        <w:pStyle w:val="Normal"/>
-        <w:suppressLineNumbers w:val="0"/>
-        <w:bidi w:val="0"/>
-        <w:spacing w:before="240" w:beforeAutospacing="off" w:after="240" w:afterAutospacing="off" w:line="276" w:lineRule="auto"/>
-        <w:ind w:left="0" w:right="0"/>
-        <w:jc w:val="left"/>
-        <w:rPr>
-          <w:rFonts w:ascii="Calibri" w:hAnsi="Calibri" w:eastAsia="Calibri" w:cs="Calibri"/>
-          <w:noProof w:val="0"/>
-          <w:sz w:val="20"/>
-          <w:szCs w:val="20"/>
-          <w:lang w:val="fr-FR"/>
-        </w:rPr>
-      </w:pPr>
-    </w:p>
-    <w:p ns2:paraId="517FC579" ns2:textId="3023BA72">
-      <w:pPr>
-        <w:pStyle w:val="Normal"/>
-        <w:suppressLineNumbers w:val="0"/>
-        <w:bidi w:val="0"/>
-        <w:spacing w:before="240" w:beforeAutospacing="off" w:after="240" w:afterAutospacing="off" w:line="276" w:lineRule="auto"/>
-        <w:ind w:left="0" w:right="0"/>
-        <w:jc w:val="left"/>
-        <w:rPr>
-          <w:rFonts w:ascii="Calibri" w:hAnsi="Calibri" w:eastAsia="Calibri" w:cs="Calibri"/>
-          <w:noProof w:val="0"/>
-          <w:sz w:val="20"/>
-          <w:szCs w:val="20"/>
-          <w:lang w:val="fr-FR"/>
-        </w:rPr>
-      </w:pPr>
-    </w:p>
-    <w:p ns2:paraId="1F49DC73" ns2:textId="12E2CAFE">
-      <w:pPr>
-        <w:pStyle w:val="Normal"/>
-        <w:suppressLineNumbers w:val="0"/>
-        <w:bidi w:val="0"/>
-        <w:spacing w:before="240" w:beforeAutospacing="off" w:after="240" w:afterAutospacing="off" w:line="276" w:lineRule="auto"/>
-        <w:ind w:left="0" w:right="0"/>
-        <w:jc w:val="left"/>
-        <w:rPr>
-          <w:rFonts w:ascii="Calibri" w:hAnsi="Calibri" w:eastAsia="Calibri" w:cs="Calibri"/>
-          <w:noProof w:val="0"/>
-          <w:sz w:val="20"/>
-          <w:szCs w:val="20"/>
-          <w:lang w:val="fr-FR"/>
-        </w:rPr>
-      </w:pPr>
-    </w:p>
-    <w:p ns2:paraId="16A9B55E" ns2:textId="4A434D69">
-      <w:pPr>
-        <w:pStyle w:val="Normal"/>
-        <w:suppressLineNumbers w:val="0"/>
-        <w:bidi w:val="0"/>
-        <w:spacing w:before="240" w:beforeAutospacing="off" w:after="240" w:afterAutospacing="off" w:line="276" w:lineRule="auto"/>
-        <w:ind w:left="0" w:right="0"/>
-        <w:jc w:val="left"/>
-        <w:rPr>
-          <w:rFonts w:ascii="Calibri" w:hAnsi="Calibri" w:eastAsia="Calibri" w:cs="Calibri"/>
-          <w:noProof w:val="0"/>
-          <w:sz w:val="20"/>
-          <w:szCs w:val="20"/>
-          <w:lang w:val="fr-FR"/>
-        </w:rPr>
-      </w:pPr>
-    </w:p>
-    <w:p ns2:paraId="7EBD573F" ns2:textId="4CADDC25">
-      <w:pPr>
-        <w:pStyle w:val="Normal"/>
-        <w:suppressLineNumbers w:val="0"/>
-        <w:bidi w:val="0"/>
-        <w:spacing w:before="240" w:beforeAutospacing="off" w:after="240" w:afterAutospacing="off" w:line="276" w:lineRule="auto"/>
-        <w:ind w:left="0" w:right="0"/>
-        <w:jc w:val="left"/>
-        <w:rPr>
-          <w:rFonts w:ascii="Calibri" w:hAnsi="Calibri" w:eastAsia="Calibri" w:cs="Calibri"/>
-          <w:noProof w:val="0"/>
-          <w:sz w:val="20"/>
-          <w:szCs w:val="20"/>
-          <w:lang w:val="fr-FR"/>
-        </w:rPr>
-      </w:pPr>
-    </w:p>
-    <w:p ns2:paraId="034CA9C3" ns2:textId="5AD8B469">
-      <w:pPr>
-        <w:pStyle w:val="Normal"/>
-        <w:suppressLineNumbers w:val="0"/>
-        <w:bidi w:val="0"/>
-        <w:spacing w:before="240" w:beforeAutospacing="off" w:after="240" w:afterAutospacing="off" w:line="276" w:lineRule="auto"/>
-        <w:ind w:left="0" w:right="0"/>
-        <w:jc w:val="left"/>
-      </w:pPr>
-      <w:r>
-        <w:rPr>
-          <w:rFonts w:ascii="Calibri" w:hAnsi="Calibri" w:eastAsia="Calibri" w:cs="Calibri"/>
-          <w:noProof w:val="0"/>
-          <w:sz w:val="20"/>
-          <w:szCs w:val="20"/>
-          <w:lang w:val="fr-FR"/>
-        </w:rPr>
-        <w:t/>
-      </w:r>
-    </w:p>
-    <w:p ns2:paraId="581EAFC0" ns2:textId="3ED3F16F">
-      <w:pPr>
-        <w:pStyle w:val="Normal"/>
-        <w:suppressLineNumbers w:val="0"/>
-        <w:bidi w:val="0"/>
-        <w:spacing w:before="240" w:beforeAutospacing="off" w:after="240" w:afterAutospacing="off" w:line="276" w:lineRule="auto"/>
-        <w:ind w:left="0" w:right="0"/>
-        <w:jc w:val="left"/>
-      </w:pPr>
-      <w:r>
-        <w:drawing>
-          <ns3:inline ns4:editId="04077B09" ns4:anchorId="6AAE6B72">
-            <ns3:extent cx="5762625" cy="5019675"/>
-            <ns3:effectExtent l="0" t="0" r="0" b="0"/>
-            <ns3:docPr id="945527891" name="drawing"/>
-            <ns3:cNvGraphicFramePr>
-              <a:graphicFrameLocks noChangeAspect="1"/>
-            </ns3:cNvGraphicFramePr>
-            <a:graphic>
-              <a:graphicData uri="http://schemas.openxmlformats.org/drawingml/2006/picture">
-                <ns7:pic>
-                  <ns7:nvPicPr>
-                    <ns7:cNvPr id="945527891" name="Picture 945527891"/>
-                    <ns7:cNvPicPr/>
-                  </ns7:nvPicPr>
-                  <ns7:blipFill>
-                    <a:blip r:embed="rId861082786">
-                      <a:extLst>
-                        <a:ext uri="{28A0092B-C50C-407E-A947-70E740481C1C}">
-                          <ns9:useLocalDpi/>
-                        </a:ext>
-                      </a:extLst>
-                    </a:blip>
-                    <a:stretch>
-                      <a:fillRect/>
-                    </a:stretch>
-                  </ns7:blipFill>
-                  <ns7:spPr>
-                    <a:xfrm>
-                      <a:off x="0" y="0"/>
-                      <a:ext cx="5762625" cy="5019675"/>
-                    </a:xfrm>
-                    <a:prstGeom prst="rect">
-                      <a:avLst/>
-                    </a:prstGeom>
-                  </ns7:spPr>
-                </ns7:pic>
-              </a:graphicData>
-            </a:graphic>
-          </ns3:inline>
-        </w:drawing>
-      </w:r>
-      <w:r>
-        <w:rPr/>
-        <w:t xml:space="preserve"> </w:t>
-      </w:r>
-      <w:r>
-        <w:rPr>
-          <w:lang w:val="en-US"/>
-        </w:rPr>
-        <w:br w:type="page"/>
-      </w:r>
-    </w:p>
-    <w:p ns2:paraId="111E5D88" ns2:textId="78D48406">
-      <w:pPr>
-        <w:pStyle w:val="Heading2"/>
-      </w:pPr>
-    </w:p>
-    <w:p ns2:paraId="2BD1DD29" ns2:textId="5D83D2A0">
-      <w:pPr>
-        <w:pStyle w:val="Heading2"/>
-      </w:pPr>
-    </w:p>
-    <w:p ns2:paraId="26D738CD" ns2:textId="3CD7AE5E">
-      <w:pPr>
-        <w:pStyle w:val="Heading2"/>
-      </w:pPr>
-      <w:r>
-        <w:rPr/>
-        <w:t>SPRINT &lt;TODO_PROJ&gt;</w:t>
-      </w:r>
-    </w:p>
-    <w:p ns2:paraId="3E977E2E" ns2:textId="7CA90797">
-      <w:pPr>
-        <w:pStyle w:val="Normal"/>
-      </w:pPr>
-    </w:p>
-    <w:p ns2:paraId="19410679" ns2:textId="6EFEBBE6"/>
-    <w:p ns2:paraId="40CDF0EC" ns2:textId="2148AE99">
-      <w:r>
-        <w:rPr/>
-        <w:t>Pour la prochaine période, nous allons présenter le Sprint &lt;TODO_PROJ&gt; qui s’étale du &lt;DATE_DEBUT_TODO&gt; au &lt;DATE_FIN_TODO&gt;, pour une durée de &lt;DUREE_SEMAINES_TODO&gt; semaines.</w:t>
-      </w:r>
-    </w:p>
-    <w:p ns2:paraId="6F47FC12" ns2:textId="5EC73265">
-      <w:r>
-        <w:rPr/>
-        <w:t xml:space="preserve">Voilà les différents axes que l’on va </w:t>
-      </w:r>
-      <w:r>
-        <w:rPr/>
-        <w:t>développer :</w:t>
-      </w:r>
-      <w:r>
-        <w:rPr/>
-        <w:t xml:space="preserve"> </w:t>
-      </w:r>
-    </w:p>
-    <w:p ns2:paraId="77D97548" ns2:textId="4DAE22E9">
-      <w:pPr>
-        <w:pStyle w:val="mtitextenumr"/>
-        <w:suppressLineNumbers w:val="0"/>
-        <w:shd w:val="clear" w:color="auto" w:fill="FFFFFF" w:themeFill="background1"/>
-        <w:bidi w:val="0"/>
-        <w:spacing w:before="240" w:beforeAutospacing="off" w:after="240" w:afterAutospacing="off" w:line="240" w:lineRule="auto"/>
-        <w:ind w:left="720" w:right="0" w:hanging="360"/>
-        <w:jc w:val="left"/>
-        <w:rPr>
-          <w:lang w:val="fr-FR"/>
-        </w:rPr>
-      </w:pPr>
-      <w:r>
-        <w:rPr>
-          <w:lang w:val="fr-FR"/>
-        </w:rPr>
-        <w:t>[TODO] Axe 1 de développement</w:t>
-      </w:r>
-    </w:p>
-    <w:p ns2:paraId="493C8D53" ns2:textId="73FF8861">
-      <w:pPr>
-        <w:pStyle w:val="mtitextenumr"/>
-        <w:suppressLineNumbers w:val="0"/>
-        <w:shd w:val="clear" w:color="auto" w:fill="FFFFFF" w:themeFill="background1"/>
-        <w:bidi w:val="0"/>
-        <w:spacing w:before="240" w:beforeAutospacing="off" w:after="240" w:afterAutospacing="off" w:line="240" w:lineRule="auto"/>
-        <w:ind w:left="720" w:right="0" w:hanging="360"/>
-        <w:jc w:val="left"/>
-        <w:rPr/>
-      </w:pPr>
-      <w:r>
-        <w:rPr>
-          <w:lang w:val="fr-FR"/>
-        </w:rPr>
-        <w:t>[TODO] Axe 2 de développement</w:t>
-      </w:r>
-    </w:p>
-    <w:p ns2:paraId="73A5F82C" ns2:textId="15400101">
-      <w:pPr>
-        <w:pStyle w:val="mtitextenumr"/>
-        <w:suppressLineNumbers w:val="0"/>
-        <w:shd w:val="clear" w:color="auto" w:fill="FFFFFF" w:themeFill="background1"/>
-        <w:bidi w:val="0"/>
-        <w:spacing w:before="240" w:beforeAutospacing="off" w:after="240" w:afterAutospacing="off" w:line="240" w:lineRule="auto"/>
-        <w:ind w:left="720" w:right="0" w:hanging="360"/>
-        <w:jc w:val="left"/>
-        <w:rPr>
-          <w:lang w:val="en-US"/>
-        </w:rPr>
-      </w:pPr>
-      <w:r>
-        <w:rPr>
-          <w:lang w:val="en-US"/>
-        </w:rPr>
-        <w:t>[TODO] Axe 3 de développement</w:t>
-      </w:r>
-    </w:p>
-    <w:p ns2:paraId="6AFB9AC5" ns2:textId="5C698B55">
-      <w:pPr>
-        <w:rPr>
-          <w:u w:val="single"/>
-        </w:rPr>
-      </w:pPr>
-      <w:r>
-        <w:rPr>
-          <w:u w:val="single"/>
-        </w:rPr>
-        <w:t>Vous trouverez via le lien ci-joint la page vers le backlog du Sprint &lt;TODO_PROJ&gt; :</w:t>
-      </w:r>
-    </w:p>
-    <w:p ns2:paraId="7056F9D0" ns2:textId="09191F74">
-      <w:r>
-        <w:t>[TODO_URL_NOTION_BACKLOG]</w:t>
-      </w:r>
-    </w:p>
-    <w:p ns2:paraId="555F763B" ns2:textId="132BC040">
-      <w:pPr>
-        <w:pStyle w:val="Heading1"/>
-      </w:pPr>
-      <w:bookmarkStart w:name="_Toc228297617" w:id="4"/>
-      <w:bookmarkStart w:name="_Toc1731799357" w:id="1934310681"/>
-      <w:r>
-        <w:rPr/>
-        <w:t>Découpage des actions</w:t>
-      </w:r>
-      <w:bookmarkEnd w:id="4"/>
-      <w:bookmarkEnd w:id="1934310681"/>
-    </w:p>
-    <w:p ns2:paraId="41B335E6" ns2:textId="007B419B">
-      <w:pPr>
-        <w:pStyle w:val="Heading3"/>
-      </w:pPr>
-      <w:bookmarkStart w:name="_Toc714619430" w:id="1156638760"/>
-      <w:r>
-        <w:rPr/>
-        <w:t>Répartition des Tâches</w:t>
-      </w:r>
-      <w:bookmarkEnd w:id="1156638760"/>
-    </w:p>
-    <w:p ns2:paraId="2D4EA02B" ns2:textId="169BA6FC">
-      <w:r>
-        <w:rPr/>
-        <w:t>Comme mentionné plus haut, chaque tâche se voit associée à deux membres, qui joueront des rôles différents dans la réalisation de cette tâche. Pour ce Sprint &lt;TODO_PROJ&gt;, la répartition est la suivante :</w:t>
-      </w:r>
-    </w:p>
-    <w:p ns2:paraId="2033685B" ns2:textId="6B458903"/>
-    <w:tbl>
-      <w:tblPr>
-        <w:tblStyle w:val="GridTable5Dark-Accent1"/>
-        <w:tblW w:w="0" w:type="auto"/>
-        <w:tblLook w:val="06A0" w:firstRow="1" w:lastRow="0" w:firstColumn="1" w:lastColumn="0" w:noHBand="1" w:noVBand="1"/>
-      </w:tblPr>
-      <w:tblGrid>
-        <w:gridCol w:w="3020"/>
-        <w:gridCol w:w="3020"/>
-        <w:gridCol w:w="3020"/>
-      </w:tblGrid>
-      <w:tr ns2:paraId="40307267" ns2:textId="77777777">
-        <w:trPr>
-          <w:cnfStyle w:val="100000000000" w:firstRow="1" w:lastRow="0" w:firstColumn="0" w:lastColumn="0" w:oddVBand="0" w:evenVBand="0" w:oddHBand="0" w:evenHBand="0" w:firstRowFirstColumn="0" w:firstRowLastColumn="0" w:lastRowFirstColumn="0" w:lastRowLastColumn="0"/>
-          <w:trHeight w:val="300"/>
-        </w:trPr>
-        <w:tc>
-          <w:tcPr>
-            <w:cnfStyle w:val="001000000000" w:firstRow="0" w:lastRow="0" w:firstColumn="1" w:lastColumn="0" w:oddVBand="0" w:evenVBand="0" w:oddHBand="0" w:evenHBand="0" w:firstRowFirstColumn="0" w:firstRowLastColumn="0" w:lastRowFirstColumn="0" w:lastRowLastColumn="0"/>
-            <w:tcW w:w="3020" w:type="dxa"/>
-            <w:tcMar/>
-          </w:tcPr>
-          <w:p ns2:paraId="05698D5F" ns2:textId="00E5F96D">
-            <w:r>
-              <w:t>Tâche</w:t>
-            </w:r>
-          </w:p>
-        </w:tc>
-        <w:tc>
-          <w:tcPr>
-            <w:cnfStyle w:val="000000000000" w:firstRow="0" w:lastRow="0" w:firstColumn="0" w:lastColumn="0" w:oddVBand="0" w:evenVBand="0" w:oddHBand="0" w:evenHBand="0" w:firstRowFirstColumn="0" w:firstRowLastColumn="0" w:lastRowFirstColumn="0" w:lastRowLastColumn="0"/>
-            <w:tcW w:w="3020" w:type="dxa"/>
-            <w:tcMar/>
-          </w:tcPr>
-          <w:p ns2:paraId="6D909A5B" ns2:textId="4C1F45B8">
-            <w:pPr>
-              <w:cnfStyle w:val="100000000000" w:firstRow="1" w:lastRow="0" w:firstColumn="0" w:lastColumn="0" w:oddVBand="0" w:evenVBand="0" w:oddHBand="0" w:evenHBand="0" w:firstRowFirstColumn="0" w:firstRowLastColumn="0" w:lastRowFirstColumn="0" w:lastRowLastColumn="0"/>
-            </w:pPr>
-            <w:r>
-              <w:t>Assigné</w:t>
-            </w:r>
-          </w:p>
-        </w:tc>
-        <w:tc>
-          <w:tcPr>
-            <w:cnfStyle w:val="000000000000" w:firstRow="0" w:lastRow="0" w:firstColumn="0" w:lastColumn="0" w:oddVBand="0" w:evenVBand="0" w:oddHBand="0" w:evenHBand="0" w:firstRowFirstColumn="0" w:firstRowLastColumn="0" w:lastRowFirstColumn="0" w:lastRowLastColumn="0"/>
-            <w:tcW w:w="3020" w:type="dxa"/>
-            <w:tcMar/>
-          </w:tcPr>
-          <w:p ns2:paraId="1028772C" ns2:textId="588B0DC0">
-            <w:pPr>
-              <w:cnfStyle w:val="100000000000" w:firstRow="1" w:lastRow="0" w:firstColumn="0" w:lastColumn="0" w:oddVBand="0" w:evenVBand="0" w:oddHBand="0" w:evenHBand="0" w:firstRowFirstColumn="0" w:firstRowLastColumn="0" w:lastRowFirstColumn="0" w:lastRowLastColumn="0"/>
-            </w:pPr>
-            <w:r>
-              <w:t>Lead</w:t>
-            </w:r>
-          </w:p>
-        </w:tc>
-      </w:tr>
-      <w:tr ns2:paraId="21496885" ns2:textId="77777777">
-        <w:trPr>
-          <w:trHeight w:val="300"/>
-        </w:trPr>
-        <w:tc>
-          <w:tcPr>
-            <w:cnfStyle w:val="001000000000" w:firstRow="0" w:lastRow="0" w:firstColumn="1" w:lastColumn="0" w:oddVBand="0" w:evenVBand="0" w:oddHBand="0" w:evenHBand="0" w:firstRowFirstColumn="0" w:firstRowLastColumn="0" w:lastRowFirstColumn="0" w:lastRowLastColumn="0"/>
-            <w:tcW w:w="3020" w:type="dxa"/>
-            <w:tcMar/>
-          </w:tcPr>
-          <w:p ns2:paraId="60A8138B" ns2:textId="3A800769">
-            <w:pPr>
-              <w:jc w:val="center"/>
-            </w:pPr>
-            <w:r>
-              <w:rPr>
-                <w:lang w:val="en-US"/>
-              </w:rPr>
-              <w:t>[TODO Tâche 1]</w:t>
-            </w:r>
-          </w:p>
-        </w:tc>
-        <w:tc>
-          <w:tcPr>
-            <w:cnfStyle w:val="000000000000" w:firstRow="0" w:lastRow="0" w:firstColumn="0" w:lastColumn="0" w:oddVBand="0" w:evenVBand="0" w:oddHBand="0" w:evenHBand="0" w:firstRowFirstColumn="0" w:firstRowLastColumn="0" w:lastRowFirstColumn="0" w:lastRowLastColumn="0"/>
-            <w:tcW w:w="3020" w:type="dxa"/>
-            <w:tcMar/>
-          </w:tcPr>
-          <w:p ns2:paraId="2C801BC8" ns2:textId="79CA6894">
-            <w:pPr>
-              <w:pStyle w:val="Normal"/>
-              <w:suppressLineNumbers w:val="0"/>
-              <w:bidi w:val="0"/>
-              <w:spacing w:before="200" w:beforeAutospacing="off" w:after="0" w:afterAutospacing="off" w:line="240" w:lineRule="auto"/>
-              <w:ind w:left="0" w:right="0"/>
-              <w:jc w:val="center"/>
-            </w:pPr>
-            <w:r>
-              <w:rPr/>
-              <w:t>[TODO Membres]</w:t>
-            </w:r>
-          </w:p>
-        </w:tc>
-        <w:tc>
-          <w:tcPr>
-            <w:cnfStyle w:val="000000000000" w:firstRow="0" w:lastRow="0" w:firstColumn="0" w:lastColumn="0" w:oddVBand="0" w:evenVBand="0" w:oddHBand="0" w:evenHBand="0" w:firstRowFirstColumn="0" w:firstRowLastColumn="0" w:lastRowFirstColumn="0" w:lastRowLastColumn="0"/>
-            <w:tcW w:w="3020" w:type="dxa"/>
-            <w:tcMar/>
-          </w:tcPr>
-          <w:p ns2:paraId="4172ACEB" ns2:textId="44D0D38F">
-            <w:pPr>
-              <w:jc w:val="center"/>
-              <w:cnfStyle w:val="000000000000" w:firstRow="0" w:lastRow="0" w:firstColumn="0" w:lastColumn="0" w:oddVBand="0" w:evenVBand="0" w:oddHBand="0" w:evenHBand="0" w:firstRowFirstColumn="0" w:firstRowLastColumn="0" w:lastRowFirstColumn="0" w:lastRowLastColumn="0"/>
-            </w:pPr>
-            <w:r>
-              <w:rPr/>
-              <w:t>[TODO Lead]</w:t>
-            </w:r>
-          </w:p>
-        </w:tc>
-      </w:tr>
-      <w:tr ns2:paraId="6A62E7F3" ns2:textId="77777777">
-        <w:trPr>
-          <w:trHeight w:val="300"/>
-        </w:trPr>
-        <w:tc>
-          <w:tcPr>
-            <w:cnfStyle w:val="001000000000" w:firstRow="0" w:lastRow="0" w:firstColumn="1" w:lastColumn="0" w:oddVBand="0" w:evenVBand="0" w:oddHBand="0" w:evenHBand="0" w:firstRowFirstColumn="0" w:firstRowLastColumn="0" w:lastRowFirstColumn="0" w:lastRowLastColumn="0"/>
-            <w:tcW w:w="3020" w:type="dxa"/>
-            <w:tcMar/>
-          </w:tcPr>
-          <w:p ns2:paraId="794AAA3A" ns2:textId="6886193A">
-            <w:pPr>
-              <w:pStyle w:val="Normal"/>
-              <w:suppressLineNumbers w:val="0"/>
-              <w:bidi w:val="0"/>
-              <w:spacing w:before="200" w:beforeAutospacing="off" w:after="0" w:afterAutospacing="off" w:line="240" w:lineRule="auto"/>
-              <w:ind w:left="0" w:right="0"/>
-              <w:jc w:val="center"/>
-            </w:pPr>
-            <w:r>
-              <w:rPr/>
-              <w:t>[TODO Tâche 2]</w:t>
-            </w:r>
-          </w:p>
-        </w:tc>
-        <w:tc>
-          <w:tcPr>
-            <w:cnfStyle w:val="000000000000" w:firstRow="0" w:lastRow="0" w:firstColumn="0" w:lastColumn="0" w:oddVBand="0" w:evenVBand="0" w:oddHBand="0" w:evenHBand="0" w:firstRowFirstColumn="0" w:firstRowLastColumn="0" w:lastRowFirstColumn="0" w:lastRowLastColumn="0"/>
-            <w:tcW w:w="3020" w:type="dxa"/>
-            <w:tcMar/>
-          </w:tcPr>
-          <w:p ns2:paraId="19D29E44" ns2:textId="55293390">
-            <w:pPr>
-              <w:pStyle w:val="Normal"/>
-              <w:suppressLineNumbers w:val="0"/>
-              <w:bidi w:val="0"/>
-              <w:spacing w:before="200" w:beforeAutospacing="off" w:after="0" w:afterAutospacing="off" w:line="240" w:lineRule="auto"/>
-              <w:ind w:left="0" w:right="0"/>
-              <w:jc w:val="center"/>
-            </w:pPr>
-            <w:r>
-              <w:rPr/>
-              <w:t>[TODO Membres]</w:t>
-            </w:r>
-          </w:p>
-        </w:tc>
-        <w:tc>
-          <w:tcPr>
-            <w:cnfStyle w:val="000000000000" w:firstRow="0" w:lastRow="0" w:firstColumn="0" w:lastColumn="0" w:oddVBand="0" w:evenVBand="0" w:oddHBand="0" w:evenHBand="0" w:firstRowFirstColumn="0" w:firstRowLastColumn="0" w:lastRowFirstColumn="0" w:lastRowLastColumn="0"/>
-            <w:tcW w:w="3020" w:type="dxa"/>
-            <w:tcMar/>
-          </w:tcPr>
-          <w:p ns2:paraId="018298B0" ns2:textId="3B04CF38">
-            <w:pPr>
-              <w:pStyle w:val="Normal"/>
-              <w:suppressLineNumbers w:val="0"/>
-              <w:bidi w:val="0"/>
-              <w:spacing w:before="200" w:beforeAutospacing="off" w:after="0" w:afterAutospacing="off" w:line="240" w:lineRule="auto"/>
-              <w:ind w:left="0" w:right="0"/>
-              <w:jc w:val="center"/>
-            </w:pPr>
-            <w:r>
-              <w:rPr/>
-              <w:t>[TODO Lead]</w:t>
-            </w:r>
-          </w:p>
-        </w:tc>
-      </w:tr>
-      <w:tr ns2:paraId="6AB6465D">
-        <w:trPr>
-          <w:trHeight w:val="885"/>
-        </w:trPr>
-        <w:tc>
-          <w:tcPr>
-            <w:cnfStyle w:val="001000000000" w:firstRow="0" w:lastRow="0" w:firstColumn="1" w:lastColumn="0" w:oddVBand="0" w:evenVBand="0" w:oddHBand="0" w:evenHBand="0" w:firstRowFirstColumn="0" w:firstRowLastColumn="0" w:lastRowFirstColumn="0" w:lastRowLastColumn="0"/>
-            <w:tcW w:w="3020" w:type="dxa"/>
-            <w:tcMar/>
-          </w:tcPr>
-          <w:p ns2:paraId="34FF0A3B" ns2:textId="47DC6204">
-            <w:pPr>
-              <w:pStyle w:val="Normal"/>
-              <w:jc w:val="center"/>
-              <w:rPr>
-                <w:lang w:val="fr-FR"/>
-              </w:rPr>
-            </w:pPr>
-            <w:r>
-              <w:rPr>
-                <w:lang w:val="fr-FR"/>
-              </w:rPr>
-              <w:t>[TODO Tâche 3]</w:t>
-            </w:r>
-          </w:p>
-        </w:tc>
-        <w:tc>
-          <w:tcPr>
-            <w:cnfStyle w:val="000000000000" w:firstRow="0" w:lastRow="0" w:firstColumn="0" w:lastColumn="0" w:oddVBand="0" w:evenVBand="0" w:oddHBand="0" w:evenHBand="0" w:firstRowFirstColumn="0" w:firstRowLastColumn="0" w:lastRowFirstColumn="0" w:lastRowLastColumn="0"/>
-            <w:tcW w:w="3020" w:type="dxa"/>
-            <w:tcMar/>
-          </w:tcPr>
-          <w:p ns2:paraId="0BF2BD22" ns2:textId="0507B93F">
-            <w:pPr>
-              <w:pStyle w:val="Normal"/>
-              <w:jc w:val="center"/>
-            </w:pPr>
-            <w:r>
-              <w:rPr/>
-              <w:t>[TODO Membres]</w:t>
-            </w:r>
-          </w:p>
-        </w:tc>
-        <w:tc>
-          <w:tcPr>
-            <w:cnfStyle w:val="000000000000" w:firstRow="0" w:lastRow="0" w:firstColumn="0" w:lastColumn="0" w:oddVBand="0" w:evenVBand="0" w:oddHBand="0" w:evenHBand="0" w:firstRowFirstColumn="0" w:firstRowLastColumn="0" w:lastRowFirstColumn="0" w:lastRowLastColumn="0"/>
-            <w:tcW w:w="3020" w:type="dxa"/>
-            <w:tcMar/>
-          </w:tcPr>
-          <w:p ns2:paraId="33FB8043" ns2:textId="08A50191">
-            <w:pPr>
-              <w:pStyle w:val="Normal"/>
-              <w:jc w:val="center"/>
-            </w:pPr>
-            <w:r>
-              <w:rPr/>
-              <w:t>[TODO Lead]</w:t>
-            </w:r>
-          </w:p>
-        </w:tc>
-      </w:tr>
-    </w:tbl>
-    <w:p ns2:paraId="516438BC" ns2:textId="4DBAFC05">
-      <w:pPr>
-        <w:pStyle w:val="Heading3"/>
-        <w:spacing w:before="200" w:after="200"/>
-      </w:pPr>
-    </w:p>
-    <w:p ns2:paraId="4417E627" ns2:textId="59EA8CFB">
-      <w:pPr>
-        <w:rPr>
-          <w:lang w:val="nl-NL"/>
-        </w:rPr>
-      </w:pPr>
-    </w:p>
-    <w:p ns2:paraId="5BC4F266" ns2:textId="4A2E9E9E">
-      <w:pPr>
-        <w:rPr>
-          <w:lang w:val="nl-NL"/>
-        </w:rPr>
-      </w:pPr>
-      <w:r>
-        <w:rPr>
-          <w:lang w:val="nl-NL"/>
-        </w:rPr>
-        <w:br w:type="page"/>
-      </w:r>
-    </w:p>
-    <w:p ns2:paraId="291BCEED" ns2:textId="55F24EE4">
-      <w:pPr>
-        <w:pStyle w:val="Heading2"/>
-      </w:pPr>
-      <w:bookmarkStart w:name="_Toc161572873" w:id="547873380"/>
-      <w:r>
-        <w:rPr/>
-        <w:t>Diagramme</w:t>
-      </w:r>
-      <w:r>
-        <w:rPr/>
-        <w:t>s</w:t>
-      </w:r>
-      <w:r>
-        <w:rPr/>
-        <w:t xml:space="preserve"> de </w:t>
-      </w:r>
-      <w:r>
-        <w:rPr/>
-        <w:t>Gantt</w:t>
-      </w:r>
-      <w:bookmarkEnd w:id="547873380"/>
-    </w:p>
-    <w:p ns2:paraId="147AC723" ns2:textId="18CF7578">
-      <w:pPr>
-        <w:pStyle w:val="Heading3"/>
-        <w:rPr>
-          <w:lang w:val="fr-FR"/>
-        </w:rPr>
-      </w:pPr>
-      <w:r>
-        <w:rPr>
-          <w:lang w:val="fr-FR"/>
-        </w:rPr>
-        <w:t>Victor Giroud : &lt;TODO&gt;</w:t>
-      </w:r>
-    </w:p>
-    <w:p ns2:paraId="087993E9" ns2:textId="19A05558">
-      <w:pPr>
-        <w:pStyle w:val="Heading3"/>
-      </w:pPr>
-      <w:r>
-        <w:t>[TODO - Diagramme de Gantt PNG]</w:t>
-      </w:r>
-    </w:p>
-    <w:p ns2:paraId="23D2499B" ns2:textId="4FB1EFAA">
-      <w:pPr>
-        <w:pStyle w:val="Heading3"/>
-      </w:pPr>
-    </w:p>
-    <w:p ns2:paraId="3CA66DAC" ns2:textId="4068ECF4">
-      <w:pPr>
-        <w:pStyle w:val="Heading3"/>
-      </w:pPr>
-    </w:p>
-    <w:p ns2:paraId="63859C10" ns2:textId="6B9680D1">
-      <w:pPr>
-        <w:pStyle w:val="Heading3"/>
-      </w:pPr>
-    </w:p>
-    <w:p ns2:paraId="18BE4056" ns2:textId="57A63A7A">
-      <w:pPr>
-        <w:pStyle w:val="Heading3"/>
-      </w:pPr>
-    </w:p>
-    <w:p ns2:paraId="31C4B0CB" ns2:textId="586B93A8">
-      <w:pPr>
-        <w:pStyle w:val="Heading3"/>
-      </w:pPr>
-    </w:p>
-    <w:p ns2:paraId="02D4E3CA" ns2:textId="654FA6FD">
-      <w:pPr>
-        <w:pStyle w:val="Heading3"/>
-      </w:pPr>
-    </w:p>
-    <w:p ns2:paraId="602F76DA" ns2:textId="0845170B">
-      <w:pPr>
-        <w:pStyle w:val="Heading3"/>
-      </w:pPr>
-    </w:p>
-    <w:p ns2:paraId="7B4C54A6" ns2:textId="07CA2A3F">
-      <w:pPr>
-        <w:pStyle w:val="Heading3"/>
-      </w:pPr>
-    </w:p>
-    <w:p ns2:paraId="002287CE" ns2:textId="45877DCE">
-      <w:pPr>
-        <w:pStyle w:val="Heading3"/>
-      </w:pPr>
-    </w:p>
-    <w:p ns2:paraId="06F13137" ns2:textId="68C79AAF">
-      <w:pPr>
-        <w:pStyle w:val="Heading3"/>
-      </w:pPr>
-    </w:p>
-    <w:p ns2:paraId="759279B1" ns2:textId="7DF2EE97">
-      <w:pPr>
-        <w:pStyle w:val="Heading3"/>
-      </w:pPr>
-      <w:r>
-        <w:rPr/>
-        <w:t>Victor Agahi : &lt;TODO&gt;</w:t>
-      </w:r>
-    </w:p>
-    <w:p>
-      <w:r>
-        <w:t>[TODO - Diagramme de Gantt PNG]</w:t>
-      </w:r>
-    </w:p>
-    <w:p ns2:paraId="743E7DBE" ns2:textId="387A7FF8">
-      <w:pPr>
-        <w:pStyle w:val="Heading3"/>
-      </w:pPr>
-    </w:p>
-    <w:p ns2:paraId="3986BB14" ns2:textId="2B98FB88">
-      <w:pPr>
-        <w:pStyle w:val="Normal"/>
-      </w:pPr>
-    </w:p>
-    <w:p ns2:paraId="4CEF0DD0" ns2:textId="1004443F">
-      <w:pPr>
-        <w:pStyle w:val="Heading3"/>
-      </w:pPr>
-    </w:p>
-    <w:p ns2:paraId="47F87FA7" ns2:textId="5DDA5CD6">
-      <w:pPr>
-        <w:pStyle w:val="Heading3"/>
-      </w:pPr>
-    </w:p>
-    <w:p ns2:paraId="3F94F95F" ns2:textId="78910190">
-      <w:pPr>
-        <w:pStyle w:val="Heading3"/>
-      </w:pPr>
-    </w:p>
-    <w:p ns2:paraId="0610925A" ns2:textId="51AE6312">
-      <w:pPr>
-        <w:pStyle w:val="Heading3"/>
-      </w:pPr>
-    </w:p>
-    <w:p ns2:paraId="3E02751B" ns2:textId="50E41152">
-      <w:pPr>
-        <w:pStyle w:val="Heading3"/>
-      </w:pPr>
-    </w:p>
-    <w:p ns2:paraId="1E9C5ED4" ns2:textId="1FCE4BB2">
-      <w:pPr>
-        <w:pStyle w:val="Heading3"/>
-      </w:pPr>
-    </w:p>
-    <w:p ns2:paraId="73B7855C" ns2:textId="4CD3ADCD">
-      <w:pPr>
-        <w:pStyle w:val="Heading3"/>
-      </w:pPr>
-      <w:r>
-        <w:rPr/>
-        <w:t>Clément PASTEAU : &lt;TODO&gt;</w:t>
-      </w:r>
-    </w:p>
-    <w:p>
-      <w:r>
-        <w:t>[TODO - Diagramme de Gantt PNG]</w:t>
-      </w:r>
-    </w:p>
-    <w:p ns2:paraId="51BA9107" ns2:textId="16758E75">
-      <w:pPr>
-        <w:pStyle w:val="Normal"/>
-      </w:pPr>
-    </w:p>
-    <w:p ns2:paraId="53FF9D21" ns2:textId="5A915CF8">
-      <w:pPr>
-        <w:pStyle w:val="Normal"/>
-      </w:pPr>
-    </w:p>
-    <w:p ns2:paraId="2E65F484" ns2:textId="4EB24F7A">
-      <w:pPr>
-        <w:pStyle w:val="Heading1"/>
-      </w:pPr>
-      <w:bookmarkStart w:name="_Toc1517376593" w:id="213012533"/>
-      <w:r>
-        <w:rPr/>
-        <w:t>Conclusion</w:t>
-      </w:r>
-      <w:bookmarkEnd w:id="213012533"/>
-    </w:p>
-    <w:p ns2:paraId="79B31D36" ns2:textId="780CFBB1">
-      <w:pPr>
-        <w:pStyle w:val="Normal"/>
-        <w:suppressLineNumbers w:val="0"/>
-        <w:spacing w:before="240" w:beforeAutospacing="off" w:after="240" w:afterAutospacing="off" w:line="276" w:lineRule="auto"/>
-        <w:ind w:left="0" w:right="0"/>
-        <w:jc w:val="left"/>
-      </w:pPr>
-      <w:r>
-        <w:rPr>
-          <w:rFonts w:ascii="Calibri" w:hAnsi="Calibri" w:eastAsia="Calibri" w:cs="Calibri"/>
-          <w:noProof w:val="0"/>
-          <w:sz w:val="20"/>
-          <w:szCs w:val="20"/>
-          <w:lang w:val="fr-FR"/>
-        </w:rPr>
-        <w:t>[TODO] Synthèse conclusive de l'avancement global de l'équipe, métriques consolidées et perspectives d'atterrissage pour le Sprint &lt;TODO_PROJ&gt;.</w:t>
-      </w:r>
-    </w:p>
-    <w:sectPr>
-      <w:headerReference w:type="default" r:id="rId25"/>
-      <w:footerReference w:type="default" r:id="rId26"/>
-      <w:pgSz w:w="11906" w:h="16838" w:orient="portrait"/>
-      <w:pgMar w:top="2159" w:right="1418" w:bottom="1418" w:left="1418" w:header="720" w:footer="720" w:gutter="0"/>
-      <w:pgNumType w:start="1"/>
-      <w:cols w:space="708"/>
-      <w:docGrid w:linePitch="360"/>
-    </w:sectPr>
-  </w:body>
-</w:document>
+<file path=word/document.xml><?xml version='1.0' encoding='utf-8'?>
+<w:document xmlns:a="http://schemas.openxmlformats.org/drawingml/2006/main" xmlns:ns1="http://schemas.openxmlformats.org/markup-compatibility/2006" xmlns:ns10="urn:schemas-microsoft-com:vml" xmlns:ns11="urn:schemas-microsoft-com:office:office" xmlns:ns12="urn:schemas-microsoft-com:office:word" xmlns:ns2="http://schemas.microsoft.com/office/word/2010/wordml" xmlns:ns3="http://schemas.openxmlformats.org/drawingml/2006/wordprocessingDrawing" xmlns:ns4="http://schemas.microsoft.com/office/word/2010/wordprocessingDrawing" xmlns:ns6="http://schemas.microsoft.com/office/word/2010/wordprocessingShape" xmlns:ns7="http://schemas.openxmlformats.org/drawingml/2006/picture" xmlns:ns9="http://schemas.microsoft.com/office/drawing/2010/main" xmlns:r="http://schemas.openxmlformats.org/officeDocument/2006/relationships" xmlns:w="http://schemas.openxmlformats.org/wordprocessingml/2006/main" ns1:Ignorable="w14 w15 w16se w16cid w16 w16cex w16sdtdh w16sdtfl w16du wp14"><w:body><w:p ns2:paraId="2BC1A822" ns2:textId="59D56456"><w:pPr><w:rPr><w:rFonts w:eastAsia="ＭＳ ゴシック" w:eastAsiaTheme="majorEastAsia" /><w:sz w:val="72" /><w:szCs w:val="72" /></w:rPr></w:pPr><w:r><w:rPr><w:noProof /><w:lang w:eastAsia="fr-FR" /></w:rPr><ns1:AlternateContent><ns1:Choice Requires="wps"><w:drawing><ns3:anchor distT="0" distB="0" distL="114300" distR="114300" simplePos="0" relativeHeight="251658241" behindDoc="0" locked="0" layoutInCell="1" allowOverlap="1" ns4:anchorId="1C40C158" ns4:editId="27E1A219"><ns3:simplePos x="0" y="0" /><ns3:positionH relativeFrom="margin"><ns3:posOffset>-546470</ns3:posOffset></ns3:positionH><ns3:positionV relativeFrom="margin"><ns3:posOffset>4952654</ns3:posOffset></ns3:positionV><ns3:extent cx="2133600" cy="1962150" /><ns3:effectExtent l="0" t="0" r="0" b="0" /><ns3:wrapNone /><ns3:docPr id="387" name="Zone de texte 387" /><ns3:cNvGraphicFramePr /><a:graphic><a:graphicData uri="http://schemas.microsoft.com/office/word/2010/wordprocessingShape"><ns6:wsp><ns6:cNvSpPr /><ns6:spPr><a:xfrm><a:off x="0" y="0" /><a:ext cx="2133600" cy="1962150" /></a:xfrm><a:prstGeom prst="rect"><a:avLst /></a:prstGeom><a:noFill /><a:ln w="6350"><a:noFill /></a:ln></ns6:spPr><ns6:style><a:lnRef idx="0"><a:schemeClr val="accent1" /></a:lnRef><a:fillRef idx="0"><a:schemeClr val="accent1" /></a:fillRef><a:effectRef idx="0"><a:scrgbClr r="0" g="0" b="0" /></a:effectRef><a:fontRef idx="minor"><a:schemeClr val="dk1" /></a:fontRef></ns6:style><ns6:txbx><w:txbxContent><w:p><w:pPr><w:spacing w:line="276" w:lineRule="auto" /><w:rPr><w:rFonts w:hAnsi="Calibri" w:eastAsia="Calibri" w:cs="Calibri" /><w:color w:val="595959" /><w:kern w:val="0" /><w:sz w:val="28" /><w:szCs w:val="28" /><w:lang w:val="en-US" /><ns2:ligatures ns2:val="none" /></w:rPr></w:pPr><w:r><w:rPr><w:rFonts w:hAnsi="Calibri" w:eastAsia="Calibri" w:cs="Calibri" /><w:color w:val="595959" /><w:sz w:val="28" /><w:szCs w:val="28" /><w:lang w:val="en-US" /></w:rPr><w:t>Victor Agahi, Cl</w:t></w:r><w:r><w:rPr><w:rFonts w:hAnsi="Calibri" w:eastAsia="Calibri" w:cs="Calibri" /><w:color w:val="595959" /><w:sz w:val="28" /><w:szCs w:val="28" /><w:lang w:val="en-US" /></w:rPr><w:t>é</w:t></w:r><w:r><w:rPr><w:rFonts w:hAnsi="Calibri" w:eastAsia="Calibri" w:cs="Calibri" /><w:color w:val="595959" /><w:sz w:val="28" /><w:szCs w:val="28" /><w:lang w:val="en-US" /></w:rPr><w:t>ment Pasteau, Victor Giroud</w:t></w:r></w:p><w:p><w:pPr><w:spacing w:line="276" w:lineRule="auto" /><w:rPr><w:rFonts w:hAnsi="Calibri" w:eastAsia="Calibri" w:cs="Calibri" /><w:color w:val="A6A6A6" /><w:lang w:val="en-US" /></w:rPr></w:pPr><w:r><w:rPr><w:rFonts w:hAnsi="Calibri" w:eastAsia="Calibri" w:cs="Calibri" /><w:color w:val="A6A6A6" /><w:lang w:val="en-US" /></w:rPr><w:t>PLIC</w:t></w:r></w:p><w:p><w:pPr><w:spacing w:line="276" w:lineRule="auto" /><w:rPr><w:rFonts w:hAnsi="Calibri" w:eastAsia="Calibri" w:cs="Calibri" /><w:color w:val="A6A6A6" /><w:lang w:val="en-US" /></w:rPr></w:pPr><w:r><w:rPr><w:rFonts w:hAnsi="Calibri" w:eastAsia="Calibri" w:cs="Calibri" /><w:color w:val="A6A6A6" /><w:lang w:val="en-US" /></w:rPr><w:t>14 Pages</w:t></w:r></w:p><w:p><w:pPr><w:spacing w:line="276" w:lineRule="auto" /><w:rPr><w:rFonts w:hAnsi="Calibri" w:eastAsia="Calibri" w:cs="Calibri" /><w:color w:val="A6A6A6" /><w:lang w:val="en-US" /></w:rPr></w:pPr><w:r><w:rPr><w:rFonts w:hAnsi="Calibri" w:eastAsia="Calibri" w:cs="Calibri" /><w:color w:val="A6A6A6" /><w:lang w:val="en-US" /></w:rPr><w:t>&lt;DATE_TODO&gt;</w:t></w:r></w:p><w:p><w:pPr><w:spacing w:line="276" w:lineRule="auto" /><w:rPr><w:rFonts w:hAnsi="Calibri" w:eastAsia="Calibri" w:cs="Calibri" /><w:color w:val="A6A6A6" /><w:lang w:val="en-US" /></w:rPr></w:pPr><w:r><w:rPr><w:rFonts w:hAnsi="Calibri" w:eastAsia="Calibri" w:cs="Calibri" /><w:color w:val="A6A6A6" /><w:lang w:val="en-US" /></w:rPr><w:t>Version 1.0</w:t></w:r></w:p></w:txbxContent></ns6:txbx><ns6:bodyPr spcFirstLastPara="0" wrap="square" lIns="91440" tIns="182880" rIns="91440" bIns="91440" anchor="t"><a:noAutofit /></ns6:bodyPr></ns6:wsp></a:graphicData></a:graphic><ns4:sizeRelH relativeFrom="margin"><ns4:pctWidth>0</ns4:pctWidth></ns4:sizeRelH><ns4:sizeRelV relativeFrom="margin"><ns4:pctHeight>0</ns4:pctHeight></ns4:sizeRelV></ns3:anchor></w:drawing></ns1:Choice><ns1:Fallback /></ns1:AlternateContent></w:r><w:r><w:rPr><w:rFonts w:eastAsiaTheme="majorEastAsia" /><w:noProof /><w:sz w:val="72" /><w:szCs w:val="72" /><w:lang w:eastAsia="fr-FR" /></w:rPr><w:drawing><ns3:anchor distT="0" distB="0" distL="114300" distR="114300" simplePos="0" relativeHeight="251658243" behindDoc="0" locked="0" layoutInCell="1" allowOverlap="1" ns4:anchorId="6BAA5425" ns4:editId="006AFBF1"><ns3:simplePos x="0" y="0" /><ns3:positionH relativeFrom="margin"><ns3:posOffset>4653280</ns3:posOffset></ns3:positionH><ns3:positionV relativeFrom="margin"><ns3:posOffset>7777480</ns3:posOffset></ns3:positionV><ns3:extent cx="1656080" cy="1121410" /><ns3:effectExtent l="0" t="0" r="1270" b="2540" /><ns3:wrapSquare wrapText="bothSides" /><ns3:docPr id="5" name="Image 5" /><ns3:cNvGraphicFramePr><a:graphicFrameLocks noChangeAspect="1" /></ns3:cNvGraphicFramePr><a:graphic><a:graphicData uri="http://schemas.openxmlformats.org/drawingml/2006/picture"><ns7:pic><ns7:nvPicPr><ns7:cNvPr id="0" name="Picture 4" descr="C:\Users\Antoine\Dropbox\MTI\template\logoepita.png" /><ns7:cNvPicPr><a:picLocks noChangeAspect="1" noChangeArrowheads="1" /></ns7:cNvPicPr></ns7:nvPicPr><ns7:blipFill><a:blip r:embed="rId16" cstate="print"><a:extLst><a:ext uri="{28A0092B-C50C-407E-A947-70E740481C1C}"><ns9:useLocalDpi val="0" /></a:ext></a:extLst></a:blip><a:stretch><a:fillRect /></a:stretch></ns7:blipFill><ns7:spPr bwMode="auto"><a:xfrm><a:off x="0" y="0" /><a:ext cx="1656080" cy="1121410" /></a:xfrm><a:prstGeom prst="rect"><a:avLst /></a:prstGeom><a:noFill /><a:ln><a:noFill /></a:ln></ns7:spPr></ns7:pic></a:graphicData></a:graphic><ns4:sizeRelH relativeFrom="margin"><ns4:pctWidth>0</ns4:pctWidth></ns4:sizeRelH><ns4:sizeRelV relativeFrom="margin"><ns4:pctHeight>0</ns4:pctHeight></ns4:sizeRelV></ns3:anchor></w:drawing></w:r><w:r><w:rPr><w:noProof /><w:lang w:eastAsia="fr-FR" /></w:rPr><w:drawing><ns3:anchor distT="0" distB="0" distL="114300" distR="114300" simplePos="0" relativeHeight="251658245" behindDoc="1" locked="0" layoutInCell="1" allowOverlap="1" ns4:anchorId="6273C76F" ns4:editId="4B028B8C"><ns3:simplePos x="0" y="0" /><ns3:positionH relativeFrom="column"><ns3:posOffset>2804768</ns3:posOffset></ns3:positionH><ns3:positionV relativeFrom="paragraph"><ns3:posOffset>6694018</ns3:posOffset></ns3:positionV><ns3:extent cx="1610412" cy="1060704" /><ns3:effectExtent l="0" t="0" r="8890" b="6350" /><ns3:wrapNone /><ns3:docPr id="6" name="Image 0" descr="mti.jpg" /><ns3:cNvGraphicFramePr><a:graphicFrameLocks noChangeAspect="1" /></ns3:cNvGraphicFramePr><a:graphic><a:graphicData uri="http://schemas.openxmlformats.org/drawingml/2006/picture"><ns7:pic><ns7:nvPicPr><ns7:cNvPr id="0" name="mti.jpg" /><ns7:cNvPicPr /></ns7:nvPicPr><ns7:blipFill><a:blip r:embed="rId17" /><a:stretch><a:fillRect /></a:stretch></ns7:blipFill><ns7:spPr><a:xfrm><a:off x="0" y="0" /><a:ext cx="1610412" cy="1060704" /></a:xfrm><a:prstGeom prst="rect"><a:avLst /></a:prstGeom></ns7:spPr></ns7:pic></a:graphicData></a:graphic><ns4:sizeRelH relativeFrom="margin"><ns4:pctWidth>0</ns4:pctWidth></ns4:sizeRelH><ns4:sizeRelV relativeFrom="margin"><ns4:pctHeight>0</ns4:pctHeight></ns4:sizeRelV></ns3:anchor></w:drawing></w:r><w:r><w:rPr><w:noProof /><w:lang w:eastAsia="fr-FR" /></w:rPr><ns1:AlternateContent><ns1:Choice Requires="wps"><w:drawing><ns3:anchor distT="0" distB="0" distL="114300" distR="114300" simplePos="0" relativeHeight="251658242" behindDoc="0" locked="0" layoutInCell="1" allowOverlap="1" ns4:anchorId="4874BC9C" ns4:editId="4174919A"><ns3:simplePos x="0" y="0" /><ns3:positionH relativeFrom="column"><ns3:posOffset>-545465</ns3:posOffset></ns3:positionH><ns3:positionV relativeFrom="paragraph"><ns3:posOffset>2917190</ns3:posOffset></ns3:positionV><ns3:extent cx="5403215" cy="450850" /><ns3:effectExtent l="0" t="0" r="0" b="6350" /><ns3:wrapNone /><ns3:docPr id="1" name="Zone de texte 1" /><ns3:cNvGraphicFramePr /><a:graphic><a:graphicData uri="http://schemas.microsoft.com/office/word/2010/wordprocessingShape"><ns6:wsp><ns6:cNvSpPr /><ns6:spPr><a:xfrm><a:off x="0" y="0" /><a:ext cx="5403215" cy="450850" /></a:xfrm><a:prstGeom prst="rect"><a:avLst /></a:prstGeom><a:noFill /><a:ln w="6350"><a:noFill /></a:ln></ns6:spPr><ns6:style><a:lnRef idx="0"><a:schemeClr val="accent1" /></a:lnRef><a:fillRef idx="0"><a:schemeClr val="accent1" /></a:fillRef><a:effectRef idx="0"><a:scrgbClr r="0" g="0" b="0" /></a:effectRef><a:fontRef idx="minor"><a:schemeClr val="dk1" /></a:fontRef></ns6:style><ns6:txbx><w:txbxContent><w:p><w:pPr><w:spacing w:line="276" w:lineRule="auto" /><w:rPr><w:rFonts w:hAnsi="Calibri" w:eastAsia="Calibri" w:cs="Calibri" /><w:color w:val="000000" /><w:kern w:val="0" /><w:sz w:val="32" /><w:szCs w:val="32" /><w:lang w:val="en-US" /><ns2:ligatures ns2:val="none" /></w:rPr></w:pPr><w:r><w:rPr><w:rFonts w:hAnsi="Calibri" w:eastAsia="Calibri" w:cs="Calibri" /><w:color w:val="000000" /><w:sz w:val="32" /><w:szCs w:val="32" /><w:lang w:val="en-US" /></w:rPr><w:t>Coaching &lt;TODO&gt; - PLIC</w:t></w:r></w:p></w:txbxContent></ns6:txbx><ns6:bodyPr spcFirstLastPara="0" wrap="square" lIns="91440" tIns="45720" rIns="91440" bIns="45720" anchor="t"><a:noAutofit /></ns6:bodyPr></ns6:wsp></a:graphicData></a:graphic><ns4:sizeRelH relativeFrom="margin"><ns4:pctWidth>0</ns4:pctWidth></ns4:sizeRelH><ns4:sizeRelV relativeFrom="margin"><ns4:pctHeight>0</ns4:pctHeight></ns4:sizeRelV></ns3:anchor></w:drawing></ns1:Choice><ns1:Fallback /></ns1:AlternateContent></w:r><w:r><w:rPr><w:rFonts w:eastAsiaTheme="majorEastAsia" /><w:noProof /><w:sz w:val="72" /><w:szCs w:val="72" /><w:lang w:eastAsia="fr-FR" /></w:rPr><ns1:AlternateContent><ns1:Choice Requires="wps"><w:drawing><ns3:anchor distT="0" distB="0" distL="114300" distR="114300" simplePos="0" relativeHeight="251658244" behindDoc="0" locked="0" layoutInCell="1" allowOverlap="1" ns4:anchorId="30028E1F" ns4:editId="6D13188C"><ns3:simplePos x="0" y="0" /><ns3:positionH relativeFrom="column"><ns3:posOffset>-613410</ns3:posOffset></ns3:positionH><ns3:positionV relativeFrom="paragraph"><ns3:posOffset>1844477</ns3:posOffset></ns3:positionV><ns3:extent cx="6424295" cy="1403985" /><ns3:effectExtent l="0" t="0" r="0" b="2540" /><ns3:wrapNone /><ns3:docPr id="307" name="Zone de texte 2" /><ns3:cNvGraphicFramePr><a:graphicFrameLocks /></ns3:cNvGraphicFramePr><a:graphic><a:graphicData uri="http://schemas.microsoft.com/office/word/2010/wordprocessingShape"><ns6:wsp><ns6:cNvSpPr txBox="1"><a:spLocks noChangeArrowheads="1" /></ns6:cNvSpPr><ns6:spPr bwMode="auto"><a:xfrm><a:off x="0" y="0" /><a:ext cx="6424295" cy="1403985" /></a:xfrm><a:prstGeom prst="rect"><a:avLst /></a:prstGeom><a:solidFill><a:srgbClr val="FFFFFF" /></a:solidFill><a:ln w="9525"><a:noFill /><a:miter lim="800000" /><a:headEnd /><a:tailEnd /></a:ln></ns6:spPr><ns6:txbx><w:txbxContent><w:sdt><w:sdtPr><w:rPr><w:sz w:val="96" /></w:rPr><w:alias w:val="Titre " /><w:tag w:val="" /><w:id w:val="304435510" /><w:dataBinding w:prefixMappings="xmlns:ns0='http://purl.org/dc/elements/1.1/' xmlns:ns1='http://schemas.openxmlformats.org/package/2006/metadata/core-properties' " w:xpath="/ns1:coreProperties[1]/ns0:title[1]" w:storeItemID="{6C3C8BC8-F283-45AE-878A-BAB7291924A1}" /><w:text /></w:sdtPr><w:sdtContent><w:p ns2:paraId="57EB5670" ns2:textId="60F54886"><w:pPr><w:rPr><w:sz w:val="96" /></w:rPr></w:pPr><w:r><w:rPr><w:sz w:val="96" /></w:rPr><w:t>Rapport de suivi</w:t></w:r></w:p></w:sdtContent></w:sdt></w:txbxContent></ns6:txbx><ns6:bodyPr rot="0" vert="horz" wrap="square" lIns="91440" tIns="45720" rIns="91440" bIns="45720" anchor="t" anchorCtr="0"><a:spAutoFit /></ns6:bodyPr></ns6:wsp></a:graphicData></a:graphic><ns4:sizeRelH relativeFrom="margin"><ns4:pctWidth>0</ns4:pctWidth></ns4:sizeRelH><ns4:sizeRelV relativeFrom="margin"><ns4:pctHeight>20000</ns4:pctHeight></ns4:sizeRelV></ns3:anchor></w:drawing></ns1:Choice><ns1:Fallback><w:pict><ns10:shape id="Zone de texte 2" style="position:absolute;margin-left:-48.3pt;margin-top:145.25pt;width:505.85pt;height:110.55pt;z-index:251658245;visibility:visible;mso-wrap-style:square;mso-width-percent:0;mso-height-percent:200;mso-wrap-distance-left:9pt;mso-wrap-distance-top:0;mso-wrap-distance-right:9pt;mso-wrap-distance-bottom:0;mso-position-horizontal:absolute;mso-position-horizontal-relative:text;mso-position-vertical:absolute;mso-position-vertical-relative:text;mso-width-percent:0;mso-height-percent:200;mso-width-relative:margin;mso-height-relative:margin;v-text-anchor:top" ns11:spid="_x0000_s1028" stroked="f" type="#_x0000_t202" ns11:gfxdata="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" ns2:anchorId="30028E1F"><ns10:textbox style="mso-fit-shape-to-text:t"><w:txbxContent><w:sdt><w:sdtPr><w:rPr><w:sz w:val="96" /></w:rPr><w:alias w:val="Titre " /><w:tag w:val="" /><w:id w:val="304435510" /><w:dataBinding w:prefixMappings="xmlns:ns0='http://purl.org/dc/elements/1.1/' xmlns:ns1='http://schemas.openxmlformats.org/package/2006/metadata/core-properties' " w:xpath="/ns1:coreProperties[1]/ns0:title[1]" w:storeItemID="{6C3C8BC8-F283-45AE-878A-BAB7291924A1}" /><w:text /></w:sdtPr><w:sdtContent><w:p ns2:paraId="57EB5670" ns2:textId="60F54886"><w:pPr><w:rPr><w:sz w:val="96" /></w:rPr></w:pPr><w:r><w:rPr><w:sz w:val="96" /></w:rPr><w:t>Rapport de suivi</w:t></w:r></w:p></w:sdtContent></w:sdt></w:txbxContent></ns10:textbox></ns10:shape></w:pict></ns1:Fallback></ns1:AlternateContent></w:r><w:r><w:rPr><w:noProof /><w:lang w:eastAsia="fr-FR" /></w:rPr><ns1:AlternateContent><ns1:Choice Requires="wps"><w:drawing><ns3:anchor distT="0" distB="0" distL="114300" distR="114300" simplePos="0" relativeHeight="251658240" behindDoc="1" locked="0" layoutInCell="1" allowOverlap="1" ns4:anchorId="10A1922C" ns4:editId="21715743"><ns3:simplePos x="0" y="0" /><ns3:positionH relativeFrom="margin"><ns3:align>center</ns3:align></ns3:positionH><ns1:AlternateContent><ns1:Choice Requires="wp14"><ns3:positionV relativeFrom="margin"><ns4:pctPosVOffset>59000</ns4:pctPosVOffset></ns3:positionV></ns1:Choice><ns1:Fallback><ns3:positionV relativeFrom="page"><ns3:posOffset>6178550</ns3:posOffset></ns3:positionV></ns1:Fallback></ns1:AlternateContent><ns3:extent cx="7718887" cy="3703320" /><ns3:effectExtent l="0" t="0" r="0" b="0" /><ns3:wrapNone /><ns3:docPr id="388" name="Rectangle 388" /><ns3:cNvGraphicFramePr /><a:graphic><a:graphicData uri="http://schemas.microsoft.com/office/word/2010/wordprocessingShape"><ns6:wsp><ns6:cNvSpPr /><ns6:spPr><a:xfrm><a:off x="0" y="0" /><a:ext cx="7718887" cy="3703320" /></a:xfrm><a:prstGeom prst="rect"><a:avLst /></a:prstGeom><a:noFill /><a:ln><a:noFill /></a:ln></ns6:spPr><ns6:style><a:lnRef idx="2"><a:schemeClr val="accent1"><a:shade val="50000" /></a:schemeClr></a:lnRef><a:fillRef idx="1003"><a:schemeClr val="lt1" /></a:fillRef><a:effectRef idx="0"><a:schemeClr val="accent1" /></a:effectRef><a:fontRef idx="minor"><a:schemeClr val="lt1" /></a:fontRef></ns6:style><ns6:txbx><w:txbxContent><w:p ns2:paraId="4B4C82AF" ns2:textId="77777777"><w:pPr><w:jc w:val="center" /></w:pPr></w:p></w:txbxContent></ns6:txbx><ns6:bodyPr rot="0" spcFirstLastPara="0" vertOverflow="overflow" horzOverflow="overflow" vert="horz" wrap="square" lIns="91440" tIns="45720" rIns="91440" bIns="45720" numCol="1" spcCol="0" rtlCol="0" fromWordArt="0" anchor="ctr" anchorCtr="0" forceAA="0" compatLnSpc="1"><a:prstTxWarp prst="textNoShape"><a:avLst /></a:prstTxWarp><a:noAutofit /></ns6:bodyPr></ns6:wsp></a:graphicData></a:graphic><ns4:sizeRelH relativeFrom="margin"><ns4:pctWidth>0</ns4:pctWidth></ns4:sizeRelH><ns4:sizeRelV relativeFrom="margin"><ns4:pctHeight>45000</ns4:pctHeight></ns4:sizeRelV></ns3:anchor></w:drawing></ns1:Choice><ns1:Fallback><w:pict><ns10:rect id="Rectangle 388" style="position:absolute;margin-left:0;margin-top:0;width:607.8pt;height:291.6pt;z-index:-251658240;visibility:visible;mso-wrap-style:square;mso-width-percent:0;mso-height-percent:450;mso-top-percent:590;mso-wrap-distance-left:9pt;mso-wrap-distance-top:0;mso-wrap-distance-right:9pt;mso-wrap-distance-bottom:0;mso-position-horizontal:center;mso-position-horizontal-relative:margin;mso-position-vertical-relative:margin;mso-width-percent:0;mso-height-percent:450;mso-top-percent:590;mso-width-relative:margin;mso-height-relative:margin;v-text-anchor:middle" ns11:spid="_x0000_s1029" filled="f" stroked="f" strokeweight="2pt" ns2:anchorId="10A1922C" ns11:gfxdata="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"><ns10:textbox><w:txbxContent><w:p ns2:paraId="4B4C82AF" ns2:textId="77777777"><w:pPr><w:jc w:val="center" /></w:pPr></w:p></w:txbxContent></ns10:textbox><ns12:wrap anchorx="margin" anchory="margin" /></ns10:rect></w:pict></ns1:Fallback></ns1:AlternateContent></w:r></w:p><w:p ns2:paraId="2461F8B5" ns2:textId="20428966"><w:pPr><w:pStyle w:val="Normal" /><w:sectPr><w:headerReference w:type="default" r:id="rId12" /><w:footerReference w:type="default" r:id="rId13" /><w:headerReference w:type="first" r:id="rId14" /><w:footerReference w:type="first" r:id="rId15" /><w:pgSz w:w="11906" w:h="16838" w:orient="portrait" /><w:pgMar w:top="1134" w:right="1134" w:bottom="1134" w:left="1134" w:header="709" w:footer="709" w:gutter="0" /><w:pgNumType w:start="0" /><w:cols w:space="708" /><w:titlePg /><w:docGrid w:linePitch="360" /></w:sectPr></w:pPr></w:p><w:p ns2:paraId="3F5BF519" ns2:textId="77777777"><w:pPr><w:rPr><w:b /><w:bCs /><w:sz w:val="28" /><w:szCs w:val="28" /></w:rPr></w:pPr><w:r><w:rPr><w:b /><w:bCs /><w:sz w:val="28" /><w:szCs w:val="28" /></w:rPr><w:t>Propriétés du document</w:t></w:r></w:p><w:tbl><w:tblPr><w:tblStyle w:val="MediumList2" /><w:tblW w:w="9912" w:type="dxa" /><w:tblLook w:val="04A0" w:firstRow="1" w:lastRow="0" w:firstColumn="1" w:lastColumn="0" w:noHBand="0" w:noVBand="1" /></w:tblPr><w:tblGrid><w:gridCol w:w="2126" /><w:gridCol w:w="7786" /></w:tblGrid><w:tr ns2:paraId="108D18C6" ns2:textId="77777777"><w:trPr><w:cnfStyle w:val="100000000000" w:firstRow="1" w:lastRow="0" w:firstColumn="0" w:lastColumn="0" w:oddVBand="0" w:evenVBand="0" w:oddHBand="0" w:evenHBand="0" w:firstRowFirstColumn="0" w:firstRowLastColumn="0" w:lastRowFirstColumn="0" w:lastRowLastColumn="0" /></w:trPr><w:tc><w:tcPr><w:cnfStyle w:val="001000000100" w:firstRow="0" w:lastRow="0" w:firstColumn="1" w:lastColumn="0" w:oddVBand="0" w:evenVBand="0" w:oddHBand="0" w:evenHBand="0" w:firstRowFirstColumn="1" w:firstRowLastColumn="0" w:lastRowFirstColumn="0" w:lastRowLastColumn="0" /><w:tcW w:w="2126" w:type="dxa" /><w:tcBorders><w:right w:val="single" w:color="000000" w:themeColor="text1" w:sz="8" w:space="0" /></w:tcBorders><w:tcMar /></w:tcPr><w:p ns2:paraId="45D68444" ns2:textId="77777777"><w:pPr><w:rPr><w:rFonts w:ascii="Calibri" w:hAnsi="Calibri" /><w:b /><w:bCs /></w:rPr></w:pPr><w:r><w:rPr><w:rFonts w:ascii="Calibri" w:hAnsi="Calibri" /><w:b /><w:bCs /></w:rPr><w:t>Auteur</w:t></w:r></w:p></w:tc><w:tc><w:tcPr><w:cnfStyle w:val="000000000000" w:firstRow="0" w:lastRow="0" w:firstColumn="0" w:lastColumn="0" w:oddVBand="0" w:evenVBand="0" w:oddHBand="0" w:evenHBand="0" w:firstRowFirstColumn="0" w:firstRowLastColumn="0" w:lastRowFirstColumn="0" w:lastRowLastColumn="0" /><w:tcW w:w="7786" w:type="dxa" /><w:tcBorders><w:left w:val="single" w:color="000000" w:themeColor="text1" w:sz="8" w:space="0" /></w:tcBorders><w:tcMar /></w:tcPr><w:p ns2:paraId="519D09C8" ns2:textId="17B2AD1B"><w:pPr><w:cnfStyle w:val="100000000000" w:firstRow="1" w:lastRow="0" w:firstColumn="0" w:lastColumn="0" w:oddVBand="0" w:evenVBand="0" w:oddHBand="0" w:evenHBand="0" w:firstRowFirstColumn="0" w:firstRowLastColumn="0" w:lastRowFirstColumn="0" w:lastRowLastColumn="0" /><w:rPr><w:rFonts w:ascii="Calibri" w:hAnsi="Calibri" /><w:b /><w:bCs /><w:color w:val="auto" /></w:rPr></w:pPr><w:sdt><w:sdtPr><w:rPr><w:rFonts w:ascii="Calibri" w:hAnsi="Calibri" /></w:rPr><w:alias w:val="Auteur" /><w:id w:val="18285934" /><w:dataBinding w:prefixMappings="xmlns:ns0='http://schemas.openxmlformats.org/package/2006/metadata/core-properties' xmlns:ns1='http://purl.org/dc/elements/1.1/'" w:xpath="/ns0:coreProperties[1]/ns1:creator[1]" w:storeItemID="{6C3C8BC8-F283-45AE-878A-BAB7291924A1}" /><w:text /></w:sdtPr><w:sdtContent><w:r><w:rPr><w:rFonts w:ascii="Calibri" w:hAnsi="Calibri" /></w:rPr><w:t>Victor Agahi, Clément Pasteau, Victor Giroud, Damien Lugagne</w:t></w:r></w:sdtContent></w:sdt></w:p></w:tc></w:tr><w:tr ns2:paraId="6D083C86" ns2:textId="77777777"><w:trPr><w:cnfStyle w:val="000000100000" w:firstRow="0" w:lastRow="0" w:firstColumn="0" w:lastColumn="0" w:oddVBand="0" w:evenVBand="0" w:oddHBand="1" w:evenHBand="0" w:firstRowFirstColumn="0" w:firstRowLastColumn="0" w:lastRowFirstColumn="0" w:lastRowLastColumn="0" /></w:trPr><w:tc><w:tcPr><w:cnfStyle w:val="001000000000" w:firstRow="0" w:lastRow="0" w:firstColumn="1" w:lastColumn="0" w:oddVBand="0" w:evenVBand="0" w:oddHBand="0" w:evenHBand="0" w:firstRowFirstColumn="0" w:firstRowLastColumn="0" w:lastRowFirstColumn="0" w:lastRowLastColumn="0" /><w:tcW w:w="2126" w:type="dxa" /><w:tcMar /></w:tcPr><w:p ns2:paraId="0FFC129D" ns2:textId="77777777"><w:pPr><w:rPr><w:rFonts w:ascii="Calibri" w:hAnsi="Calibri" /><w:b /><w:bCs /></w:rPr></w:pPr><w:r><w:rPr><w:rFonts w:ascii="Calibri" w:hAnsi="Calibri" /><w:b /><w:bCs /></w:rPr><w:t>Version</w:t></w:r></w:p></w:tc><w:tc><w:tcPr><w:cnfStyle w:val="000000000000" w:firstRow="0" w:lastRow="0" w:firstColumn="0" w:lastColumn="0" w:oddVBand="0" w:evenVBand="0" w:oddHBand="0" w:evenHBand="0" w:firstRowFirstColumn="0" w:firstRowLastColumn="0" w:lastRowFirstColumn="0" w:lastRowLastColumn="0" /><w:tcW w:w="7786" w:type="dxa" /><w:tcMar /></w:tcPr><w:p ns2:paraId="5462CABB" ns2:textId="77777777"><w:pPr><w:tabs><w:tab w:val="left" w:pos="3254" /></w:tabs><w:cnfStyle w:val="000000100000" w:firstRow="0" w:lastRow="0" w:firstColumn="0" w:lastColumn="0" w:oddVBand="0" w:evenVBand="0" w:oddHBand="1" w:evenHBand="0" w:firstRowFirstColumn="0" w:firstRowLastColumn="0" w:lastRowFirstColumn="0" w:lastRowLastColumn="0" /><w:rPr><w:rFonts w:ascii="Calibri" w:hAnsi="Calibri" /><w:color w:val="auto" /></w:rPr></w:pPr><w:r><w:t>1.0</w:t></w:r></w:p></w:tc></w:tr><w:tr ns2:paraId="020D465A" ns2:textId="77777777"><w:trPr><w:cnfStyle w:val="000000010000" w:firstRow="0" w:lastRow="0" w:firstColumn="0" w:lastColumn="0" w:oddVBand="0" w:evenVBand="0" w:oddHBand="0" w:evenHBand="1" w:firstRowFirstColumn="0" w:firstRowLastColumn="0" w:lastRowFirstColumn="0" w:lastRowLastColumn="0" /></w:trPr><w:tc><w:tcPr><w:cnfStyle w:val="001000000000" w:firstRow="0" w:lastRow="0" w:firstColumn="1" w:lastColumn="0" w:oddVBand="0" w:evenVBand="0" w:oddHBand="0" w:evenHBand="0" w:firstRowFirstColumn="0" w:firstRowLastColumn="0" w:lastRowFirstColumn="0" w:lastRowLastColumn="0" /><w:tcW w:w="2126" w:type="dxa" /><w:tcMar /></w:tcPr><w:p ns2:paraId="7006E3A7" ns2:textId="7EFE10DB"><w:pPr><w:rPr><w:rFonts w:ascii="Calibri" w:hAnsi="Calibri" /><w:b /><w:bCs /></w:rPr></w:pPr><w:r><w:rPr><w:rFonts w:ascii="Calibri" w:hAnsi="Calibri" /><w:b /><w:bCs /></w:rPr><w:t xml:space="preserve"> </w:t></w:r><w:r><w:rPr><w:rFonts w:ascii="Calibri" w:hAnsi="Calibri" /><w:b /><w:bCs /></w:rPr><w:t>Nombre de pages</w:t></w:r></w:p></w:tc><w:tc><w:tcPr><w:cnfStyle w:val="000000000000" w:firstRow="0" w:lastRow="0" w:firstColumn="0" w:lastColumn="0" w:oddVBand="0" w:evenVBand="0" w:oddHBand="0" w:evenHBand="0" w:firstRowFirstColumn="0" w:firstRowLastColumn="0" w:lastRowFirstColumn="0" w:lastRowLastColumn="0" /><w:tcW w:w="7786" w:type="dxa" /><w:tcMar /></w:tcPr><w:p ns2:paraId="53586AFD" ns2:textId="6612804A"><w:pPr><w:cnfStyle w:val="000000010000" w:firstRow="0" w:lastRow="0" w:firstColumn="0" w:lastColumn="0" w:oddVBand="0" w:evenVBand="0" w:oddHBand="0" w:evenHBand="1" w:firstRowFirstColumn="0" w:firstRowLastColumn="0" w:lastRowFirstColumn="0" w:lastRowLastColumn="0" /><w:rPr><w:rFonts w:ascii="Calibri" w:hAnsi="Calibri" /></w:rPr></w:pPr></w:p></w:tc></w:tr><w:tr ns2:paraId="569030F9" ns2:textId="77777777"><w:trPr><w:cnfStyle w:val="000000100000" w:firstRow="0" w:lastRow="0" w:firstColumn="0" w:lastColumn="0" w:oddVBand="0" w:evenVBand="0" w:oddHBand="1" w:evenHBand="0" w:firstRowFirstColumn="0" w:firstRowLastColumn="0" w:lastRowFirstColumn="0" w:lastRowLastColumn="0" /><w:trHeight w:val="405" /></w:trPr><w:tc><w:tcPr><w:cnfStyle w:val="001000000000" w:firstRow="0" w:lastRow="0" w:firstColumn="1" w:lastColumn="0" w:oddVBand="0" w:evenVBand="0" w:oddHBand="0" w:evenHBand="0" w:firstRowFirstColumn="0" w:firstRowLastColumn="0" w:lastRowFirstColumn="0" w:lastRowLastColumn="0" /><w:tcW w:w="2126" w:type="dxa" /><w:tcMar /></w:tcPr><w:p ns2:paraId="5250A763" ns2:textId="77777777"><w:pPr><w:rPr><w:rFonts w:ascii="Calibri" w:hAnsi="Calibri" /><w:b /><w:bCs /></w:rPr></w:pPr><w:r><w:rPr><w:rFonts w:ascii="Calibri" w:hAnsi="Calibri" /><w:b /><w:bCs /></w:rPr><w:t>Références</w:t></w:r></w:p></w:tc><w:tc><w:tcPr><w:cnfStyle w:val="000000000000" w:firstRow="0" w:lastRow="0" w:firstColumn="0" w:lastColumn="0" w:oddVBand="0" w:evenVBand="0" w:oddHBand="0" w:evenHBand="0" w:firstRowFirstColumn="0" w:firstRowLastColumn="0" w:lastRowFirstColumn="0" w:lastRowLastColumn="0" /><w:tcW w:w="7786" w:type="dxa" /><w:tcMar /></w:tcPr><w:sdt><w:sdtPr><w:alias w:val="Mots clés " /><w:id w:val="-73124330" /><w:dataBinding w:prefixMappings="xmlns:ns0='http://purl.org/dc/elements/1.1/' xmlns:ns1='http://schemas.openxmlformats.org/package/2006/metadata/core-properties' " w:xpath="/ns1:coreProperties[1]/ns1:keywords[1]" w:storeItemID="{6C3C8BC8-F283-45AE-878A-BAB7291924A1}" /><w:text /></w:sdtPr><w:sdtContent><w:p ns2:paraId="7B325FC0" ns2:textId="668AE4C6"><w:pPr><w:cnfStyle w:val="000000100000" w:firstRow="0" w:lastRow="0" w:firstColumn="0" w:lastColumn="0" w:oddVBand="0" w:evenVBand="0" w:oddHBand="1" w:evenHBand="0" w:firstRowFirstColumn="0" w:firstRowLastColumn="0" w:lastRowFirstColumn="0" w:lastRowLastColumn="0" /><w:rPr><w:rFonts w:eastAsiaTheme="minorEastAsia" /><w:color w:val="auto" /></w:rPr></w:pPr><w:r><w:t>PLIC</w:t></w:r></w:p></w:sdtContent></w:sdt></w:tc></w:tr><w:tr ns2:paraId="1FFB7186" ns2:textId="77777777"><w:trPr><w:cnfStyle w:val="000000010000" w:firstRow="0" w:lastRow="0" w:firstColumn="0" w:lastColumn="0" w:oddVBand="0" w:evenVBand="0" w:oddHBand="0" w:evenHBand="1" w:firstRowFirstColumn="0" w:firstRowLastColumn="0" w:lastRowFirstColumn="0" w:lastRowLastColumn="0" /></w:trPr><w:tc><w:tcPr><w:cnfStyle w:val="001000000000" w:firstRow="0" w:lastRow="0" w:firstColumn="1" w:lastColumn="0" w:oddVBand="0" w:evenVBand="0" w:oddHBand="0" w:evenHBand="0" w:firstRowFirstColumn="0" w:firstRowLastColumn="0" w:lastRowFirstColumn="0" w:lastRowLastColumn="0" /><w:tcW w:w="2126" w:type="dxa" /><w:tcMar /></w:tcPr><w:p ns2:paraId="74B3B3C5" ns2:textId="77777777"><w:pPr><w:rPr><w:rFonts w:ascii="Calibri" w:hAnsi="Calibri" /><w:b /><w:bCs /></w:rPr></w:pPr><w:r><w:rPr><w:rFonts w:ascii="Calibri" w:hAnsi="Calibri" /><w:b /><w:bCs /></w:rPr><w:t>Nom fichier</w:t></w:r></w:p></w:tc><w:tc><w:tcPr><w:cnfStyle w:val="000000000000" w:firstRow="0" w:lastRow="0" w:firstColumn="0" w:lastColumn="0" w:oddVBand="0" w:evenVBand="0" w:oddHBand="0" w:evenHBand="0" w:firstRowFirstColumn="0" w:firstRowLastColumn="0" w:lastRowFirstColumn="0" w:lastRowLastColumn="0" /><w:tcW w:w="7786" w:type="dxa" /><w:tcMar /></w:tcPr><w:p ns2:paraId="2387679D" ns2:textId="2FD6ABC4"><w:pPr><w:cnfStyle w:val="000000010000" w:firstRow="0" w:lastRow="0" w:firstColumn="0" w:lastColumn="0" w:oddVBand="0" w:evenVBand="0" w:oddHBand="0" w:evenHBand="1" w:firstRowFirstColumn="0" w:firstRowLastColumn="0" w:lastRowFirstColumn="0" w:lastRowLastColumn="0" /></w:pPr><w:r><w:rPr /><w:t>Rapport de suivi coaching &lt;TODO&gt;</w:t></w:r></w:p><w:p ns2:paraId="2D047B50" ns2:textId="58994DC6"><w:pPr><w:cnfStyle w:val="000000010000" w:firstRow="0" w:lastRow="0" w:firstColumn="0" w:lastColumn="0" w:oddVBand="0" w:evenVBand="0" w:oddHBand="0" w:evenHBand="1" w:firstRowFirstColumn="0" w:firstRowLastColumn="0" w:lastRowFirstColumn="0" w:lastRowLastColumn="0" /><w:rPr><w:lang w:val="en-US" /></w:rPr></w:pPr></w:p></w:tc></w:tr></w:tbl><w:p ns2:paraId="0C3EE3C5" ns2:textId="77777777"><w:pPr><w:rPr><w:lang w:val="en-US" /></w:rPr></w:pPr></w:p><w:p ns2:paraId="63B4B7FC" ns2:textId="77777777"><w:pPr><w:rPr><w:b /><w:bCs /><w:sz w:val="28" /><w:szCs w:val="28" /></w:rPr></w:pPr><w:r><w:rPr><w:b /><w:bCs /><w:sz w:val="28" /><w:szCs w:val="28" /></w:rPr><w:t>Historique du document</w:t></w:r></w:p><w:tbl><w:tblPr><w:tblStyle w:val="MediumList2" /><w:tblW w:w="9918" w:type="dxa" /><w:tblLayout w:type="fixed" /><w:tblLook w:val="04A0" w:firstRow="1" w:lastRow="0" w:firstColumn="1" w:lastColumn="0" w:noHBand="0" w:noVBand="1" /></w:tblPr><w:tblGrid><w:gridCol w:w="2268" /><w:gridCol w:w="1080" /><w:gridCol w:w="1350" /><w:gridCol w:w="5220" /></w:tblGrid><w:tr ns2:paraId="49BCB758" ns2:textId="77777777"><w:trPr><w:cnfStyle w:val="100000000000" w:firstRow="1" w:lastRow="0" w:firstColumn="0" w:lastColumn="0" w:oddVBand="0" w:evenVBand="0" w:oddHBand="0" w:evenHBand="0" w:firstRowFirstColumn="0" w:firstRowLastColumn="0" w:lastRowFirstColumn="0" w:lastRowLastColumn="0" /></w:trPr><w:tc><w:tcPr><w:cnfStyle w:val="001000000100" w:firstRow="0" w:lastRow="0" w:firstColumn="1" w:lastColumn="0" w:oddVBand="0" w:evenVBand="0" w:oddHBand="0" w:evenHBand="0" w:firstRowFirstColumn="1" w:firstRowLastColumn="0" w:lastRowFirstColumn="0" w:lastRowLastColumn="0" /><w:tcW w:w="2268" w:type="dxa" /></w:tcPr><w:p ns2:paraId="270319F6" ns2:textId="77777777"><w:pPr><w:jc w:val="center" /><w:rPr><w:rFonts w:asciiTheme="minorHAnsi" w:hAnsiTheme="minorHAnsi" /><w:b /><w:bCs /></w:rPr></w:pPr><w:r><w:rPr><w:rFonts w:asciiTheme="minorHAnsi" w:hAnsiTheme="minorHAnsi" /><w:b /><w:bCs /></w:rPr><w:t>Date de révision</w:t></w:r></w:p></w:tc><w:tc><w:tcPr><w:tcW w:w="1080" w:type="dxa" /></w:tcPr><w:p ns2:paraId="3D07BCEC" ns2:textId="77777777"><w:pPr><w:cnfStyle w:val="100000000000" w:firstRow="1" w:lastRow="0" w:firstColumn="0" w:lastColumn="0" w:oddVBand="0" w:evenVBand="0" w:oddHBand="0" w:evenHBand="0" w:firstRowFirstColumn="0" w:firstRowLastColumn="0" w:lastRowFirstColumn="0" w:lastRowLastColumn="0" /><w:rPr><w:rFonts w:asciiTheme="minorHAnsi" w:hAnsiTheme="minorHAnsi" /><w:b /><w:bCs /></w:rPr></w:pPr><w:r><w:rPr><w:rFonts w:asciiTheme="minorHAnsi" w:hAnsiTheme="minorHAnsi" /><w:b /><w:bCs /></w:rPr><w:t>Version</w:t></w:r></w:p></w:tc><w:tc><w:tcPr><w:tcW w:w="1350" w:type="dxa" /></w:tcPr><w:p ns2:paraId="6CE7794E" ns2:textId="77777777"><w:pPr><w:jc w:val="center" /><w:cnfStyle w:val="100000000000" w:firstRow="1" w:lastRow="0" w:firstColumn="0" w:lastColumn="0" w:oddVBand="0" w:evenVBand="0" w:oddHBand="0" w:evenHBand="0" w:firstRowFirstColumn="0" w:firstRowLastColumn="0" w:lastRowFirstColumn="0" w:lastRowLastColumn="0" /><w:rPr><w:rFonts w:asciiTheme="minorHAnsi" w:hAnsiTheme="minorHAnsi" /><w:b /><w:bCs /></w:rPr></w:pPr><w:r><w:rPr><w:rFonts w:asciiTheme="minorHAnsi" w:hAnsiTheme="minorHAnsi" /><w:b /><w:bCs /></w:rPr><w:t>Auteur</w:t></w:r></w:p></w:tc><w:tc><w:tcPr><w:tcW w:w="5220" w:type="dxa" /></w:tcPr><w:p ns2:paraId="0725A1CC" ns2:textId="77777777"><w:pPr><w:jc w:val="center" /><w:cnfStyle w:val="100000000000" w:firstRow="1" w:lastRow="0" w:firstColumn="0" w:lastColumn="0" w:oddVBand="0" w:evenVBand="0" w:oddHBand="0" w:evenHBand="0" w:firstRowFirstColumn="0" w:firstRowLastColumn="0" w:lastRowFirstColumn="0" w:lastRowLastColumn="0" /><w:rPr><w:rFonts w:asciiTheme="minorHAnsi" w:hAnsiTheme="minorHAnsi" /><w:b /><w:bCs /></w:rPr></w:pPr><w:r><w:rPr><w:rFonts w:asciiTheme="minorHAnsi" w:hAnsiTheme="minorHAnsi" /><w:b /><w:bCs /></w:rPr><w:t>Changements</w:t></w:r></w:p></w:tc></w:tr><w:tr ns2:paraId="2C0B0DE8" ns2:textId="77777777"><w:trPr><w:cnfStyle w:val="000000100000" w:firstRow="0" w:lastRow="0" w:firstColumn="0" w:lastColumn="0" w:oddVBand="0" w:evenVBand="0" w:oddHBand="1" w:evenHBand="0" w:firstRowFirstColumn="0" w:firstRowLastColumn="0" w:lastRowFirstColumn="0" w:lastRowLastColumn="0" /></w:trPr><w:tc><w:tcPr><w:cnfStyle w:val="001000000000" w:firstRow="0" w:lastRow="0" w:firstColumn="1" w:lastColumn="0" w:oddVBand="0" w:evenVBand="0" w:oddHBand="0" w:evenHBand="0" w:firstRowFirstColumn="0" w:firstRowLastColumn="0" w:lastRowFirstColumn="0" w:lastRowLastColumn="0" /><w:tcW w:w="2268" w:type="dxa" /></w:tcPr><w:p ns2:paraId="67D29990" ns2:textId="77777777"><w:pPr><w:rPr><w:rFonts w:asciiTheme="minorHAnsi" w:hAnsiTheme="minorHAnsi" /><w:b /><w:bCs /><w:color w:val="auto" /></w:rPr></w:pPr></w:p></w:tc><w:tc><w:tcPr><w:tcW w:w="1080" w:type="dxa" /></w:tcPr><w:p ns2:paraId="155A070D" ns2:textId="77777777"><w:pPr><w:cnfStyle w:val="000000100000" w:firstRow="0" w:lastRow="0" w:firstColumn="0" w:lastColumn="0" w:oddVBand="0" w:evenVBand="0" w:oddHBand="1" w:evenHBand="0" w:firstRowFirstColumn="0" w:firstRowLastColumn="0" w:lastRowFirstColumn="0" w:lastRowLastColumn="0" /><w:rPr><w:rFonts w:asciiTheme="minorHAnsi" w:hAnsiTheme="minorHAnsi" /><w:color w:val="auto" /></w:rPr></w:pPr><w:r><w:rPr><w:rFonts w:asciiTheme="minorHAnsi" w:hAnsiTheme="minorHAnsi" /><w:color w:val="auto" /></w:rPr><w:t>1.0</w:t></w:r></w:p></w:tc><w:tc><w:tcPr><w:tcW w:w="1350" w:type="dxa" /></w:tcPr><w:p ns2:paraId="39CD3A1E" ns2:textId="77777777"><w:pPr><w:cnfStyle w:val="000000100000" w:firstRow="0" w:lastRow="0" w:firstColumn="0" w:lastColumn="0" w:oddVBand="0" w:evenVBand="0" w:oddHBand="1" w:evenHBand="0" w:firstRowFirstColumn="0" w:firstRowLastColumn="0" w:lastRowFirstColumn="0" w:lastRowLastColumn="0" /><w:rPr><w:rFonts w:asciiTheme="minorHAnsi" w:hAnsiTheme="minorHAnsi" /><w:color w:val="auto" /></w:rPr></w:pPr><w:r><w:rPr><w:rFonts w:asciiTheme="minorHAnsi" w:hAnsiTheme="minorHAnsi" /><w:color w:val="auto" /></w:rPr><w:t>Victor Agahi</w:t></w:r></w:p></w:tc><w:tc><w:tcPr><w:tcW w:w="5220" w:type="dxa" /></w:tcPr><w:p ns2:paraId="113B53D0" ns2:textId="77777777"><w:pPr><w:cnfStyle w:val="000000100000" w:firstRow="0" w:lastRow="0" w:firstColumn="0" w:lastColumn="0" w:oddVBand="0" w:evenVBand="0" w:oddHBand="1" w:evenHBand="0" w:firstRowFirstColumn="0" w:firstRowLastColumn="0" w:lastRowFirstColumn="0" w:lastRowLastColumn="0" /><w:rPr><w:rFonts w:asciiTheme="minorHAnsi" w:hAnsiTheme="minorHAnsi" /><w:color w:val="auto" /></w:rPr></w:pPr></w:p></w:tc></w:tr></w:tbl><w:p ns2:paraId="3F2151BA" ns2:textId="77777777"><w:pPr><w:rPr><w:sz w:val="24" /><w:szCs w:val="24" /></w:rPr></w:pPr></w:p><w:sdt><w:sdtPr><w:id w:val="888354106" /><w:docPartObj><w:docPartGallery w:val="Table of Contents" /><w:docPartUnique /></w:docPartObj><w:rPr><w:b w:val="1" /><w:bCs w:val="1" /><w:caps w:val="1" /><w:sz w:val="20" /><w:szCs w:val="20" /></w:rPr></w:sdtPr><w:sdtContent><w:p ns2:paraId="7C491B3E" ns2:textId="2EDB3BC4"><w:pPr><w:pStyle w:val="mtiTableMatires" /><w:rPr><w:u w:val="single" /></w:rPr></w:pPr><w:r><w:rPr><w:u w:val="single" /></w:rPr><w:t>Table des matières</w:t></w:r></w:p><w:p ns2:paraId="35AF0FBC" ns2:textId="7B1542E3"><w:pPr><w:pStyle w:val="TOC1" /><w:tabs><w:tab w:val="right" w:leader="dot" w:pos="9060" /></w:tabs></w:pPr><w:r><w:fldChar w:fldCharType="begin" /></w:r><w:r><w:instrText xml:space="preserve">TOC \o "1-3" \z \u \h</w:instrText></w:r><w:r><w:fldChar w:fldCharType="separate" /></w:r><w:r><w:fldChar w:fldCharType="begin" /></w:r><w:r><w:instrText xml:space="preserve">HYPERLINK  \l  "_Toc492890139" </w:instrText></w:r><w:r><w:fldChar w:fldCharType="separate" /></w:r><w:r><w:rPr /><w:t>Introduction</w:t></w:r><w:r><w:tab /></w:r><w:r><w:fldChar w:fldCharType="begin" /></w:r><w:r><w:instrText xml:space="preserve">PAGEREF _Toc492890139 \h</w:instrText></w:r><w:r><w:fldChar w:fldCharType="separate" /></w:r><w:r><w:rPr /><w:t>3</w:t></w:r><w:r><w:fldChar w:fldCharType="end" /></w:r><w:r><w:fldChar w:fldCharType="end" /></w:r></w:p><w:p ns2:paraId="17FB7385" ns2:textId="73EBE021"><w:pPr><w:pStyle w:val="TOC2" /><w:tabs><w:tab w:val="right" w:leader="dot" w:pos="9060" /></w:tabs></w:pPr><w:r><w:fldChar w:fldCharType="begin" /></w:r><w:r><w:instrText xml:space="preserve">HYPERLINK  \l  "_Toc642419396" </w:instrText></w:r><w:r><w:fldChar w:fldCharType="separate" /></w:r><w:r><w:rPr /><w:t>Présentation du projet</w:t></w:r><w:r><w:tab /></w:r><w:r><w:fldChar w:fldCharType="begin" /></w:r><w:r><w:instrText xml:space="preserve">PAGEREF _Toc642419396 \h</w:instrText></w:r><w:r><w:fldChar w:fldCharType="separate" /></w:r><w:r><w:rPr /><w:t>3</w:t></w:r><w:r><w:fldChar w:fldCharType="end" /></w:r><w:r><w:fldChar w:fldCharType="end" /></w:r></w:p><w:p ns2:paraId="248B6F17" ns2:textId="25B16219"><w:pPr><w:pStyle w:val="TOC2" /><w:tabs><w:tab w:val="right" w:leader="dot" w:pos="9060" /></w:tabs></w:pPr><w:r><w:fldChar w:fldCharType="begin" /></w:r><w:r><w:instrText xml:space="preserve">HYPERLINK  \l  "_Toc1370566732" </w:instrText></w:r><w:r><w:fldChar w:fldCharType="separate" /></w:r><w:r><w:rPr /><w:t>SPRINT &lt;TODO_BILAN&gt;</w:t></w:r><w:r><w:tab /></w:r><w:r><w:fldChar w:fldCharType="begin" /></w:r><w:r><w:instrText xml:space="preserve">PAGEREF _Toc1370566732 \h</w:instrText></w:r><w:r><w:fldChar w:fldCharType="separate" /></w:r><w:r><w:rPr /><w:t>3</w:t></w:r><w:r><w:fldChar w:fldCharType="end" /></w:r><w:r><w:fldChar w:fldCharType="end" /></w:r></w:p><w:p ns2:paraId="14317A8F" ns2:textId="54CFE3FF"><w:pPr><w:pStyle w:val="TOC2" /><w:tabs><w:tab w:val="right" w:leader="dot" w:pos="9060" /></w:tabs></w:pPr><w:r><w:fldChar w:fldCharType="begin" /></w:r><w:r><w:instrText xml:space="preserve">HYPERLINK  \l  "_Toc1720588397" </w:instrText></w:r><w:r><w:fldChar w:fldCharType="separate" /></w:r><w:r><w:rPr /><w:t>VICTOR AGAHI – &lt;TODO&gt;</w:t></w:r><w:r><w:tab /></w:r><w:r><w:fldChar w:fldCharType="begin" /></w:r><w:r><w:instrText xml:space="preserve">PAGEREF _Toc1720588397 \h</w:instrText></w:r><w:r><w:fldChar w:fldCharType="separate" /></w:r><w:r><w:rPr /><w:t>3</w:t></w:r><w:r><w:fldChar w:fldCharType="end" /></w:r><w:r><w:fldChar w:fldCharType="end" /></w:r></w:p><w:p ns2:paraId="49377213" ns2:textId="11458AB4"><w:pPr><w:pStyle w:val="TOC2" /><w:tabs><w:tab w:val="right" w:leader="dot" w:pos="9060" /></w:tabs></w:pPr><w:r><w:fldChar w:fldCharType="begin" /></w:r><w:r><w:instrText xml:space="preserve">HYPERLINK  \l  "_Toc513136163" </w:instrText></w:r><w:r><w:fldChar w:fldCharType="separate" /></w:r><w:r><w:rPr /><w:t>VICTOR GIROUD – &lt;TODO&gt;</w:t></w:r><w:r><w:tab /></w:r><w:r><w:fldChar w:fldCharType="begin" /></w:r><w:r><w:instrText xml:space="preserve">PAGEREF _Toc513136163 \h</w:instrText></w:r><w:r><w:fldChar w:fldCharType="separate" /></w:r><w:r><w:rPr /><w:t /></w:r><w:r><w:fldChar w:fldCharType="end" /></w:r><w:r><w:fldChar w:fldCharType="end" /></w:r></w:p><w:p ns2:paraId="6F203098" ns2:textId="484CAE70"><w:pPr><w:pStyle w:val="TOC2" /><w:tabs><w:tab w:val="right" w:leader="dot" w:pos="9060" /></w:tabs></w:pPr><w:r><w:fldChar w:fldCharType="begin" /></w:r><w:r><w:instrText xml:space="preserve">HYPERLINK  \l  "_Toc1801556305" </w:instrText></w:r><w:r><w:fldChar w:fldCharType="separate" /></w:r><w:r><w:rPr /><w:t>CLÉMENT PASTEAU – &lt;TODO&gt;</w:t></w:r><w:r><w:tab /></w:r><w:r><w:fldChar w:fldCharType="begin" /></w:r><w:r><w:instrText xml:space="preserve">PAGEREF _Toc1801556305 \h</w:instrText></w:r><w:r><w:fldChar w:fldCharType="separate" /></w:r><w:r><w:rPr /><w:t /></w:r><w:r><w:fldChar w:fldCharType="end" /></w:r><w:r><w:fldChar w:fldCharType="end" /></w:r></w:p><w:p ns2:paraId="40F5346D" ns2:textId="32ED07BF"><w:pPr><w:pStyle w:val="TOC2" /><w:tabs><w:tab w:val="right" w:leader="dot" w:pos="9060" /></w:tabs></w:pPr><w:r><w:fldChar w:fldCharType="begin" /></w:r><w:r><w:instrText xml:space="preserve">HYPERLINK  \l  "_Toc1916894323" </w:instrText></w:r><w:r><w:fldChar w:fldCharType="separate" /></w:r><w:r><w:rPr /><w:t>SPRINT &lt;TODO_PROJ&gt;</w:t></w:r><w:r><w:tab /></w:r><w:r><w:fldChar w:fldCharType="begin" /></w:r><w:r><w:instrText xml:space="preserve">PAGEREF _Toc1916894323 \h</w:instrText></w:r><w:r><w:fldChar w:fldCharType="separate" /></w:r><w:r><w:rPr /><w:t>3</w:t></w:r><w:r><w:fldChar w:fldCharType="end" /></w:r><w:r><w:fldChar w:fldCharType="end" /></w:r></w:p><w:p ns2:paraId="19E90128" ns2:textId="2F314A18"><w:pPr><w:pStyle w:val="TOC1" /><w:tabs><w:tab w:val="right" w:leader="dot" w:pos="9060" /></w:tabs></w:pPr><w:r><w:fldChar w:fldCharType="begin" /></w:r><w:r><w:instrText xml:space="preserve">HYPERLINK  \l  "_Toc1731799357" </w:instrText></w:r><w:r><w:fldChar w:fldCharType="separate" /></w:r><w:r><w:rPr /><w:t>Découpage des actions</w:t></w:r><w:r><w:tab /></w:r><w:r><w:fldChar w:fldCharType="begin" /></w:r><w:r><w:instrText xml:space="preserve">PAGEREF _Toc1731799357 \h</w:instrText></w:r><w:r><w:fldChar w:fldCharType="separate" /></w:r><w:r><w:rPr /><w:t>3</w:t></w:r><w:r><w:fldChar w:fldCharType="end" /></w:r><w:r><w:fldChar w:fldCharType="end" /></w:r></w:p><w:p ns2:paraId="56A1927D" ns2:textId="04B3371C"><w:pPr><w:pStyle w:val="TOC3" /><w:tabs><w:tab w:val="right" w:leader="dot" w:pos="9060" /></w:tabs></w:pPr><w:r><w:fldChar w:fldCharType="begin" /></w:r><w:r><w:instrText xml:space="preserve">HYPERLINK  \l  "_Toc714619430" </w:instrText></w:r><w:r><w:fldChar w:fldCharType="separate" /></w:r><w:r><w:rPr /><w:t>Répartition des Tâches</w:t></w:r><w:r><w:tab /></w:r><w:r><w:fldChar w:fldCharType="begin" /></w:r><w:r><w:instrText xml:space="preserve">PAGEREF _Toc714619430 \h</w:instrText></w:r><w:r><w:fldChar w:fldCharType="separate" /></w:r><w:r><w:rPr /><w:t>3</w:t></w:r><w:r><w:fldChar w:fldCharType="end" /></w:r><w:r><w:fldChar w:fldCharType="end" /></w:r></w:p><w:p ns2:paraId="0F7DAB51" ns2:textId="2C01C471"><w:pPr><w:pStyle w:val="TOC2" /><w:tabs><w:tab w:val="right" w:leader="dot" w:pos="9060" /></w:tabs></w:pPr><w:r><w:fldChar w:fldCharType="begin" /></w:r><w:r><w:instrText xml:space="preserve">HYPERLINK  \l  "_Toc161572873" </w:instrText></w:r><w:r><w:fldChar w:fldCharType="separate" /></w:r><w:r><w:rPr /><w:t>Diagrammes de Gantt</w:t></w:r><w:r><w:tab /></w:r><w:r><w:fldChar w:fldCharType="begin" /></w:r><w:r><w:instrText xml:space="preserve">PAGEREF _Toc161572873 \h</w:instrText></w:r><w:r><w:fldChar w:fldCharType="separate" /></w:r><w:r><w:rPr /><w:t>4</w:t></w:r><w:r><w:fldChar w:fldCharType="end" /></w:r><w:r><w:fldChar w:fldCharType="end" /></w:r></w:p><w:p ns2:paraId="6321F719" ns2:textId="080482AF"><w:pPr><w:pStyle w:val="TOC3" /><w:tabs><w:tab w:val="right" w:leader="dot" w:pos="9060" /></w:tabs></w:pPr><w:r><w:fldChar w:fldCharType="begin" /></w:r><w:r><w:instrText xml:space="preserve">HYPERLINK  \l  "_Toc327060629" </w:instrText></w:r><w:r><w:fldChar w:fldCharType="separate" /></w:r><w:r><w:rPr /><w:t>Victor Giroud : &lt;TODO&gt;</w:t></w:r><w:r><w:tab /></w:r><w:r><w:fldChar w:fldCharType="begin" /></w:r><w:r><w:instrText xml:space="preserve">PAGEREF _Toc327060629 \h</w:instrText></w:r><w:r><w:fldChar w:fldCharType="separate" /></w:r><w:r><w:rPr /><w:t /></w:r><w:r><w:fldChar w:fldCharType="end" /></w:r><w:r><w:fldChar w:fldCharType="end" /></w:r></w:p><w:p ns2:paraId="29116E86" ns2:textId="3DC6E61B"><w:pPr><w:pStyle w:val="TOC3" /><w:tabs><w:tab w:val="right" w:leader="dot" w:pos="9060" /></w:tabs></w:pPr><w:r><w:fldChar w:fldCharType="begin" /></w:r><w:r><w:instrText xml:space="preserve">HYPERLINK  \l  "_Toc1225943338" </w:instrText></w:r><w:r><w:fldChar w:fldCharType="separate" /></w:r><w:r><w:rPr /><w:t>Victor Agahi : &lt;TODO&gt;</w:t></w:r><w:r><w:tab /></w:r><w:r><w:fldChar w:fldCharType="begin" /></w:r><w:r><w:instrText xml:space="preserve">PAGEREF _Toc1225943338 \h</w:instrText></w:r><w:r><w:fldChar w:fldCharType="separate" /></w:r><w:r><w:rPr /><w:t>4</w:t></w:r><w:r><w:fldChar w:fldCharType="end" /></w:r><w:r><w:fldChar w:fldCharType="end" /></w:r></w:p><w:p ns2:paraId="1DC87B19" ns2:textId="200D84F2"><w:pPr><w:pStyle w:val="TOC3" /><w:tabs><w:tab w:val="right" w:leader="dot" w:pos="9060" /></w:tabs></w:pPr><w:r><w:fldChar w:fldCharType="begin" /></w:r><w:r><w:instrText xml:space="preserve">HYPERLINK  \l  "_Toc970960254" </w:instrText></w:r><w:r><w:fldChar w:fldCharType="separate" /></w:r><w:r><w:rPr /><w:t>Clément PASTEAU : &lt;TODO&gt;</w:t></w:r><w:r><w:tab /></w:r><w:r><w:fldChar w:fldCharType="begin" /></w:r><w:r><w:instrText xml:space="preserve">PAGEREF _Toc970960254 \h</w:instrText></w:r><w:r><w:fldChar w:fldCharType="separate" /></w:r><w:r><w:rPr /><w:t>4</w:t></w:r><w:r><w:fldChar w:fldCharType="end" /></w:r><w:r><w:fldChar w:fldCharType="end" /></w:r></w:p><w:p ns2:paraId="7ED6C17B" ns2:textId="0EC51CE3"><w:pPr><w:pStyle w:val="TOC1" /><w:tabs><w:tab w:val="right" w:leader="dot" w:pos="9060" /></w:tabs></w:pPr><w:r><w:fldChar w:fldCharType="begin" /></w:r><w:r><w:instrText xml:space="preserve">HYPERLINK  \l  "_Toc1517376593" </w:instrText></w:r><w:r><w:fldChar w:fldCharType="separate" /></w:r><w:r><w:rPr /><w:t>Conclusion</w:t></w:r><w:r><w:tab /></w:r><w:r><w:fldChar w:fldCharType="begin" /></w:r><w:r><w:instrText xml:space="preserve">PAGEREF _Toc1517376593 \h</w:instrText></w:r><w:r><w:fldChar w:fldCharType="separate" /></w:r><w:r><w:rPr /><w:t>4</w:t></w:r><w:r><w:fldChar w:fldCharType="end" /></w:r><w:r><w:fldChar w:fldCharType="end" /></w:r></w:p><w:p ns2:paraId="049D750E" ns2:textId="64C86E5C"><w:pPr><w:pStyle w:val="TOC1" /><w:tabs><w:tab w:val="right" w:leader="dot" w:pos="9060" /></w:tabs><w:rPr><w:rStyle w:val="Hyperlink" /></w:rPr></w:pPr><w:r><w:fldChar w:fldCharType="end" /></w:r></w:p></w:sdtContent><w:sdtEndPr><w:rPr><w:b w:val="1" /><w:bCs w:val="1" /><w:caps w:val="1" /><w:sz w:val="20" /><w:szCs w:val="20" /></w:rPr></w:sdtEndPr></w:sdt><w:p ns2:paraId="0B855886" ns2:textId="77777777" /><w:p ns2:paraId="15A1B871" ns2:textId="77777777"><w:pPr><w:pStyle w:val="Heading1" /><w:spacing w:before="120" /></w:pPr><w:bookmarkStart w:name="_Toc492890139" w:id="1884994374" /><w:r><w:rPr /><w:t>Introduction</w:t></w:r><w:bookmarkEnd w:id="1884994374" /></w:p><w:p ns2:paraId="782D7D85" ns2:textId="21152B88"><w:pPr><w:pStyle w:val="Heading2" /></w:pPr><w:bookmarkStart w:name="_Toc642419396" w:id="388523969" /><w:r><w:rPr /><w:t>Présentation du projet</w:t></w:r><w:bookmarkEnd w:id="388523969" /></w:p><w:p ns2:paraId="6186B591" ns2:textId="546F992A"><w:pPr><w:pStyle w:val="mtitexte" /><w:jc w:val="both" /><w:rPr><w:sz w:val="20" /><w:lang w:val="fr-FR" /></w:rPr></w:pPr><w:r><w:rPr><w:sz w:val="20" /><w:lang w:val="fr-FR" /></w:rPr><w:t>Nous développons une application mobile qui permet de créer et rejoindre facilement des événements écologiques ou solidaires, comme des collectes de déchets ou alimentaires. Les utilisateurs peuvent découvrir les événements via un fil d’actualité, swiper pour s’inscrire, créer leurs propres initiatives, et partager leurs actions sur leur profil. Une carte interactive permet aussi de repérer les événements importants autour de soi. Enfin, un système de badges récompense l’engagement des participants et valorise leurs actions positives.</w:t></w:r></w:p><w:p ns2:paraId="317C53E3" ns2:textId="28D1CF17"><w:pPr><w:pStyle w:val="Heading2" /><w:spacing w:before="240" w:after="240" /></w:pPr><w:r><w:rPr /><w:t>SPRINT &lt;TODO_BILAN&gt;</w:t></w:r></w:p><w:p ns2:paraId="62EA5D1E" ns2:textId="17D8A2D3"><w:pPr><w:pStyle w:val="Normal" /><w:spacing w:before="240" w:beforeAutospacing="off" w:after="240" w:afterAutospacing="off" /></w:pPr><w:r><w:rPr><w:rFonts w:ascii="Calibri" w:hAnsi="Calibri" w:eastAsia="Calibri" w:cs="Calibri" /><w:b w:val="1" /><w:bCs w:val="1" /><w:noProof w:val="0" /><w:sz w:val="20" /><w:szCs w:val="20" /><w:lang w:val="fr-FR" /></w:rPr><w:t>[TODO] Synthèse globale de l'avancement et des objectifs atteints lors du Sprint &lt;TODO_BILAN&gt; (périmètre backend, frontend, infrastructure et coordination).</w:t></w:r></w:p><w:p ns2:paraId="5CFDEA38" ns2:textId="47F467EF"><w:pPr><w:spacing w:before="240" w:beforeAutospacing="off" w:after="240" w:afterAutospacing="off" /></w:pPr><w:r><w:rPr><w:rFonts w:ascii="Calibri" w:hAnsi="Calibri" w:eastAsia="Calibri" w:cs="Calibri" /><w:b w:val="1" /><w:bCs w:val="1" /><w:noProof w:val="0" /><w:sz w:val="20" /><w:szCs w:val="20" /><w:lang w:val="fr-FR" /></w:rPr><w:t /></w:r></w:p><w:p ns2:paraId="0BE60BFA" ns2:textId="39A20485"><w:pPr><w:pStyle w:val="Normal" /></w:pPr></w:p><w:p ns2:paraId="432C17EE" ns2:textId="0E47755D"><w:pPr><w:pStyle w:val="Heading2" /><w:spacing w:before="240" w:beforeAutospacing="off" w:after="240" w:afterAutospacing="off" w:line="276" w:lineRule="auto" /><w:jc w:val="left" /><w:rPr><w:rFonts w:ascii="Calibri" w:hAnsi="Calibri" w:eastAsia="Calibri" w:cs="Calibri" /><w:noProof w:val="0" /><w:sz w:val="20" /><w:szCs w:val="20" /><w:lang w:val="fr-FR" /></w:rPr></w:pPr><w:r><w:rPr><w:rFonts w:ascii="Calibri" w:hAnsi="Calibri" w:eastAsia="Calibri" w:cs="Calibri" /><w:noProof w:val="0" /><w:sz w:val="20" /><w:szCs w:val="20" /><w:lang w:val="fr-FR" /></w:rPr><w:t>VICTOR AGAHI – &lt;TODO&gt;</w:t></w:r></w:p><w:p ns2:paraId="0B668E96" ns2:textId="5E9D4487"><w:pPr><w:bidi w:val="0" /><w:spacing w:before="240" w:beforeAutospacing="off" w:after="240" w:afterAutospacing="off" /><w:jc w:val="left" /></w:pPr><w:r><w:rPr><w:rFonts w:ascii="Calibri" w:hAnsi="Calibri" w:eastAsia="Calibri" w:cs="Calibri" /><w:b w:val="1" /><w:bCs w:val="1" /><w:noProof w:val="0" /><w:sz w:val="20" /><w:szCs w:val="20" /><w:lang w:val="fr-FR" /></w:rPr><w:t>[TODO] Synthèse détaillée des réalisations techniques de Victor Agahi pour le Sprint &lt;TODO_BILAN&gt; (architecture, microservices, DevOps, Kubernetes, observabilité, etc.).</w:t></w:r></w:p><w:p ns2:paraId="4C52C2C0" ns2:textId="3F61E397"><w:pPr><w:pStyle w:val="ListParagraph" /><w:numPr><w:ilvl w:val="0" /><w:numId w:val="45" /></w:numPr><w:bidi w:val="0" /><w:spacing w:before="240" w:beforeAutospacing="off" w:after="240" w:afterAutospacing="off" /><w:jc w:val="left" /><w:rPr><w:rFonts w:ascii="Calibri" w:hAnsi="Calibri" w:eastAsia="Calibri" w:cs="Calibri" /><w:noProof w:val="0" /><w:sz w:val="20" /><w:szCs w:val="20" /><w:lang w:val="fr-FR" /></w:rPr></w:pPr><w:r><w:rPr><w:rFonts w:ascii="Calibri" w:hAnsi="Calibri" w:eastAsia="Calibri" w:cs="Calibri" /><w:noProof w:val="0" /><w:sz w:val="20" /><w:szCs w:val="20" /><w:lang w:val="fr-FR" /></w:rPr><w:t>[TODO] Réalisation clé 1 (ex: déploiement d'infrastructure, intégration réseau)</w:t></w:r></w:p><w:p ns2:paraId="7B7BE88E" ns2:textId="0F7AC84C"><w:pPr><w:pStyle w:val="ListParagraph" /><w:bidi w:val="0" /><w:spacing w:before="240" w:beforeAutospacing="off" w:after="240" w:afterAutospacing="off" /><w:ind w:left="720" /><w:jc w:val="left" /></w:pPr><w:r><w:drawing><ns3:inline ns4:editId="5F9A837A" ns4:anchorId="3FA3EFAF"><ns3:extent cx="1999343" cy="1765886" /><ns3:effectExtent l="0" t="0" r="0" b="0" /><ns3:docPr id="2086511976" name="drawing" /><ns3:cNvGraphicFramePr><a:graphicFrameLocks noChangeAspect="1" /></ns3:cNvGraphicFramePr><a:graphic><a:graphicData uri="http://schemas.openxmlformats.org/drawingml/2006/picture"><ns7:pic><ns7:nvPicPr><ns7:cNvPr id="2086511976" name="Picture 2086511976" /><ns7:cNvPicPr /></ns7:nvPicPr><ns7:blipFill><a:blip r:embed="rId1464873947"><a:extLst><a:ext uri="{28A0092B-C50C-407E-A947-70E740481C1C}"><ns9:useLocalDpi /></a:ext></a:extLst></a:blip><a:stretch><a:fillRect /></a:stretch></ns7:blipFill><ns7:spPr><a:xfrm rot="0"><a:off x="0" y="0" /><a:ext cx="1999343" cy="1765886" /></a:xfrm><a:prstGeom prst="rect"><a:avLst /></a:prstGeom></ns7:spPr></ns7:pic></a:graphicData></a:graphic></ns3:inline></w:drawing></w:r></w:p><w:p ns2:paraId="0C2E1ED4" ns2:textId="4D126B8C"><w:pPr><w:pStyle w:val="ListParagraph" /><w:numPr><w:ilvl w:val="0" /><w:numId w:val="45" /></w:numPr><w:bidi w:val="0" /><w:spacing w:before="240" w:beforeAutospacing="off" w:after="240" w:afterAutospacing="off" /><w:jc w:val="left" /><w:rPr><w:rFonts w:ascii="Calibri" w:hAnsi="Calibri" w:eastAsia="Calibri" w:cs="Calibri" /><w:noProof w:val="0" /><w:sz w:val="20" /><w:szCs w:val="20" /><w:lang w:val="fr-FR" /></w:rPr></w:pPr><w:r><w:rPr><w:rFonts w:ascii="Calibri" w:hAnsi="Calibri" w:eastAsia="Calibri" w:cs="Calibri" /><w:noProof w:val="0" /><w:sz w:val="20" /><w:szCs w:val="20" /><w:lang w:val="fr-FR" /></w:rPr><w:t>[TODO] Réalisation clé 2 (ex: configuration de services, métriques)</w:t></w:r></w:p><w:p ns2:paraId="21FA0405" ns2:textId="4816DC68"><w:pPr><w:pStyle w:val="ListParagraph" /><w:numPr><w:ilvl w:val="0" /><w:numId w:val="45" /></w:numPr><w:bidi w:val="0" /><w:spacing w:before="240" w:beforeAutospacing="off" w:after="240" w:afterAutospacing="off" /><w:jc w:val="left" /><w:rPr><w:rFonts w:ascii="Calibri" w:hAnsi="Calibri" w:eastAsia="Calibri" w:cs="Calibri" /><w:noProof w:val="0" /><w:sz w:val="20" /><w:szCs w:val="20" /><w:lang w:val="fr-FR" /></w:rPr></w:pPr><w:r><w:rPr><w:rFonts w:ascii="Calibri" w:hAnsi="Calibri" w:eastAsia="Calibri" w:cs="Calibri" /><w:b w:val="1" /><w:bCs w:val="1" /><w:noProof w:val="0" /><w:sz w:val="20" /><w:szCs w:val="20" /><w:lang w:val="fr-FR" /></w:rPr><w:t>[TODO] Objectif atteint pour le Sprint &lt;TODO_BILAN&gt;</w:t></w:r></w:p><w:p ns2:paraId="44B030D0" ns2:textId="226AB1FA"><w:pPr><w:pStyle w:val="Normal" /><w:bidi w:val="0" /><w:spacing w:before="240" w:beforeAutospacing="off" w:after="240" w:afterAutospacing="off" /><w:ind w:left="0" /><w:jc w:val="left" /></w:pPr><w:r><w:drawing><ns3:inline ns4:editId="3146D787" ns4:anchorId="6F98E2A7"><ns3:extent cx="5762625" cy="3238500" /><ns3:effectExtent l="0" t="0" r="0" b="0" /><ns3:docPr id="177438074" name="drawing" /><ns3:cNvGraphicFramePr><a:graphicFrameLocks noChangeAspect="1" /></ns3:cNvGraphicFramePr><a:graphic><a:graphicData uri="http://schemas.openxmlformats.org/drawingml/2006/picture"><ns7:pic><ns7:nvPicPr><ns7:cNvPr id="177438074" name="Picture 177438074" /><ns7:cNvPicPr /></ns7:nvPicPr><ns7:blipFill><a:blip r:embed="rId1163908134"><a:extLst><a:ext uri="{28A0092B-C50C-407E-A947-70E740481C1C}"><ns9:useLocalDpi /></a:ext></a:extLst></a:blip><a:stretch><a:fillRect /></a:stretch></ns7:blipFill><ns7:spPr><a:xfrm><a:off x="0" y="0" /><a:ext cx="5762625" cy="3238500" /></a:xfrm><a:prstGeom prst="rect"><a:avLst /></a:prstGeom></ns7:spPr></ns7:pic></a:graphicData></a:graphic></ns3:inline></w:drawing></w:r></w:p><w:p ns2:paraId="13B6FBAE" ns2:textId="5FA577D9"><w:pPr><w:pStyle w:val="Normal" /><w:bidi w:val="0" /><w:spacing w:before="240" w:beforeAutospacing="off" w:after="240" w:afterAutospacing="off" /><w:jc w:val="left" /><w:rPr><w:rFonts w:ascii="Calibri" w:hAnsi="Calibri" w:eastAsia="Calibri" w:cs="Calibri" /><w:noProof w:val="0" /><w:sz w:val="20" /><w:szCs w:val="20" /><w:lang w:val="fr-FR" /></w:rPr></w:pPr></w:p><w:p ns2:paraId="7D5985E2" ns2:textId="1513B7B9"><w:pPr><w:bidi w:val="0" /><w:spacing w:before="240" w:beforeAutospacing="off" w:after="240" w:afterAutospacing="off" /><w:jc w:val="left" /></w:pPr><w:r><w:rPr><w:rFonts w:ascii="Calibri" w:hAnsi="Calibri" w:eastAsia="Calibri" w:cs="Calibri" /><w:b w:val="1" /><w:bCs w:val="1" /><w:noProof w:val="0" /><w:sz w:val="20" /><w:szCs w:val="20" /><w:lang w:val="fr-FR" /></w:rPr><w:t /></w:r></w:p><w:p ns2:paraId="5D45FDEA" ns2:textId="04C7F9DC"><w:pPr><w:pStyle w:val="ListParagraph" /><w:numPr><w:ilvl w:val="0" /><w:numId w:val="46" /></w:numPr><w:bidi w:val="0" /><w:spacing w:before="240" w:beforeAutospacing="off" w:after="240" w:afterAutospacing="off" /><w:jc w:val="left" /><w:rPr><w:rFonts w:ascii="Calibri" w:hAnsi="Calibri" w:eastAsia="Calibri" w:cs="Calibri" /><w:noProof w:val="0" /><w:sz w:val="20" /><w:szCs w:val="20" /><w:lang w:val="fr-FR" /></w:rPr></w:pPr><w:r><w:rPr><w:rFonts w:ascii="Calibri" w:hAnsi="Calibri" w:eastAsia="Calibri" w:cs="Calibri" /><w:noProof w:val="0" /><w:sz w:val="20" /><w:szCs w:val="20" /><w:lang w:val="fr-FR" /></w:rPr><w:t /></w:r></w:p><w:p ns2:paraId="418D44D9" ns2:textId="0ED83893"><w:pPr><w:pStyle w:val="ListParagraph" /><w:numPr><w:ilvl w:val="0" /><w:numId w:val="46" /></w:numPr><w:bidi w:val="0" /><w:spacing w:before="240" w:beforeAutospacing="off" w:after="240" w:afterAutospacing="off" /><w:jc w:val="left" /><w:rPr><w:rFonts w:ascii="Calibri" w:hAnsi="Calibri" w:eastAsia="Calibri" w:cs="Calibri" /><w:noProof w:val="0" /><w:sz w:val="20" /><w:szCs w:val="20" /><w:lang w:val="fr-FR" /></w:rPr></w:pPr><w:r><w:rPr><w:rFonts w:ascii="Calibri" w:hAnsi="Calibri" w:eastAsia="Calibri" w:cs="Calibri" /><w:noProof w:val="0" /><w:sz w:val="20" /><w:szCs w:val="20" /><w:lang w:val="fr-FR" /></w:rPr><w:t /></w:r></w:p><w:p ns2:paraId="2666C3B5" ns2:textId="546BB715"><w:pPr><w:pStyle w:val="ListParagraph" /><w:numPr><w:ilvl w:val="0" /><w:numId w:val="46" /></w:numPr><w:bidi w:val="0" /><w:spacing w:before="240" w:beforeAutospacing="off" w:after="240" w:afterAutospacing="off" /><w:jc w:val="left" /><w:rPr><w:rFonts w:ascii="Calibri" w:hAnsi="Calibri" w:eastAsia="Calibri" w:cs="Calibri" /><w:noProof w:val="0" /><w:sz w:val="20" /><w:szCs w:val="20" /><w:lang w:val="fr-FR" /></w:rPr></w:pPr><w:r><w:rPr><w:rFonts w:ascii="Calibri" w:hAnsi="Calibri" w:eastAsia="Calibri" w:cs="Calibri" /><w:noProof w:val="0" /><w:sz w:val="20" /><w:szCs w:val="20" /><w:lang w:val="fr-FR" /></w:rPr><w:t /></w:r></w:p><w:p ns2:paraId="71CCB2FC" ns2:textId="156FE454"><w:pPr><w:pStyle w:val="ListParagraph" /><w:numPr><w:ilvl w:val="0" /><w:numId w:val="46" /></w:numPr><w:bidi w:val="0" /><w:spacing w:before="240" w:beforeAutospacing="off" w:after="240" w:afterAutospacing="off" /><w:jc w:val="left" /><w:rPr><w:rFonts w:ascii="Calibri" w:hAnsi="Calibri" w:eastAsia="Calibri" w:cs="Calibri" /><w:noProof w:val="0" /><w:sz w:val="20" /><w:szCs w:val="20" /><w:lang w:val="fr-FR" /></w:rPr></w:pPr><w:r><w:rPr><w:rFonts w:ascii="Calibri" w:hAnsi="Calibri" w:eastAsia="Calibri" w:cs="Calibri" /><w:noProof w:val="0" /><w:sz w:val="20" /><w:szCs w:val="20" /><w:lang w:val="fr-FR" /></w:rPr><w:t /></w:r></w:p><w:p ns2:paraId="22448DDB" ns2:textId="0BD2F8B3"><w:pPr><w:pStyle w:val="Normal" /><w:bidi w:val="0" /><w:spacing w:before="240" w:beforeAutospacing="off" w:after="240" w:afterAutospacing="off" /><w:ind w:left="0" /><w:jc w:val="left" /></w:pPr><w:r><w:drawing><ns3:inline ns4:editId="376FBB0E" ns4:anchorId="721854A2"><ns3:extent cx="3081588" cy="3433445" /><ns3:effectExtent l="0" t="0" r="0" b="0" /><ns3:docPr id="814352251" name="drawing" /><ns3:cNvGraphicFramePr><a:graphicFrameLocks noChangeAspect="1" /></ns3:cNvGraphicFramePr><a:graphic><a:graphicData uri="http://schemas.openxmlformats.org/drawingml/2006/picture"><ns7:pic><ns7:nvPicPr><ns7:cNvPr id="814352251" name="Picture 814352251" /><ns7:cNvPicPr /></ns7:nvPicPr><ns7:blipFill><a:blip r:embed="rId445383741"><a:extLst><a:ext uri="{28A0092B-C50C-407E-A947-70E740481C1C}"><ns9:useLocalDpi /></a:ext></a:extLst></a:blip><a:stretch><a:fillRect /></a:stretch></ns7:blipFill><ns7:spPr><a:xfrm rot="0"><a:off x="0" y="0" /><a:ext cx="3081588" cy="3433445" /></a:xfrm><a:prstGeom prst="rect"><a:avLst /></a:prstGeom></ns7:spPr></ns7:pic></a:graphicData></a:graphic></ns3:inline></w:drawing></w:r></w:p><w:p ns2:paraId="7C07B1F1" ns2:textId="135F342D"><w:pPr><w:pStyle w:val="Normal" /><w:suppressLineNumbers w:val="0" /><w:bidi w:val="0" /><w:spacing w:before="240" w:beforeAutospacing="off" w:after="240" w:afterAutospacing="off" w:line="276" w:lineRule="auto" /><w:ind w:left="0" w:right="0" /><w:jc w:val="left" /><w:rPr><w:sz w:val="20" /><w:szCs w:val="20" /></w:rPr></w:pPr></w:p><w:p ns2:paraId="212E5DBA" ns2:textId="4B1224EC"><w:r><w:br w:type="page" /></w:r></w:p><w:p ns2:paraId="7C945F16" ns2:textId="2673EC62"><w:pPr><w:pStyle w:val="Heading2" /><w:spacing w:before="240" w:beforeAutospacing="off" w:after="240" w:afterAutospacing="off" w:line="276" w:lineRule="auto" /><w:jc w:val="left" /><w:rPr><w:rFonts w:ascii="Calibri" w:hAnsi="Calibri" w:eastAsia="Calibri" w:cs="Calibri" /><w:noProof w:val="0" /><w:sz w:val="20" /><w:szCs w:val="20" /><w:lang w:val="fr-FR" /></w:rPr></w:pPr><w:r><w:rPr><w:rFonts w:ascii="Calibri" w:hAnsi="Calibri" w:eastAsia="Calibri" w:cs="Calibri" /><w:noProof w:val="0" /><w:sz w:val="20" /><w:szCs w:val="20" /><w:lang w:val="fr-FR" /></w:rPr><w:t>VICTOR GIROUD – &lt;TODO&gt;</w:t></w:r></w:p><w:p ns2:paraId="6D69CE6D" ns2:textId="2964B2B3"><w:pPr><w:pStyle w:val="Normal" /><w:suppressLineNumbers w:val="0" /><w:bidi w:val="0" /><w:spacing w:before="240" w:beforeAutospacing="off" w:after="240" w:afterAutospacing="off" w:line="276" w:lineRule="auto" /><w:ind w:left="0" w:right="0" /><w:jc w:val="left" /></w:pPr><w:r><w:rPr><w:rFonts w:ascii="Calibri" w:hAnsi="Calibri" w:eastAsia="Calibri" w:cs="Calibri" /><w:noProof w:val="0" /><w:sz w:val="20" /><w:szCs w:val="20" /><w:lang w:val="fr-FR" /></w:rPr><w:t>[TODO] Synthèse détaillée des réalisations techniques de Victor Giroud pour le Sprint &lt;TODO_BILAN&gt; (features mobiles, React Native, UI/UX, navigation, gamification, etc.).</w:t></w:r></w:p><w:p ns2:paraId="38A772EA" ns2:textId="55CE4D8B"><w:pPr><w:pStyle w:val="Normal" /><w:bidi w:val="0" /><w:spacing w:before="240" w:beforeAutospacing="off" w:after="240" w:afterAutospacing="off" w:line="276" w:lineRule="auto" /><w:ind w:left="0" w:right="0" /><w:jc w:val="left" /></w:pPr></w:p><w:p ns2:paraId="37532E2B" ns2:textId="24A134E1"><w:r><w:br w:type="page" /></w:r></w:p><w:p ns2:paraId="296A9724" ns2:textId="22329AED"><w:pPr><w:pStyle w:val="Heading2" /><w:suppressLineNumbers w:val="0" /><w:bidi w:val="0" /><w:spacing w:before="240" w:beforeAutospacing="off" w:after="240" w:afterAutospacing="off" w:line="276" w:lineRule="auto" /><w:ind /><w:jc w:val="left" /><w:rPr><w:rFonts w:ascii="Calibri" w:hAnsi="Calibri" w:eastAsia="Calibri" w:cs="Calibri" /><w:noProof w:val="0" /><w:sz w:val="20" /><w:szCs w:val="20" /><w:lang w:val="fr-FR" /></w:rPr></w:pPr><w:r><w:rPr><w:rFonts w:ascii="Calibri" w:hAnsi="Calibri" w:eastAsia="Calibri" w:cs="Calibri" /><w:noProof w:val="0" /><w:sz w:val="20" /><w:szCs w:val="20" /><w:lang w:val="fr-FR" /></w:rPr><w:t>CLÉMENT PASTEAU – &lt;TODO&gt;</w:t></w:r></w:p><w:p ns2:paraId="0D23734D" ns2:textId="5F4046DC"><w:pPr><w:pStyle w:val="Normal" /><w:suppressLineNumbers w:val="0" /><w:bidi w:val="0" /><w:spacing w:before="240" w:beforeAutospacing="off" w:after="240" w:afterAutospacing="off" w:line="276" w:lineRule="auto" /><w:ind w:left="0" w:right="0" /><w:jc w:val="left" /></w:pPr><w:r><w:rPr><w:rFonts w:ascii="Calibri" w:hAnsi="Calibri" w:eastAsia="Calibri" w:cs="Calibri" /><w:noProof w:val="0" /><w:sz w:val="20" /><w:szCs w:val="20" /><w:lang w:val="fr-FR" /></w:rPr><w:t>[TODO] Synthèse détaillée des réalisations techniques de Clément Pasteau pour le Sprint &lt;TODO_BILAN&gt; (backend, gRPC, domain packages, stockage S3/MinIO, tests d'intégration, etc.).</w:t></w:r></w:p><w:p ns2:paraId="682C0FD8" ns2:textId="5BB1A8A9"><w:pPr><w:pStyle w:val="Normal" /><w:suppressLineNumbers w:val="0" /><w:bidi w:val="0" /><w:spacing w:before="240" w:beforeAutospacing="off" w:after="240" w:afterAutospacing="off" w:line="276" w:lineRule="auto" /><w:ind w:left="0" w:right="0" /><w:jc w:val="left" /></w:pPr><w:r><w:drawing><ns3:inline ns4:editId="77AEFA18" ns4:anchorId="37160AA9"><ns3:extent cx="5762625" cy="2962275" /><ns3:effectExtent l="0" t="0" r="0" b="0" /><ns3:docPr id="1832003859" name="drawing" /><ns3:cNvGraphicFramePr><a:graphicFrameLocks noChangeAspect="1" /></ns3:cNvGraphicFramePr><a:graphic><a:graphicData uri="http://schemas.openxmlformats.org/drawingml/2006/picture"><ns7:pic><ns7:nvPicPr><ns7:cNvPr id="1832003859" name="Picture 1832003859" /><ns7:cNvPicPr /></ns7:nvPicPr><ns7:blipFill><a:blip r:embed="rId1094924346"><a:extLst><a:ext uri="{28A0092B-C50C-407E-A947-70E740481C1C}"><ns9:useLocalDpi /></a:ext></a:extLst></a:blip><a:stretch><a:fillRect /></a:stretch></ns7:blipFill><ns7:spPr><a:xfrm><a:off x="0" y="0" /><a:ext cx="5762625" cy="2962275" /></a:xfrm><a:prstGeom prst="rect"><a:avLst /></a:prstGeom></ns7:spPr></ns7:pic></a:graphicData></a:graphic></ns3:inline></w:drawing></w:r></w:p><w:p ns2:paraId="634C1ABF" ns2:textId="215D7FCE"><w:pPr><w:pStyle w:val="Normal" /><w:suppressLineNumbers w:val="0" /><w:bidi w:val="0" /><w:spacing w:before="240" w:beforeAutospacing="off" w:after="240" w:afterAutospacing="off" w:line="276" w:lineRule="auto" /><w:ind w:left="0" w:right="0" /><w:jc w:val="left" /><w:rPr><w:rFonts w:ascii="Calibri" w:hAnsi="Calibri" w:eastAsia="Calibri" w:cs="Calibri" /><w:noProof w:val="0" /><w:sz w:val="20" /><w:szCs w:val="20" /><w:lang w:val="fr-FR" /></w:rPr></w:pPr></w:p><w:p ns2:paraId="2AD96268" ns2:textId="725851E0"><w:pPr><w:pStyle w:val="Normal" /><w:suppressLineNumbers w:val="0" /><w:bidi w:val="0" /><w:spacing w:before="240" w:beforeAutospacing="off" w:after="240" w:afterAutospacing="off" w:line="276" w:lineRule="auto" /><w:ind w:left="0" w:right="0" /><w:jc w:val="left" /><w:rPr><w:rFonts w:ascii="Calibri" w:hAnsi="Calibri" w:eastAsia="Calibri" w:cs="Calibri" /><w:noProof w:val="0" /><w:sz w:val="20" /><w:szCs w:val="20" /><w:lang w:val="fr-FR" /></w:rPr></w:pPr></w:p><w:p ns2:paraId="72D5D6BA" ns2:textId="2C6C9BD0"><w:pPr><w:pStyle w:val="Normal" /><w:suppressLineNumbers w:val="0" /><w:bidi w:val="0" /><w:spacing w:before="240" w:beforeAutospacing="off" w:after="240" w:afterAutospacing="off" w:line="276" w:lineRule="auto" /><w:ind w:left="0" w:right="0" /><w:jc w:val="left" /><w:rPr><w:rFonts w:ascii="Calibri" w:hAnsi="Calibri" w:eastAsia="Calibri" w:cs="Calibri" /><w:noProof w:val="0" /><w:sz w:val="20" /><w:szCs w:val="20" /><w:lang w:val="fr-FR" /></w:rPr></w:pPr></w:p><w:p ns2:paraId="38CACD31" ns2:textId="4DC27A91"><w:pPr><w:pStyle w:val="Normal" /><w:suppressLineNumbers w:val="0" /><w:bidi w:val="0" /><w:spacing w:before="240" w:beforeAutospacing="off" w:after="240" w:afterAutospacing="off" w:line="276" w:lineRule="auto" /><w:ind w:left="0" w:right="0" /><w:jc w:val="left" /><w:rPr><w:rFonts w:ascii="Calibri" w:hAnsi="Calibri" w:eastAsia="Calibri" w:cs="Calibri" /><w:noProof w:val="0" /><w:sz w:val="20" /><w:szCs w:val="20" /><w:lang w:val="fr-FR" /></w:rPr></w:pPr></w:p><w:p ns2:paraId="517170BC" ns2:textId="7951049A"><w:pPr><w:pStyle w:val="Normal" /><w:suppressLineNumbers w:val="0" /><w:bidi w:val="0" /><w:spacing w:before="240" w:beforeAutospacing="off" w:after="240" w:afterAutospacing="off" w:line="276" w:lineRule="auto" /><w:ind w:left="0" w:right="0" /><w:jc w:val="left" /><w:rPr><w:rFonts w:ascii="Calibri" w:hAnsi="Calibri" w:eastAsia="Calibri" w:cs="Calibri" /><w:noProof w:val="0" /><w:sz w:val="20" /><w:szCs w:val="20" /><w:lang w:val="fr-FR" /></w:rPr></w:pPr></w:p><w:p ns2:paraId="517FC579" ns2:textId="3023BA72"><w:pPr><w:pStyle w:val="Normal" /><w:suppressLineNumbers w:val="0" /><w:bidi w:val="0" /><w:spacing w:before="240" w:beforeAutospacing="off" w:after="240" w:afterAutospacing="off" w:line="276" w:lineRule="auto" /><w:ind w:left="0" w:right="0" /><w:jc w:val="left" /><w:rPr><w:rFonts w:ascii="Calibri" w:hAnsi="Calibri" w:eastAsia="Calibri" w:cs="Calibri" /><w:noProof w:val="0" /><w:sz w:val="20" /><w:szCs w:val="20" /><w:lang w:val="fr-FR" /></w:rPr></w:pPr></w:p><w:p ns2:paraId="1F49DC73" ns2:textId="12E2CAFE"><w:pPr><w:pStyle w:val="Normal" /><w:suppressLineNumbers w:val="0" /><w:bidi w:val="0" /><w:spacing w:before="240" w:beforeAutospacing="off" w:after="240" w:afterAutospacing="off" w:line="276" w:lineRule="auto" /><w:ind w:left="0" w:right="0" /><w:jc w:val="left" /><w:rPr><w:rFonts w:ascii="Calibri" w:hAnsi="Calibri" w:eastAsia="Calibri" w:cs="Calibri" /><w:noProof w:val="0" /><w:sz w:val="20" /><w:szCs w:val="20" /><w:lang w:val="fr-FR" /></w:rPr></w:pPr></w:p><w:p ns2:paraId="16A9B55E" ns2:textId="4A434D69"><w:pPr><w:pStyle w:val="Normal" /><w:suppressLineNumbers w:val="0" /><w:bidi w:val="0" /><w:spacing w:before="240" w:beforeAutospacing="off" w:after="240" w:afterAutospacing="off" w:line="276" w:lineRule="auto" /><w:ind w:left="0" w:right="0" /><w:jc w:val="left" /><w:rPr><w:rFonts w:ascii="Calibri" w:hAnsi="Calibri" w:eastAsia="Calibri" w:cs="Calibri" /><w:noProof w:val="0" /><w:sz w:val="20" /><w:szCs w:val="20" /><w:lang w:val="fr-FR" /></w:rPr></w:pPr></w:p><w:p ns2:paraId="7EBD573F" ns2:textId="4CADDC25"><w:pPr><w:pStyle w:val="Normal" /><w:suppressLineNumbers w:val="0" /><w:bidi w:val="0" /><w:spacing w:before="240" w:beforeAutospacing="off" w:after="240" w:afterAutospacing="off" w:line="276" w:lineRule="auto" /><w:ind w:left="0" w:right="0" /><w:jc w:val="left" /><w:rPr><w:rFonts w:ascii="Calibri" w:hAnsi="Calibri" w:eastAsia="Calibri" w:cs="Calibri" /><w:noProof w:val="0" /><w:sz w:val="20" /><w:szCs w:val="20" /><w:lang w:val="fr-FR" /></w:rPr></w:pPr></w:p><w:p ns2:paraId="034CA9C3" ns2:textId="5AD8B469"><w:pPr><w:pStyle w:val="Normal" /><w:suppressLineNumbers w:val="0" /><w:bidi w:val="0" /><w:spacing w:before="240" w:beforeAutospacing="off" w:after="240" w:afterAutospacing="off" w:line="276" w:lineRule="auto" /><w:ind w:left="0" w:right="0" /><w:jc w:val="left" /></w:pPr><w:r><w:rPr><w:rFonts w:ascii="Calibri" w:hAnsi="Calibri" w:eastAsia="Calibri" w:cs="Calibri" /><w:noProof w:val="0" /><w:sz w:val="20" /><w:szCs w:val="20" /><w:lang w:val="fr-FR" /></w:rPr><w:t /></w:r></w:p><w:p ns2:paraId="581EAFC0" ns2:textId="3ED3F16F"><w:pPr><w:pStyle w:val="Normal" /><w:suppressLineNumbers w:val="0" /><w:bidi w:val="0" /><w:spacing w:before="240" w:beforeAutospacing="off" w:after="240" w:afterAutospacing="off" w:line="276" w:lineRule="auto" /><w:ind w:left="0" w:right="0" /><w:jc w:val="left" /></w:pPr><w:r><w:drawing><ns3:inline ns4:editId="04077B09" ns4:anchorId="6AAE6B72"><ns3:extent cx="5762625" cy="5019675" /><ns3:effectExtent l="0" t="0" r="0" b="0" /><ns3:docPr id="945527891" name="drawing" /><ns3:cNvGraphicFramePr><a:graphicFrameLocks noChangeAspect="1" /></ns3:cNvGraphicFramePr><a:graphic><a:graphicData uri="http://schemas.openxmlformats.org/drawingml/2006/picture"><ns7:pic><ns7:nvPicPr><ns7:cNvPr id="945527891" name="Picture 945527891" /><ns7:cNvPicPr /></ns7:nvPicPr><ns7:blipFill><a:blip r:embed="rId861082786"><a:extLst><a:ext uri="{28A0092B-C50C-407E-A947-70E740481C1C}"><ns9:useLocalDpi /></a:ext></a:extLst></a:blip><a:stretch><a:fillRect /></a:stretch></ns7:blipFill><ns7:spPr><a:xfrm><a:off x="0" y="0" /><a:ext cx="5762625" cy="5019675" /></a:xfrm><a:prstGeom prst="rect"><a:avLst /></a:prstGeom></ns7:spPr></ns7:pic></a:graphicData></a:graphic></ns3:inline></w:drawing></w:r><w:r><w:rPr /><w:t xml:space="preserve"> </w:t></w:r><w:r><w:rPr><w:lang w:val="en-US" /></w:rPr><w:br w:type="page" /></w:r></w:p><w:p ns2:paraId="111E5D88" ns2:textId="78D48406"><w:pPr><w:pStyle w:val="Heading2" /></w:pPr></w:p><w:p ns2:paraId="2BD1DD29" ns2:textId="5D83D2A0"><w:pPr><w:pStyle w:val="Heading2" /></w:pPr></w:p><w:p ns2:paraId="26D738CD" ns2:textId="3CD7AE5E"><w:pPr><w:pStyle w:val="Heading2" /></w:pPr><w:r><w:rPr /><w:t>SPRINT &lt;TODO_PROJ&gt;</w:t></w:r></w:p><w:p ns2:paraId="3E977E2E" ns2:textId="7CA90797"><w:pPr><w:pStyle w:val="Normal" /></w:pPr></w:p><w:p ns2:paraId="19410679" ns2:textId="6EFEBBE6" /><w:p ns2:paraId="40CDF0EC" ns2:textId="2148AE99"><w:r><w:rPr /><w:t>Pour la prochaine période, nous allons présenter le Sprint &lt;TODO_PROJ&gt; qui s’étale du &lt;DATE_DEBUT_TODO&gt; au &lt;DATE_FIN_TODO&gt;, pour une durée de &lt;DUREE_SEMAINES_TODO&gt; semaines.</w:t></w:r></w:p><w:p ns2:paraId="6F47FC12" ns2:textId="5EC73265"><w:r><w:rPr /><w:t xml:space="preserve">Voilà les différents axes que l’on va </w:t></w:r><w:r><w:rPr /><w:t>développer :</w:t></w:r><w:r><w:rPr /><w:t xml:space="preserve"> </w:t></w:r></w:p><w:p ns2:paraId="77D97548" ns2:textId="4DAE22E9"><w:pPr><w:pStyle w:val="mtitextenumr" /><w:suppressLineNumbers w:val="0" /><w:shd w:val="clear" w:color="auto" w:fill="FFFFFF" w:themeFill="background1" /><w:bidi w:val="0" /><w:spacing w:before="240" w:beforeAutospacing="off" w:after="240" w:afterAutospacing="off" w:line="240" w:lineRule="auto" /><w:ind w:left="720" w:right="0" w:hanging="360" /><w:jc w:val="left" /><w:rPr><w:lang w:val="fr-FR" /></w:rPr></w:pPr><w:r><w:rPr><w:lang w:val="fr-FR" /></w:rPr><w:t>[TODO] Axe 1 de développement</w:t></w:r></w:p><w:p ns2:paraId="493C8D53" ns2:textId="73FF8861"><w:pPr><w:pStyle w:val="mtitextenumr" /><w:suppressLineNumbers w:val="0" /><w:shd w:val="clear" w:color="auto" w:fill="FFFFFF" w:themeFill="background1" /><w:bidi w:val="0" /><w:spacing w:before="240" w:beforeAutospacing="off" w:after="240" w:afterAutospacing="off" w:line="240" w:lineRule="auto" /><w:ind w:left="720" w:right="0" w:hanging="360" /><w:jc w:val="left" /><w:rPr /></w:pPr><w:r><w:rPr><w:lang w:val="fr-FR" /></w:rPr><w:t>[TODO] Axe 2 de développement</w:t></w:r></w:p><w:p ns2:paraId="73A5F82C" ns2:textId="15400101"><w:pPr><w:pStyle w:val="mtitextenumr" /><w:suppressLineNumbers w:val="0" /><w:shd w:val="clear" w:color="auto" w:fill="FFFFFF" w:themeFill="background1" /><w:bidi w:val="0" /><w:spacing w:before="240" w:beforeAutospacing="off" w:after="240" w:afterAutospacing="off" w:line="240" w:lineRule="auto" /><w:ind w:left="720" w:right="0" w:hanging="360" /><w:jc w:val="left" /><w:rPr><w:lang w:val="en-US" /></w:rPr></w:pPr><w:r><w:rPr><w:lang w:val="en-US" /></w:rPr><w:t>[TODO] Axe 3 de développement</w:t></w:r></w:p><w:p ns2:paraId="6AFB9AC5" ns2:textId="5C698B55"><w:pPr><w:rPr><w:u w:val="single" /></w:rPr></w:pPr><w:r><w:rPr><w:u w:val="single" /></w:rPr><w:t>Vous trouverez via le lien ci-joint la page vers le backlog du Sprint &lt;TODO_PROJ&gt; :</w:t></w:r></w:p><w:p ns2:paraId="7056F9D0" ns2:textId="09191F74"><w:r><w:t>https://zest-lycra-8c7.notion.site/2fd37561a84780a18c79cebcaa8100b7?v=3df37561a84780b9a831000c2f12e9e8&pvs=74</w:t></w:r></w:p><w:p ns2:paraId="555F763B" ns2:textId="132BC040"><w:pPr><w:pStyle w:val="Heading1" /></w:pPr><w:bookmarkStart w:name="_Toc228297617" w:id="4" /><w:bookmarkStart w:name="_Toc1731799357" w:id="1934310681" /><w:r><w:rPr /><w:t>Découpage des actions</w:t></w:r><w:bookmarkEnd w:id="4" /><w:bookmarkEnd w:id="1934310681" /></w:p><w:p ns2:paraId="41B335E6" ns2:textId="007B419B"><w:pPr><w:pStyle w:val="Heading3" /></w:pPr><w:bookmarkStart w:name="_Toc714619430" w:id="1156638760" /><w:r><w:rPr /><w:t>Répartition des Tâches</w:t></w:r><w:bookmarkEnd w:id="1156638760" /></w:p><w:p ns2:paraId="2D4EA02B" ns2:textId="169BA6FC"><w:r><w:rPr /><w:t>Comme mentionné plus haut, chaque tâche se voit associée à deux membres, qui joueront des rôles différents dans la réalisation de cette tâche. Pour ce Sprint &lt;TODO_PROJ&gt;, la répartition est la suivante :</w:t></w:r></w:p><w:p ns2:paraId="2033685B" ns2:textId="6B458903" /><w:tbl><w:tblPr><w:tblStyle w:val="GridTable5Dark-Accent1" /><w:tblW w:w="0" w:type="auto" /><w:tblLook w:val="06A0" w:firstRow="1" w:lastRow="0" w:firstColumn="1" w:lastColumn="0" w:noHBand="1" w:noVBand="1" /></w:tblPr><w:tblGrid><w:gridCol w:w="3020" /><w:gridCol w:w="3020" /><w:gridCol w:w="3020" /></w:tblGrid><w:tr ns2:paraId="40307267" ns2:textId="77777777"><w:trPr><w:cnfStyle w:val="100000000000" w:firstRow="1" w:lastRow="0" w:firstColumn="0" w:lastColumn="0" w:oddVBand="0" w:evenVBand="0" w:oddHBand="0" w:evenHBand="0" w:firstRowFirstColumn="0" w:firstRowLastColumn="0" w:lastRowFirstColumn="0" w:lastRowLastColumn="0" /><w:trHeight w:val="300" /></w:trPr><w:tc><w:tcPr><w:cnfStyle w:val="001000000000" w:firstRow="0" w:lastRow="0" w:firstColumn="1" w:lastColumn="0" w:oddVBand="0" w:evenVBand="0" w:oddHBand="0" w:evenHBand="0" w:firstRowFirstColumn="0" w:firstRowLastColumn="0" w:lastRowFirstColumn="0" w:lastRowLastColumn="0" /><w:tcW w:w="3020" w:type="dxa" /><w:tcMar /></w:tcPr><w:p ns2:paraId="05698D5F" ns2:textId="00E5F96D"><w:r><w:t>Tâche</w:t></w:r></w:p></w:tc><w:tc><w:tcPr><w:cnfStyle w:val="000000000000" w:firstRow="0" w:lastRow="0" w:firstColumn="0" w:lastColumn="0" w:oddVBand="0" w:evenVBand="0" w:oddHBand="0" w:evenHBand="0" w:firstRowFirstColumn="0" w:firstRowLastColumn="0" w:lastRowFirstColumn="0" w:lastRowLastColumn="0" /><w:tcW w:w="3020" w:type="dxa" /><w:tcMar /></w:tcPr><w:p ns2:paraId="6D909A5B" ns2:textId="4C1F45B8"><w:pPr><w:cnfStyle w:val="100000000000" w:firstRow="1" w:lastRow="0" w:firstColumn="0" w:lastColumn="0" w:oddVBand="0" w:evenVBand="0" w:oddHBand="0" w:evenHBand="0" w:firstRowFirstColumn="0" w:firstRowLastColumn="0" w:lastRowFirstColumn="0" w:lastRowLastColumn="0" /></w:pPr><w:r><w:t>Assigné</w:t></w:r></w:p></w:tc><w:tc><w:tcPr><w:cnfStyle w:val="000000000000" w:firstRow="0" w:lastRow="0" w:firstColumn="0" w:lastColumn="0" w:oddVBand="0" w:evenVBand="0" w:oddHBand="0" w:evenHBand="0" w:firstRowFirstColumn="0" w:firstRowLastColumn="0" w:lastRowFirstColumn="0" w:lastRowLastColumn="0" /><w:tcW w:w="3020" w:type="dxa" /><w:tcMar /></w:tcPr><w:p ns2:paraId="1028772C" ns2:textId="588B0DC0"><w:pPr><w:cnfStyle w:val="100000000000" w:firstRow="1" w:lastRow="0" w:firstColumn="0" w:lastColumn="0" w:oddVBand="0" w:evenVBand="0" w:oddHBand="0" w:evenHBand="0" w:firstRowFirstColumn="0" w:firstRowLastColumn="0" w:lastRowFirstColumn="0" w:lastRowLastColumn="0" /></w:pPr><w:r><w:t>Lead</w:t></w:r></w:p></w:tc></w:tr><w:tr ns2:paraId="21496885" ns2:textId="77777777"><w:trPr><w:trHeight w:val="300" /></w:trPr><w:tc><w:tcPr><w:cnfStyle w:val="001000000000" w:firstRow="0" w:lastRow="0" w:firstColumn="1" w:lastColumn="0" w:oddVBand="0" w:evenVBand="0" w:oddHBand="0" w:evenHBand="0" w:firstRowFirstColumn="0" w:firstRowLastColumn="0" w:lastRowFirstColumn="0" w:lastRowLastColumn="0" /><w:tcW w:w="3020" w:type="dxa" /><w:tcMar /></w:tcPr><w:p ns2:paraId="60A8138B" ns2:textId="3A800769"><w:pPr><w:jc w:val="center" /></w:pPr><w:r><w:rPr><w:lang w:val="en-US" /></w:rPr><w:t>[TODO Tâche 1]</w:t></w:r></w:p></w:tc><w:tc><w:tcPr><w:cnfStyle w:val="000000000000" w:firstRow="0" w:lastRow="0" w:firstColumn="0" w:lastColumn="0" w:oddVBand="0" w:evenVBand="0" w:oddHBand="0" w:evenHBand="0" w:firstRowFirstColumn="0" w:firstRowLastColumn="0" w:lastRowFirstColumn="0" w:lastRowLastColumn="0" /><w:tcW w:w="3020" w:type="dxa" /><w:tcMar /></w:tcPr><w:p ns2:paraId="2C801BC8" ns2:textId="79CA6894"><w:pPr><w:pStyle w:val="Normal" /><w:suppressLineNumbers w:val="0" /><w:bidi w:val="0" /><w:spacing w:before="200" w:beforeAutospacing="off" w:after="0" w:afterAutospacing="off" w:line="240" w:lineRule="auto" /><w:ind w:left="0" w:right="0" /><w:jc w:val="center" /></w:pPr><w:r><w:rPr /><w:t>[TODO Membres]</w:t></w:r></w:p></w:tc><w:tc><w:tcPr><w:cnfStyle w:val="000000000000" w:firstRow="0" w:lastRow="0" w:firstColumn="0" w:lastColumn="0" w:oddVBand="0" w:evenVBand="0" w:oddHBand="0" w:evenHBand="0" w:firstRowFirstColumn="0" w:firstRowLastColumn="0" w:lastRowFirstColumn="0" w:lastRowLastColumn="0" /><w:tcW w:w="3020" w:type="dxa" /><w:tcMar /></w:tcPr><w:p ns2:paraId="4172ACEB" ns2:textId="44D0D38F"><w:pPr><w:jc w:val="center" /><w:cnfStyle w:val="000000000000" w:firstRow="0" w:lastRow="0" w:firstColumn="0" w:lastColumn="0" w:oddVBand="0" w:evenVBand="0" w:oddHBand="0" w:evenHBand="0" w:firstRowFirstColumn="0" w:firstRowLastColumn="0" w:lastRowFirstColumn="0" w:lastRowLastColumn="0" /></w:pPr><w:r><w:rPr /><w:t>[TODO Lead]</w:t></w:r></w:p></w:tc></w:tr><w:tr ns2:paraId="6A62E7F3" ns2:textId="77777777"><w:trPr><w:trHeight w:val="300" /></w:trPr><w:tc><w:tcPr><w:cnfStyle w:val="001000000000" w:firstRow="0" w:lastRow="0" w:firstColumn="1" w:lastColumn="0" w:oddVBand="0" w:evenVBand="0" w:oddHBand="0" w:evenHBand="0" w:firstRowFirstColumn="0" w:firstRowLastColumn="0" w:lastRowFirstColumn="0" w:lastRowLastColumn="0" /><w:tcW w:w="3020" w:type="dxa" /><w:tcMar /></w:tcPr><w:p ns2:paraId="794AAA3A" ns2:textId="6886193A"><w:pPr><w:pStyle w:val="Normal" /><w:suppressLineNumbers w:val="0" /><w:bidi w:val="0" /><w:spacing w:before="200" w:beforeAutospacing="off" w:after="0" w:afterAutospacing="off" w:line="240" w:lineRule="auto" /><w:ind w:left="0" w:right="0" /><w:jc w:val="center" /></w:pPr><w:r><w:rPr /><w:t>[TODO Tâche 2]</w:t></w:r></w:p></w:tc><w:tc><w:tcPr><w:cnfStyle w:val="000000000000" w:firstRow="0" w:lastRow="0" w:firstColumn="0" w:lastColumn="0" w:oddVBand="0" w:evenVBand="0" w:oddHBand="0" w:evenHBand="0" w:firstRowFirstColumn="0" w:firstRowLastColumn="0" w:lastRowFirstColumn="0" w:lastRowLastColumn="0" /><w:tcW w:w="3020" w:type="dxa" /><w:tcMar /></w:tcPr><w:p ns2:paraId="19D29E44" ns2:textId="55293390"><w:pPr><w:pStyle w:val="Normal" /><w:suppressLineNumbers w:val="0" /><w:bidi w:val="0" /><w:spacing w:before="200" w:beforeAutospacing="off" w:after="0" w:afterAutospacing="off" w:line="240" w:lineRule="auto" /><w:ind w:left="0" w:right="0" /><w:jc w:val="center" /></w:pPr><w:r><w:rPr /><w:t>[TODO Membres]</w:t></w:r></w:p></w:tc><w:tc><w:tcPr><w:cnfStyle w:val="000000000000" w:firstRow="0" w:lastRow="0" w:firstColumn="0" w:lastColumn="0" w:oddVBand="0" w:evenVBand="0" w:oddHBand="0" w:evenHBand="0" w:firstRowFirstColumn="0" w:firstRowLastColumn="0" w:lastRowFirstColumn="0" w:lastRowLastColumn="0" /><w:tcW w:w="3020" w:type="dxa" /><w:tcMar /></w:tcPr><w:p ns2:paraId="018298B0" ns2:textId="3B04CF38"><w:pPr><w:pStyle w:val="Normal" /><w:suppressLineNumbers w:val="0" /><w:bidi w:val="0" /><w:spacing w:before="200" w:beforeAutospacing="off" w:after="0" w:afterAutospacing="off" w:line="240" w:lineRule="auto" /><w:ind w:left="0" w:right="0" /><w:jc w:val="center" /></w:pPr><w:r><w:rPr /><w:t>[TODO Lead]</w:t></w:r></w:p></w:tc></w:tr><w:tr ns2:paraId="6AB6465D"><w:trPr><w:trHeight w:val="885" /></w:trPr><w:tc><w:tcPr><w:cnfStyle w:val="001000000000" w:firstRow="0" w:lastRow="0" w:firstColumn="1" w:lastColumn="0" w:oddVBand="0" w:evenVBand="0" w:oddHBand="0" w:evenHBand="0" w:firstRowFirstColumn="0" w:firstRowLastColumn="0" w:lastRowFirstColumn="0" w:lastRowLastColumn="0" /><w:tcW w:w="3020" w:type="dxa" /><w:tcMar /></w:tcPr><w:p ns2:paraId="34FF0A3B" ns2:textId="47DC6204"><w:pPr><w:pStyle w:val="Normal" /><w:jc w:val="center" /><w:rPr><w:lang w:val="fr-FR" /></w:rPr></w:pPr><w:r><w:rPr><w:lang w:val="fr-FR" /></w:rPr><w:t>[TODO Tâche 3]</w:t></w:r></w:p></w:tc><w:tc><w:tcPr><w:cnfStyle w:val="000000000000" w:firstRow="0" w:lastRow="0" w:firstColumn="0" w:lastColumn="0" w:oddVBand="0" w:evenVBand="0" w:oddHBand="0" w:evenHBand="0" w:firstRowFirstColumn="0" w:firstRowLastColumn="0" w:lastRowFirstColumn="0" w:lastRowLastColumn="0" /><w:tcW w:w="3020" w:type="dxa" /><w:tcMar /></w:tcPr><w:p ns2:paraId="0BF2BD22" ns2:textId="0507B93F"><w:pPr><w:pStyle w:val="Normal" /><w:jc w:val="center" /></w:pPr><w:r><w:rPr /><w:t>[TODO Membres]</w:t></w:r></w:p></w:tc><w:tc><w:tcPr><w:cnfStyle w:val="000000000000" w:firstRow="0" w:lastRow="0" w:firstColumn="0" w:lastColumn="0" w:oddVBand="0" w:evenVBand="0" w:oddHBand="0" w:evenHBand="0" w:firstRowFirstColumn="0" w:firstRowLastColumn="0" w:lastRowFirstColumn="0" w:lastRowLastColumn="0" /><w:tcW w:w="3020" w:type="dxa" /><w:tcMar /></w:tcPr><w:p ns2:paraId="33FB8043" ns2:textId="08A50191"><w:pPr><w:pStyle w:val="Normal" /><w:jc w:val="center" /></w:pPr><w:r><w:rPr /><w:t>[TODO Lead]</w:t></w:r></w:p></w:tc></w:tr></w:tbl><w:p ns2:paraId="516438BC" ns2:textId="4DBAFC05"><w:pPr><w:pStyle w:val="Heading3" /><w:spacing w:before="200" w:after="200" /></w:pPr></w:p><w:p ns2:paraId="4417E627" ns2:textId="59EA8CFB"><w:pPr><w:rPr><w:lang w:val="nl-NL" /></w:rPr></w:pPr></w:p><w:p ns2:paraId="5BC4F266" ns2:textId="4A2E9E9E"><w:pPr><w:rPr><w:lang w:val="nl-NL" /></w:rPr></w:pPr><w:r><w:rPr><w:lang w:val="nl-NL" /></w:rPr><w:br w:type="page" /></w:r></w:p><w:p ns2:paraId="291BCEED" ns2:textId="55F24EE4"><w:pPr><w:pStyle w:val="Heading2" /></w:pPr><w:bookmarkStart w:name="_Toc161572873" w:id="547873380" /><w:r><w:rPr /><w:t>Diagramme</w:t></w:r><w:r><w:rPr /><w:t>s</w:t></w:r><w:r><w:rPr /><w:t xml:space="preserve"> de </w:t></w:r><w:r><w:rPr /><w:t>Gantt</w:t></w:r><w:bookmarkEnd w:id="547873380" /></w:p><w:p ns2:paraId="147AC723" ns2:textId="18CF7578"><w:pPr><w:pStyle w:val="Heading3" /><w:rPr><w:lang w:val="fr-FR" /></w:rPr></w:pPr><w:r><w:rPr><w:lang w:val="fr-FR" /></w:rPr><w:t>Victor Giroud : &lt;TODO&gt;</w:t></w:r></w:p><w:p ns2:paraId="087993E9" ns2:textId="19A05558"><w:pPr><w:pStyle w:val="Heading3" /></w:pPr><w:r><w:t>[TODO - Diagramme de Gantt PNG]</w:t></w:r></w:p><w:p ns2:paraId="23D2499B" ns2:textId="4FB1EFAA"><w:pPr><w:pStyle w:val="Heading3" /></w:pPr></w:p><w:p ns2:paraId="3CA66DAC" ns2:textId="4068ECF4"><w:pPr><w:pStyle w:val="Heading3" /></w:pPr></w:p><w:p ns2:paraId="63859C10" ns2:textId="6B9680D1"><w:pPr><w:pStyle w:val="Heading3" /></w:pPr></w:p><w:p ns2:paraId="18BE4056" ns2:textId="57A63A7A"><w:pPr><w:pStyle w:val="Heading3" /></w:pPr></w:p><w:p ns2:paraId="31C4B0CB" ns2:textId="586B93A8"><w:pPr><w:pStyle w:val="Heading3" /></w:pPr></w:p><w:p ns2:paraId="02D4E3CA" ns2:textId="654FA6FD"><w:pPr><w:pStyle w:val="Heading3" /></w:pPr></w:p><w:p ns2:paraId="602F76DA" ns2:textId="0845170B"><w:pPr><w:pStyle w:val="Heading3" /></w:pPr></w:p><w:p ns2:paraId="7B4C54A6" ns2:textId="07CA2A3F"><w:pPr><w:pStyle w:val="Heading3" /></w:pPr></w:p><w:p ns2:paraId="002287CE" ns2:textId="45877DCE"><w:pPr><w:pStyle w:val="Heading3" /></w:pPr></w:p><w:p ns2:paraId="06F13137" ns2:textId="68C79AAF"><w:pPr><w:pStyle w:val="Heading3" /></w:pPr></w:p><w:p ns2:paraId="759279B1" ns2:textId="7DF2EE97"><w:pPr><w:pStyle w:val="Heading3" /></w:pPr><w:r><w:rPr /><w:t>Victor Agahi : &lt;TODO&gt;</w:t></w:r></w:p><w:p><w:r><w:t>[TODO - Diagramme de Gantt PNG]</w:t></w:r></w:p><w:p ns2:paraId="743E7DBE" ns2:textId="387A7FF8"><w:pPr><w:pStyle w:val="Heading3" /></w:pPr></w:p><w:p ns2:paraId="3986BB14" ns2:textId="2B98FB88"><w:pPr><w:pStyle w:val="Normal" /></w:pPr></w:p><w:p ns2:paraId="4CEF0DD0" ns2:textId="1004443F"><w:pPr><w:pStyle w:val="Heading3" /></w:pPr></w:p><w:p ns2:paraId="47F87FA7" ns2:textId="5DDA5CD6"><w:pPr><w:pStyle w:val="Heading3" /></w:pPr></w:p><w:p ns2:paraId="3F94F95F" ns2:textId="78910190"><w:pPr><w:pStyle w:val="Heading3" /></w:pPr></w:p><w:p ns2:paraId="0610925A" ns2:textId="51AE6312"><w:pPr><w:pStyle w:val="Heading3" /></w:pPr></w:p><w:p ns2:paraId="3E02751B" ns2:textId="50E41152"><w:pPr><w:pStyle w:val="Heading3" /></w:pPr></w:p><w:p ns2:paraId="1E9C5ED4" ns2:textId="1FCE4BB2"><w:pPr><w:pStyle w:val="Heading3" /></w:pPr></w:p><w:p ns2:paraId="73B7855C" ns2:textId="4CD3ADCD"><w:pPr><w:pStyle w:val="Heading3" /></w:pPr><w:r><w:rPr /><w:t>Clément PASTEAU : &lt;TODO&gt;</w:t></w:r></w:p><w:p><w:r><w:t>[TODO - Diagramme de Gantt PNG]</w:t></w:r></w:p><w:p ns2:paraId="51BA9107" ns2:textId="16758E75"><w:pPr><w:pStyle w:val="Normal" /></w:pPr></w:p><w:p ns2:paraId="53FF9D21" ns2:textId="5A915CF8"><w:pPr><w:pStyle w:val="Normal" /></w:pPr></w:p><w:p ns2:paraId="2E65F484" ns2:textId="4EB24F7A"><w:pPr><w:pStyle w:val="Heading1" /></w:pPr><w:bookmarkStart w:name="_Toc1517376593" w:id="213012533" /><w:r><w:rPr /><w:t>Conclusion</w:t></w:r><w:bookmarkEnd w:id="213012533" /></w:p><w:p ns2:paraId="79B31D36" ns2:textId="780CFBB1"><w:pPr><w:pStyle w:val="Normal" /><w:suppressLineNumbers w:val="0" /><w:spacing w:before="240" w:beforeAutospacing="off" w:after="240" w:afterAutospacing="off" w:line="276" w:lineRule="auto" /><w:ind w:left="0" w:right="0" /><w:jc w:val="left" /></w:pPr><w:r><w:rPr><w:rFonts w:ascii="Calibri" w:hAnsi="Calibri" w:eastAsia="Calibri" w:cs="Calibri" /><w:noProof w:val="0" /><w:sz w:val="20" /><w:szCs w:val="20" /><w:lang w:val="fr-FR" /></w:rPr><w:t>[TODO] Synthèse conclusive de l'avancement global de l'équipe, métriques consolidées et perspectives d'atterrissage pour le Sprint &lt;TODO_PROJ&gt;.</w:t></w:r></w:p><w:sectPr><w:headerReference w:type="default" r:id="rId25" /><w:footerReference w:type="default" r:id="rId26" /><w:pgSz w:w="11906" w:h="16838" w:orient="portrait" /><w:pgMar w:top="2159" w:right="1418" w:bottom="1418" w:left="1418" w:header="720" w:footer="720" w:gutter="0" /><w:pgNumType w:start="1" /><w:cols w:space="708" /><w:docGrid w:linePitch="360" /></w:sectPr></w:body></w:document>
 </file>
 
 <file path=word/endnotes.xml><?xml version="1.0" encoding="utf-8"?>

</xml_diff>